<commit_message>
Tune dedicated neural network model
</commit_message>
<xml_diff>
--- a/report/Report.docx
+++ b/report/Report.docx
@@ -264,6 +264,84 @@
     <w:p>
       <w:r>
         <w:t>more stable.</w:t>
+      </w:r>
+    </w:p>
+    <w:p>
+      <w:pPr>
+        <w:pStyle w:val="Heading2"/>
+      </w:pPr>
+      <w:r>
+        <w:t>Dedicated Neural Network Tuning</w:t>
+      </w:r>
+    </w:p>
+    <w:p>
+      <w:r>
+        <w:t>A separate neural-network tuning step compares several MLP configurations</w:t>
+      </w:r>
+    </w:p>
+    <w:p>
+      <w:r>
+        <w:t>without replacing the main champion model. The best dedicated MLP configuration</w:t>
+      </w:r>
+    </w:p>
+    <w:p>
+      <w:r>
+        <w:t>uses two hidden layers:</w:t>
+      </w:r>
+    </w:p>
+    <w:p>
+      <w:pPr>
+        <w:pStyle w:val="ListBullet"/>
+      </w:pPr>
+      <w:r>
+        <w:t>hidden layers: 128 and 64 neurons</w:t>
+      </w:r>
+    </w:p>
+    <w:p>
+      <w:pPr>
+        <w:pStyle w:val="ListBullet"/>
+      </w:pPr>
+      <w:r>
+        <w:t>activation: ReLU</w:t>
+      </w:r>
+    </w:p>
+    <w:p>
+      <w:pPr>
+        <w:pStyle w:val="ListBullet"/>
+      </w:pPr>
+      <w:r>
+        <w:t>alpha: 0.002</w:t>
+      </w:r>
+    </w:p>
+    <w:p>
+      <w:pPr>
+        <w:pStyle w:val="ListBullet"/>
+      </w:pPr>
+      <w:r>
+        <w:t>learning rate: 0.0005</w:t>
+      </w:r>
+    </w:p>
+    <w:p>
+      <w:pPr>
+        <w:pStyle w:val="ListBullet"/>
+      </w:pPr>
+      <w:r>
+        <w:t>race precision@10: 0.771</w:t>
+      </w:r>
+    </w:p>
+    <w:p>
+      <w:r>
+        <w:t>This improves the neural-network branch compared with the default MLP baseline,</w:t>
+      </w:r>
+    </w:p>
+    <w:p>
+      <w:r>
+        <w:t>but the tree-based models still remain more stable overall on this tabular</w:t>
+      </w:r>
+    </w:p>
+    <w:p>
+      <w:r>
+        <w:t>dataset.</w:t>
       </w:r>
     </w:p>
     <w:p>
@@ -700,6 +778,47 @@
     </w:p>
     <w:p>
       <w:r>
+        <w:t>neural_network_tuning.png</w:t>
+      </w:r>
+    </w:p>
+    <w:p>
+      <w:r>
+        <w:drawing>
+          <wp:inline xmlns:a="http://schemas.openxmlformats.org/drawingml/2006/main" xmlns:pic="http://schemas.openxmlformats.org/drawingml/2006/picture">
+            <wp:extent cx="5303520" cy="2410691"/>
+            <wp:docPr id="5" name="Picture 5"/>
+            <wp:cNvGraphicFramePr>
+              <a:graphicFrameLocks noChangeAspect="1"/>
+            </wp:cNvGraphicFramePr>
+            <a:graphic>
+              <a:graphicData uri="http://schemas.openxmlformats.org/drawingml/2006/picture">
+                <pic:pic>
+                  <pic:nvPicPr>
+                    <pic:cNvPr id="0" name="neural_network_tuning.png"/>
+                    <pic:cNvPicPr/>
+                  </pic:nvPicPr>
+                  <pic:blipFill>
+                    <a:blip r:embed="rId13"/>
+                    <a:stretch>
+                      <a:fillRect/>
+                    </a:stretch>
+                  </pic:blipFill>
+                  <pic:spPr>
+                    <a:xfrm>
+                      <a:off x="0" y="0"/>
+                      <a:ext cx="5303520" cy="2410691"/>
+                    </a:xfrm>
+                    <a:prstGeom prst="rect"/>
+                  </pic:spPr>
+                </pic:pic>
+              </a:graphicData>
+            </a:graphic>
+          </wp:inline>
+        </w:drawing>
+      </w:r>
+    </w:p>
+    <w:p>
+      <w:r>
         <w:t>rolling_backtest.png</w:t>
       </w:r>
     </w:p>
@@ -708,7 +827,7 @@
         <w:drawing>
           <wp:inline xmlns:a="http://schemas.openxmlformats.org/drawingml/2006/main" xmlns:pic="http://schemas.openxmlformats.org/drawingml/2006/picture">
             <wp:extent cx="5303520" cy="2651760"/>
-            <wp:docPr id="5" name="Picture 5"/>
+            <wp:docPr id="6" name="Picture 6"/>
             <wp:cNvGraphicFramePr>
               <a:graphicFrameLocks noChangeAspect="1"/>
             </wp:cNvGraphicFramePr>
@@ -720,7 +839,7 @@
                     <pic:cNvPicPr/>
                   </pic:nvPicPr>
                   <pic:blipFill>
-                    <a:blip r:embed="rId13"/>
+                    <a:blip r:embed="rId14"/>
                     <a:stretch>
                       <a:fillRect/>
                     </a:stretch>
@@ -749,7 +868,7 @@
         <w:drawing>
           <wp:inline xmlns:a="http://schemas.openxmlformats.org/drawingml/2006/main" xmlns:pic="http://schemas.openxmlformats.org/drawingml/2006/picture">
             <wp:extent cx="5303520" cy="4124960"/>
-            <wp:docPr id="6" name="Picture 6"/>
+            <wp:docPr id="7" name="Picture 7"/>
             <wp:cNvGraphicFramePr>
               <a:graphicFrameLocks noChangeAspect="1"/>
             </wp:cNvGraphicFramePr>
@@ -761,7 +880,7 @@
                     <pic:cNvPicPr/>
                   </pic:nvPicPr>
                   <pic:blipFill>
-                    <a:blip r:embed="rId14"/>
+                    <a:blip r:embed="rId15"/>
                     <a:stretch>
                       <a:fillRect/>
                     </a:stretch>
@@ -790,7 +909,7 @@
         <w:drawing>
           <wp:inline xmlns:a="http://schemas.openxmlformats.org/drawingml/2006/main" xmlns:pic="http://schemas.openxmlformats.org/drawingml/2006/picture">
             <wp:extent cx="5303520" cy="4242816"/>
-            <wp:docPr id="7" name="Picture 7"/>
+            <wp:docPr id="8" name="Picture 8"/>
             <wp:cNvGraphicFramePr>
               <a:graphicFrameLocks noChangeAspect="1"/>
             </wp:cNvGraphicFramePr>
@@ -802,7 +921,7 @@
                     <pic:cNvPicPr/>
                   </pic:nvPicPr>
                   <pic:blipFill>
-                    <a:blip r:embed="rId15"/>
+                    <a:blip r:embed="rId16"/>
                     <a:stretch>
                       <a:fillRect/>
                     </a:stretch>

</xml_diff>

<commit_message>
Import latest Miami qualifying data
</commit_message>
<xml_diff>
--- a/report/Report.docx
+++ b/report/Report.docx
@@ -504,6 +504,79 @@
       </w:pPr>
       <w:r>
         <w:t>average race precision@10: 0.775</w:t>
+      </w:r>
+    </w:p>
+    <w:p>
+      <w:pPr>
+        <w:pStyle w:val="Heading2"/>
+      </w:pPr>
+      <w:r>
+        <w:t>Latest Data Coverage Check</w:t>
+      </w:r>
+    </w:p>
+    <w:p>
+      <w:r>
+        <w:t>The latest data audit on 2026-05-03 found:</w:t>
+      </w:r>
+    </w:p>
+    <w:p>
+      <w:pPr>
+        <w:pStyle w:val="ListBullet"/>
+      </w:pPr>
+      <w:r>
+        <w:t>22 scheduled races for the 2026 season</w:t>
+      </w:r>
+    </w:p>
+    <w:p>
+      <w:pPr>
+        <w:pStyle w:val="ListBullet"/>
+      </w:pPr>
+      <w:r>
+        <w:t>3 race-result rounds available in Jolpica and already present locally</w:t>
+      </w:r>
+    </w:p>
+    <w:p>
+      <w:pPr>
+        <w:pStyle w:val="ListBullet"/>
+      </w:pPr>
+      <w:r>
+        <w:t>4 qualifying rounds available in Jolpica after Miami qualifying was published</w:t>
+      </w:r>
+    </w:p>
+    <w:p>
+      <w:pPr>
+        <w:pStyle w:val="ListBullet"/>
+      </w:pPr>
+      <w:r>
+        <w:t>4 qualifying rounds now present locally after importing Miami qualifying</w:t>
+      </w:r>
+    </w:p>
+    <w:p>
+      <w:pPr>
+        <w:pStyle w:val="ListBullet"/>
+      </w:pPr>
+      <w:r>
+        <w:t>no Miami race result available yet, so the supervised training dataset still</w:t>
+      </w:r>
+    </w:p>
+    <w:p>
+      <w:r>
+        <w:t>ends at 2026 round 3</w:t>
+      </w:r>
+    </w:p>
+    <w:p>
+      <w:r>
+        <w:t>Because the final supervised dataset did not receive new race-result rows, the</w:t>
+      </w:r>
+    </w:p>
+    <w:p>
+      <w:r>
+        <w:t>models did not require retraining. Upcoming-race predictions were regenerated</w:t>
+      </w:r>
+    </w:p>
+    <w:p>
+      <w:r>
+        <w:t>with actual Miami qualifying data.</w:t>
       </w:r>
     </w:p>
     <w:p>

</xml_diff>

<commit_message>
Add historical weather enrichment
</commit_message>
<xml_diff>
--- a/report/Report.docx
+++ b/report/Report.docx
@@ -43,7 +43,7 @@
     </w:p>
     <w:p>
       <w:r>
-        <w:t>The project uses two public data sources:</w:t>
+        <w:t>The project uses three public data sources:</w:t>
       </w:r>
     </w:p>
     <w:p>
@@ -57,6 +57,14 @@
     <w:p>
       <w:r>
         <w:t>qualifying results, drivers, constructors, circuits, standings and pit stops.</w:t>
+      </w:r>
+    </w:p>
+    <w:p>
+      <w:pPr>
+        <w:pStyle w:val="ListBullet"/>
+      </w:pPr>
+      <w:r>
+        <w:t>Open-Meteo Archive for historical race-day weather enrichment.</w:t>
       </w:r>
     </w:p>
     <w:p>
@@ -180,6 +188,14 @@
         <w:pStyle w:val="ListBullet"/>
       </w:pPr>
       <w:r>
+        <w:t>historical race-day weather</w:t>
+      </w:r>
+    </w:p>
+    <w:p>
+      <w:pPr>
+        <w:pStyle w:val="ListBullet"/>
+      </w:pPr>
+      <w:r>
         <w:t>optional FastF1 rolling lap and strategy features</w:t>
       </w:r>
     </w:p>
@@ -294,7 +310,7 @@
         <w:pStyle w:val="ListBullet"/>
       </w:pPr>
       <w:r>
-        <w:t>hidden layers: 128 and 64 neurons</w:t>
+        <w:t>hidden layers: 96 and 48 neurons</w:t>
       </w:r>
     </w:p>
     <w:p>
@@ -310,7 +326,7 @@
         <w:pStyle w:val="ListBullet"/>
       </w:pPr>
       <w:r>
-        <w:t>alpha: 0.002</w:t>
+        <w:t>alpha: 0.003</w:t>
       </w:r>
     </w:p>
     <w:p>
@@ -318,7 +334,7 @@
         <w:pStyle w:val="ListBullet"/>
       </w:pPr>
       <w:r>
-        <w:t>learning rate: 0.0005</w:t>
+        <w:t>learning rate: 0.0008</w:t>
       </w:r>
     </w:p>
     <w:p>
@@ -326,7 +342,7 @@
         <w:pStyle w:val="ListBullet"/>
       </w:pPr>
       <w:r>
-        <w:t>race precision@10: 0.771</w:t>
+        <w:t>race precision@10: 0.779</w:t>
       </w:r>
     </w:p>
     <w:p>
@@ -336,12 +352,12 @@
     </w:p>
     <w:p>
       <w:r>
-        <w:t>but the tree-based models still remain more stable overall on this tabular</w:t>
+        <w:t>but tree-based models still remain more stable overall in the rolling</w:t>
       </w:r>
     </w:p>
     <w:p>
       <w:r>
-        <w:t>dataset.</w:t>
+        <w:t>season-by-season backtest.</w:t>
       </w:r>
     </w:p>
     <w:p>
@@ -426,7 +442,7 @@
         <w:pStyle w:val="ListBullet"/>
       </w:pPr>
       <w:r>
-        <w:t>accuracy: 0.770</w:t>
+        <w:t>accuracy: 0.768</w:t>
       </w:r>
     </w:p>
     <w:p>
@@ -434,7 +450,7 @@
         <w:pStyle w:val="ListBullet"/>
       </w:pPr>
       <w:r>
-        <w:t>precision: 0.778</w:t>
+        <w:t>precision: 0.763</w:t>
       </w:r>
     </w:p>
     <w:p>
@@ -442,7 +458,7 @@
         <w:pStyle w:val="ListBullet"/>
       </w:pPr>
       <w:r>
-        <w:t>recall: 0.758</w:t>
+        <w:t>recall: 0.779</w:t>
       </w:r>
     </w:p>
     <w:p>
@@ -450,7 +466,7 @@
         <w:pStyle w:val="ListBullet"/>
       </w:pPr>
       <w:r>
-        <w:t>F1: 0.768</w:t>
+        <w:t>F1: 0.771</w:t>
       </w:r>
     </w:p>
     <w:p>
@@ -458,7 +474,7 @@
         <w:pStyle w:val="ListBullet"/>
       </w:pPr>
       <w:r>
-        <w:t>ROC-AUC: 0.836</w:t>
+        <w:t>ROC-AUC: 0.835</w:t>
       </w:r>
     </w:p>
     <w:p>
@@ -466,7 +482,7 @@
         <w:pStyle w:val="ListBullet"/>
       </w:pPr>
       <w:r>
-        <w:t>race precision@10: 0.775</w:t>
+        <w:t>race precision@10: 0.767</w:t>
       </w:r>
     </w:p>
     <w:p>
@@ -479,7 +495,7 @@
         <w:pStyle w:val="ListBullet"/>
       </w:pPr>
       <w:r>
-        <w:t>average accuracy: 0.782</w:t>
+        <w:t>average accuracy: 0.780</w:t>
       </w:r>
     </w:p>
     <w:p>
@@ -487,7 +503,7 @@
         <w:pStyle w:val="ListBullet"/>
       </w:pPr>
       <w:r>
-        <w:t>average F1: 0.781</w:t>
+        <w:t>average F1: 0.779</w:t>
       </w:r>
     </w:p>
     <w:p>
@@ -495,7 +511,7 @@
         <w:pStyle w:val="ListBullet"/>
       </w:pPr>
       <w:r>
-        <w:t>average ROC-AUC: 0.847</w:t>
+        <w:t>average ROC-AUC: 0.848</w:t>
       </w:r>
     </w:p>
     <w:p>
@@ -503,7 +519,27 @@
         <w:pStyle w:val="ListBullet"/>
       </w:pPr>
       <w:r>
-        <w:t>average race precision@10: 0.775</w:t>
+        <w:t>average race precision@10: 0.768</w:t>
+      </w:r>
+    </w:p>
+    <w:p>
+      <w:r>
+        <w:t>The dedicated tuned neural network reaches a higher 2025 holdout</w:t>
+      </w:r>
+    </w:p>
+    <w:p>
+      <w:r>
+        <w:t>race precision@10 of 0.779, but its rolling-backtest average is lower than the</w:t>
+      </w:r>
+    </w:p>
+    <w:p>
+      <w:r>
+        <w:t>random forest. This makes it a useful secondary model rather than the safest</w:t>
+      </w:r>
+    </w:p>
+    <w:p>
+      <w:r>
+        <w:t>champion model.</w:t>
       </w:r>
     </w:p>
     <w:p>
@@ -565,18 +601,44 @@
       </w:r>
     </w:p>
     <w:p>
+      <w:pPr>
+        <w:pStyle w:val="ListBullet"/>
+      </w:pPr>
       <w:r>
-        <w:t>Because the final supervised dataset did not receive new race-result rows, the</w:t>
+        <w:t>Open-Meteo historical weather is available for all 313 local race-result</w:t>
       </w:r>
     </w:p>
     <w:p>
       <w:r>
-        <w:t>models did not require retraining. Upcoming-race predictions were regenerated</w:t>
+        <w:t>events</w:t>
+      </w:r>
+    </w:p>
+    <w:p>
+      <w:pPr>
+        <w:pStyle w:val="ListBullet"/>
+      </w:pPr>
+      <w:r>
+        <w:t>FastF1 currently has 173 race rows, with 96 fully available race-session</w:t>
       </w:r>
     </w:p>
     <w:p>
       <w:r>
-        <w:t>with actual Miami qualifying data.</w:t>
+        <w:t>weather/lap rows and 77 unavailable rows due to timing API limits</w:t>
+      </w:r>
+    </w:p>
+    <w:p>
+      <w:r>
+        <w:t>The final dataset was regenerated and all models were retrained after adding</w:t>
+      </w:r>
+    </w:p>
+    <w:p>
+      <w:r>
+        <w:t>historical weather. Upcoming-race predictions were regenerated with actual</w:t>
+      </w:r>
+    </w:p>
+    <w:p>
+      <w:r>
+        <w:t>Miami qualifying data and Open-Meteo forecast weather for Miami.</w:t>
       </w:r>
     </w:p>
     <w:p>
@@ -599,7 +661,7 @@
     </w:p>
     <w:p>
       <w:r>
-        <w:t>python scripts/run_pipeline.py --with-fastf1</w:t>
+        <w:t>python scripts/run_pipeline.py --with-fastf1 --with-historical-weather</w:t>
       </w:r>
     </w:p>
     <w:p>
@@ -656,7 +718,7 @@
         <w:pStyle w:val="ListBullet"/>
       </w:pPr>
       <w:r>
-        <w:t>FastF1 enrichment currently covers recent seasons only</w:t>
+        <w:t>FastF1 enrichment is partial because the timing API is rate limited</w:t>
       </w:r>
     </w:p>
     <w:p>
@@ -664,7 +726,12 @@
         <w:pStyle w:val="ListBullet"/>
       </w:pPr>
       <w:r>
-        <w:t>actual weather is used as a proxy for race weather information</w:t>
+        <w:t>Open-Meteo weather is historical race-day weather, not exact live race sensor</w:t>
+      </w:r>
+    </w:p>
+    <w:p>
+      <w:r>
+        <w:t>weather</w:t>
       </w:r>
     </w:p>
     <w:p>

</xml_diff>

<commit_message>
Add race control and position ranking models
</commit_message>
<xml_diff>
--- a/report/Report.docx
+++ b/report/Report.docx
@@ -72,12 +72,17 @@
         <w:pStyle w:val="ListBullet"/>
       </w:pPr>
       <w:r>
-        <w:t>FastF1 for optional race-session enrichment, including weather and lap-based</w:t>
+        <w:t>FastF1 for optional race-session enrichment, including weather, lap-based</w:t>
       </w:r>
     </w:p>
     <w:p>
       <w:r>
-        <w:t>historical form features for supported recent seasons.</w:t>
+        <w:t>historical form features and race-control messages for supported recent</w:t>
+      </w:r>
+    </w:p>
+    <w:p>
+      <w:r>
+        <w:t>seasons.</w:t>
       </w:r>
     </w:p>
     <w:p>
@@ -106,7 +111,12 @@
         <w:pStyle w:val="ListBullet"/>
       </w:pPr>
       <w:r>
-        <w:t>166 columns after optional FastF1 enrichment</w:t>
+        <w:t>198 columns after optional FastF1 race, weather, lap and race-control</w:t>
+      </w:r>
+    </w:p>
+    <w:p>
+      <w:r>
+        <w:t>enrichment</w:t>
       </w:r>
     </w:p>
     <w:p>
@@ -200,18 +210,36 @@
       </w:r>
     </w:p>
     <w:p>
+      <w:pPr>
+        <w:pStyle w:val="ListBullet"/>
+      </w:pPr>
+      <w:r>
+        <w:t>FastF1-derived pre-race circuit and season disruption history, such as safety</w:t>
+      </w:r>
+    </w:p>
+    <w:p>
+      <w:r>
+        <w:t>car rate, red-flag rate and average disruption score</w:t>
+      </w:r>
+    </w:p>
+    <w:p>
       <w:r>
         <w:t>Post-race leakage columns such as final position, points, laps completed, race</w:t>
       </w:r>
     </w:p>
     <w:p>
       <w:r>
-        <w:t>status and fastest lap information are kept for analysis but excluded during</w:t>
+        <w:t>status, fastest lap information and same-race race-control counts are kept for</w:t>
       </w:r>
     </w:p>
     <w:p>
       <w:r>
-        <w:t>training.</w:t>
+        <w:t>analysis but excluded during top-10 training. Only historical race-control</w:t>
+      </w:r>
+    </w:p>
+    <w:p>
+      <w:r>
+        <w:t>aggregates from previous races are used as predictive features.</w:t>
       </w:r>
     </w:p>
     <w:p>
@@ -268,6 +296,14 @@
       </w:r>
     </w:p>
     <w:p>
+      <w:pPr>
+        <w:pStyle w:val="ListBullet"/>
+      </w:pPr>
+      <w:r>
+        <w:t>finish-position regressors for predicted race order</w:t>
+      </w:r>
+    </w:p>
+    <w:p>
       <w:r>
         <w:t>The neural network is included as a baseline, but the dataset is still tabular</w:t>
       </w:r>
@@ -310,7 +346,7 @@
         <w:pStyle w:val="ListBullet"/>
       </w:pPr>
       <w:r>
-        <w:t>hidden layers: 96 and 48 neurons</w:t>
+        <w:t>hidden layers: 128 and 64 neurons</w:t>
       </w:r>
     </w:p>
     <w:p>
@@ -326,7 +362,7 @@
         <w:pStyle w:val="ListBullet"/>
       </w:pPr>
       <w:r>
-        <w:t>alpha: 0.003</w:t>
+        <w:t>alpha: 0.002</w:t>
       </w:r>
     </w:p>
     <w:p>
@@ -334,7 +370,7 @@
         <w:pStyle w:val="ListBullet"/>
       </w:pPr>
       <w:r>
-        <w:t>learning rate: 0.0008</w:t>
+        <w:t>learning rate: 0.0005</w:t>
       </w:r>
     </w:p>
     <w:p>
@@ -342,7 +378,7 @@
         <w:pStyle w:val="ListBullet"/>
       </w:pPr>
       <w:r>
-        <w:t>race precision@10: 0.779</w:t>
+        <w:t>race precision@10: 0.771</w:t>
       </w:r>
     </w:p>
     <w:p>
@@ -358,6 +394,81 @@
     <w:p>
       <w:r>
         <w:t>season-by-season backtest.</w:t>
+      </w:r>
+    </w:p>
+    <w:p>
+      <w:pPr>
+        <w:pStyle w:val="Heading2"/>
+      </w:pPr>
+      <w:r>
+        <w:t>Finish-Position Model</w:t>
+      </w:r>
+    </w:p>
+    <w:p>
+      <w:r>
+        <w:t>The project now includes a second modeling task: predicting the likely finishing</w:t>
+      </w:r>
+    </w:p>
+    <w:p>
+      <w:r>
+        <w:t>order. This is trained as a regression/ranking problem on final_position and</w:t>
+      </w:r>
+    </w:p>
+    <w:p>
+      <w:r>
+        <w:t>is used to add predicted_finish_rank to upcoming-race exports.</w:t>
+      </w:r>
+    </w:p>
+    <w:p>
+      <w:r>
+        <w:t>The best holdout finish-position model is a neural-network MLP regressor:</w:t>
+      </w:r>
+    </w:p>
+    <w:p>
+      <w:pPr>
+        <w:pStyle w:val="ListBullet"/>
+      </w:pPr>
+      <w:r>
+        <w:t>race precision@10: 0.771</w:t>
+      </w:r>
+    </w:p>
+    <w:p>
+      <w:pPr>
+        <w:pStyle w:val="ListBullet"/>
+      </w:pPr>
+      <w:r>
+        <w:t>raw position MAE: 3.24 positions</w:t>
+      </w:r>
+    </w:p>
+    <w:p>
+      <w:pPr>
+        <w:pStyle w:val="ListBullet"/>
+      </w:pPr>
+      <w:r>
+        <w:t>actual-top-10 rank MAE: 2.65 positions</w:t>
+      </w:r>
+    </w:p>
+    <w:p>
+      <w:pPr>
+        <w:pStyle w:val="ListBullet"/>
+      </w:pPr>
+      <w:r>
+        <w:t>mean race Spearman correlation: 0.655</w:t>
+      </w:r>
+    </w:p>
+    <w:p>
+      <w:r>
+        <w:t>This model complements the binary top-10 classifier. The classifier estimates</w:t>
+      </w:r>
+    </w:p>
+    <w:p>
+      <w:r>
+        <w:t>top-10 probability, while the position model gives an expected ordering among</w:t>
+      </w:r>
+    </w:p>
+    <w:p>
+      <w:r>
+        <w:t>the drivers.</w:t>
       </w:r>
     </w:p>
     <w:p>
@@ -442,7 +553,7 @@
         <w:pStyle w:val="ListBullet"/>
       </w:pPr>
       <w:r>
-        <w:t>accuracy: 0.768</w:t>
+        <w:t>accuracy: 0.770</w:t>
       </w:r>
     </w:p>
     <w:p>
@@ -450,7 +561,7 @@
         <w:pStyle w:val="ListBullet"/>
       </w:pPr>
       <w:r>
-        <w:t>precision: 0.763</w:t>
+        <w:t>precision: 0.778</w:t>
       </w:r>
     </w:p>
     <w:p>
@@ -458,7 +569,7 @@
         <w:pStyle w:val="ListBullet"/>
       </w:pPr>
       <w:r>
-        <w:t>recall: 0.779</w:t>
+        <w:t>recall: 0.758</w:t>
       </w:r>
     </w:p>
     <w:p>
@@ -466,7 +577,7 @@
         <w:pStyle w:val="ListBullet"/>
       </w:pPr>
       <w:r>
-        <w:t>F1: 0.771</w:t>
+        <w:t>F1: 0.768</w:t>
       </w:r>
     </w:p>
     <w:p>
@@ -474,7 +585,7 @@
         <w:pStyle w:val="ListBullet"/>
       </w:pPr>
       <w:r>
-        <w:t>ROC-AUC: 0.835</w:t>
+        <w:t>ROC-AUC: 0.836</w:t>
       </w:r>
     </w:p>
     <w:p>
@@ -482,7 +593,7 @@
         <w:pStyle w:val="ListBullet"/>
       </w:pPr>
       <w:r>
-        <w:t>race precision@10: 0.767</w:t>
+        <w:t>race precision@10: 0.775</w:t>
       </w:r>
     </w:p>
     <w:p>
@@ -495,7 +606,7 @@
         <w:pStyle w:val="ListBullet"/>
       </w:pPr>
       <w:r>
-        <w:t>average accuracy: 0.780</w:t>
+        <w:t>average accuracy: 0.782</w:t>
       </w:r>
     </w:p>
     <w:p>
@@ -503,7 +614,7 @@
         <w:pStyle w:val="ListBullet"/>
       </w:pPr>
       <w:r>
-        <w:t>average F1: 0.779</w:t>
+        <w:t>average F1: 0.780</w:t>
       </w:r>
     </w:p>
     <w:p>
@@ -511,7 +622,7 @@
         <w:pStyle w:val="ListBullet"/>
       </w:pPr>
       <w:r>
-        <w:t>average ROC-AUC: 0.848</w:t>
+        <w:t>average ROC-AUC: 0.849</w:t>
       </w:r>
     </w:p>
     <w:p>
@@ -519,27 +630,22 @@
         <w:pStyle w:val="ListBullet"/>
       </w:pPr>
       <w:r>
-        <w:t>average race precision@10: 0.768</w:t>
+        <w:t>average race precision@10: 0.774</w:t>
       </w:r>
     </w:p>
     <w:p>
       <w:r>
-        <w:t>The dedicated tuned neural network reaches a higher 2025 holdout</w:t>
+        <w:t>The dedicated tuned top-10 neural network reaches a 2025 holdout race</w:t>
       </w:r>
     </w:p>
     <w:p>
       <w:r>
-        <w:t>race precision@10 of 0.779, but its rolling-backtest average is lower than the</w:t>
+        <w:t>precision@10 of 0.771. The neural-network finish-position model is more useful</w:t>
       </w:r>
     </w:p>
     <w:p>
       <w:r>
-        <w:t>random forest. This makes it a useful secondary model rather than the safest</w:t>
-      </w:r>
-    </w:p>
-    <w:p>
-      <w:r>
-        <w:t>champion model.</w:t>
+        <w:t>for ranking the predicted top 10 than for replacing the champion classifier.</w:t>
       </w:r>
     </w:p>
     <w:p>
@@ -627,18 +733,36 @@
       </w:r>
     </w:p>
     <w:p>
+      <w:pPr>
+        <w:pStyle w:val="ListBullet"/>
+      </w:pPr>
+      <w:r>
+        <w:t>FastF1 race-control messages are available for 163/173 attempted races; the</w:t>
+      </w:r>
+    </w:p>
+    <w:p>
+      <w:r>
+        <w:t>final 10 unavailable rows are caused by API rate limits</w:t>
+      </w:r>
+    </w:p>
+    <w:p>
       <w:r>
         <w:t>The final dataset was regenerated and all models were retrained after adding</w:t>
       </w:r>
     </w:p>
     <w:p>
       <w:r>
-        <w:t>historical weather. Upcoming-race predictions were regenerated with actual</w:t>
+        <w:t>historical weather and race-control history. Upcoming-race predictions were</w:t>
       </w:r>
     </w:p>
     <w:p>
       <w:r>
-        <w:t>Miami qualifying data and Open-Meteo forecast weather for Miami.</w:t>
+        <w:t>regenerated with actual Miami qualifying data, Open-Meteo forecast weather for</w:t>
+      </w:r>
+    </w:p>
+    <w:p>
+      <w:r>
+        <w:t>Miami and a finish-position ranking model.</w:t>
       </w:r>
     </w:p>
     <w:p>
@@ -661,7 +785,7 @@
     </w:p>
     <w:p>
       <w:r>
-        <w:t>python scripts/run_pipeline.py --with-fastf1 --with-historical-weather</w:t>
+        <w:t>python scripts/run_pipeline.py --with-fastf1 --with-historical-weather --with-race-control</w:t>
       </w:r>
     </w:p>
     <w:p>
@@ -682,6 +806,21 @@
     <w:p>
       <w:r>
         <w:t>python scripts/predict_top10.py</w:t>
+      </w:r>
+    </w:p>
+    <w:p>
+      <w:r>
+        <w:t>To train and use the finish-position ranking model:</w:t>
+      </w:r>
+    </w:p>
+    <w:p>
+      <w:r>
+        <w:t>python scripts/train_position_model.py</w:t>
+      </w:r>
+    </w:p>
+    <w:p>
+      <w:r>
+        <w:t>python scripts/predict_upcoming_races.py --season 2026 --count 4 --current-date 2026-05-03 --position-model outputs/models/finish_position_regressor.joblib</w:t>
       </w:r>
     </w:p>
     <w:p>
@@ -732,6 +871,19 @@
     <w:p>
       <w:r>
         <w:t>weather</w:t>
+      </w:r>
+    </w:p>
+    <w:p>
+      <w:pPr>
+        <w:pStyle w:val="ListBullet"/>
+      </w:pPr>
+      <w:r>
+        <w:t>finish-position prediction is approximate and should be read as a ranked</w:t>
+      </w:r>
+    </w:p>
+    <w:p>
+      <w:r>
+        <w:t>expectation, not an exact finishing order</w:t>
       </w:r>
     </w:p>
     <w:p>
@@ -959,7 +1111,7 @@
     </w:p>
     <w:p>
       <w:r>
-        <w:t>rolling_backtest.png</w:t>
+        <w:t>position_model_comparison.png</w:t>
       </w:r>
     </w:p>
     <w:p>
@@ -975,11 +1127,52 @@
               <a:graphicData uri="http://schemas.openxmlformats.org/drawingml/2006/picture">
                 <pic:pic>
                   <pic:nvPicPr>
+                    <pic:cNvPr id="0" name="position_model_comparison.png"/>
+                    <pic:cNvPicPr/>
+                  </pic:nvPicPr>
+                  <pic:blipFill>
+                    <a:blip r:embed="rId14"/>
+                    <a:stretch>
+                      <a:fillRect/>
+                    </a:stretch>
+                  </pic:blipFill>
+                  <pic:spPr>
+                    <a:xfrm>
+                      <a:off x="0" y="0"/>
+                      <a:ext cx="5303520" cy="2651760"/>
+                    </a:xfrm>
+                    <a:prstGeom prst="rect"/>
+                  </pic:spPr>
+                </pic:pic>
+              </a:graphicData>
+            </a:graphic>
+          </wp:inline>
+        </w:drawing>
+      </w:r>
+    </w:p>
+    <w:p>
+      <w:r>
+        <w:t>rolling_backtest.png</w:t>
+      </w:r>
+    </w:p>
+    <w:p>
+      <w:r>
+        <w:drawing>
+          <wp:inline xmlns:a="http://schemas.openxmlformats.org/drawingml/2006/main" xmlns:pic="http://schemas.openxmlformats.org/drawingml/2006/picture">
+            <wp:extent cx="5303520" cy="2651760"/>
+            <wp:docPr id="7" name="Picture 7"/>
+            <wp:cNvGraphicFramePr>
+              <a:graphicFrameLocks noChangeAspect="1"/>
+            </wp:cNvGraphicFramePr>
+            <a:graphic>
+              <a:graphicData uri="http://schemas.openxmlformats.org/drawingml/2006/picture">
+                <pic:pic>
+                  <pic:nvPicPr>
                     <pic:cNvPr id="0" name="rolling_backtest.png"/>
                     <pic:cNvPicPr/>
                   </pic:nvPicPr>
                   <pic:blipFill>
-                    <a:blip r:embed="rId14"/>
+                    <a:blip r:embed="rId15"/>
                     <a:stretch>
                       <a:fillRect/>
                     </a:stretch>
@@ -1008,7 +1201,7 @@
         <w:drawing>
           <wp:inline xmlns:a="http://schemas.openxmlformats.org/drawingml/2006/main" xmlns:pic="http://schemas.openxmlformats.org/drawingml/2006/picture">
             <wp:extent cx="5303520" cy="4124960"/>
-            <wp:docPr id="7" name="Picture 7"/>
+            <wp:docPr id="8" name="Picture 8"/>
             <wp:cNvGraphicFramePr>
               <a:graphicFrameLocks noChangeAspect="1"/>
             </wp:cNvGraphicFramePr>
@@ -1020,7 +1213,7 @@
                     <pic:cNvPicPr/>
                   </pic:nvPicPr>
                   <pic:blipFill>
-                    <a:blip r:embed="rId15"/>
+                    <a:blip r:embed="rId16"/>
                     <a:stretch>
                       <a:fillRect/>
                     </a:stretch>
@@ -1049,7 +1242,7 @@
         <w:drawing>
           <wp:inline xmlns:a="http://schemas.openxmlformats.org/drawingml/2006/main" xmlns:pic="http://schemas.openxmlformats.org/drawingml/2006/picture">
             <wp:extent cx="5303520" cy="4242816"/>
-            <wp:docPr id="8" name="Picture 8"/>
+            <wp:docPr id="9" name="Picture 9"/>
             <wp:cNvGraphicFramePr>
               <a:graphicFrameLocks noChangeAspect="1"/>
             </wp:cNvGraphicFramePr>
@@ -1061,7 +1254,7 @@
                     <pic:cNvPicPr/>
                   </pic:nvPicPr>
                   <pic:blipFill>
-                    <a:blip r:embed="rId16"/>
+                    <a:blip r:embed="rId17"/>
                     <a:stretch>
                       <a:fillRect/>
                     </a:stretch>

</xml_diff>

<commit_message>
Add incremental Miami data and neural 3D view
</commit_message>
<xml_diff>
--- a/report/Report.docx
+++ b/report/Report.docx
@@ -338,7 +338,7 @@
     </w:p>
     <w:p>
       <w:r>
-        <w:t>uses two hidden layers:</w:t>
+        <w:t>uses three hidden layers:</w:t>
       </w:r>
     </w:p>
     <w:p>
@@ -346,7 +346,7 @@
         <w:pStyle w:val="ListBullet"/>
       </w:pPr>
       <w:r>
-        <w:t>hidden layers: 128 and 64 neurons</w:t>
+        <w:t>hidden layers: 128, 64 and 32 neurons</w:t>
       </w:r>
     </w:p>
     <w:p>
@@ -362,7 +362,7 @@
         <w:pStyle w:val="ListBullet"/>
       </w:pPr>
       <w:r>
-        <w:t>alpha: 0.002</w:t>
+        <w:t>alpha: 0.004</w:t>
       </w:r>
     </w:p>
     <w:p>
@@ -370,7 +370,7 @@
         <w:pStyle w:val="ListBullet"/>
       </w:pPr>
       <w:r>
-        <w:t>learning rate: 0.0005</w:t>
+        <w:t>learning rate: 0.0006</w:t>
       </w:r>
     </w:p>
     <w:p>
@@ -421,7 +421,12 @@
     </w:p>
     <w:p>
       <w:r>
-        <w:t>The best holdout finish-position model is a neural-network MLP regressor:</w:t>
+        <w:t>The best holdout finish-position model is a histogram gradient boosting</w:t>
+      </w:r>
+    </w:p>
+    <w:p>
+      <w:r>
+        <w:t>regressor:</w:t>
       </w:r>
     </w:p>
     <w:p>
@@ -429,7 +434,7 @@
         <w:pStyle w:val="ListBullet"/>
       </w:pPr>
       <w:r>
-        <w:t>race precision@10: 0.771</w:t>
+        <w:t>race precision@10: 0.775</w:t>
       </w:r>
     </w:p>
     <w:p>
@@ -437,7 +442,7 @@
         <w:pStyle w:val="ListBullet"/>
       </w:pPr>
       <w:r>
-        <w:t>raw position MAE: 3.24 positions</w:t>
+        <w:t>raw position MAE: 3.25 positions</w:t>
       </w:r>
     </w:p>
     <w:p>
@@ -445,7 +450,7 @@
         <w:pStyle w:val="ListBullet"/>
       </w:pPr>
       <w:r>
-        <w:t>actual-top-10 rank MAE: 2.65 positions</w:t>
+        <w:t>actual-top-10 rank MAE: 2.60 positions</w:t>
       </w:r>
     </w:p>
     <w:p>
@@ -453,7 +458,7 @@
         <w:pStyle w:val="ListBullet"/>
       </w:pPr>
       <w:r>
-        <w:t>mean race Spearman correlation: 0.655</w:t>
+        <w:t>mean race Spearman correlation: 0.648</w:t>
       </w:r>
     </w:p>
     <w:p>
@@ -561,7 +566,7 @@
         <w:pStyle w:val="ListBullet"/>
       </w:pPr>
       <w:r>
-        <w:t>precision: 0.778</w:t>
+        <w:t>precision: 0.763</w:t>
       </w:r>
     </w:p>
     <w:p>
@@ -569,7 +574,7 @@
         <w:pStyle w:val="ListBullet"/>
       </w:pPr>
       <w:r>
-        <w:t>recall: 0.758</w:t>
+        <w:t>recall: 0.779</w:t>
       </w:r>
     </w:p>
     <w:p>
@@ -577,7 +582,7 @@
         <w:pStyle w:val="ListBullet"/>
       </w:pPr>
       <w:r>
-        <w:t>F1: 0.768</w:t>
+        <w:t>F1: 0.771</w:t>
       </w:r>
     </w:p>
     <w:p>
@@ -585,7 +590,7 @@
         <w:pStyle w:val="ListBullet"/>
       </w:pPr>
       <w:r>
-        <w:t>ROC-AUC: 0.836</w:t>
+        <w:t>ROC-AUC: 0.833</w:t>
       </w:r>
     </w:p>
     <w:p>
@@ -593,7 +598,7 @@
         <w:pStyle w:val="ListBullet"/>
       </w:pPr>
       <w:r>
-        <w:t>race precision@10: 0.775</w:t>
+        <w:t>race precision@10: 0.779</w:t>
       </w:r>
     </w:p>
     <w:p>
@@ -622,7 +627,7 @@
         <w:pStyle w:val="ListBullet"/>
       </w:pPr>
       <w:r>
-        <w:t>average ROC-AUC: 0.849</w:t>
+        <w:t>average ROC-AUC: 0.851</w:t>
       </w:r>
     </w:p>
     <w:p>
@@ -630,7 +635,7 @@
         <w:pStyle w:val="ListBullet"/>
       </w:pPr>
       <w:r>
-        <w:t>average race precision@10: 0.774</w:t>
+        <w:t>average race precision@10: 0.773</w:t>
       </w:r>
     </w:p>
     <w:p>
@@ -640,12 +645,12 @@
     </w:p>
     <w:p>
       <w:r>
-        <w:t>precision@10 of 0.771. The neural-network finish-position model is more useful</w:t>
+        <w:t>precision@10 of 0.771. It remains useful as a secondary model and for hidden</w:t>
       </w:r>
     </w:p>
     <w:p>
       <w:r>
-        <w:t>for ranking the predicted top 10 than for replacing the champion classifier.</w:t>
+        <w:t>space visualization, while tree-based models remain the safer champion.</w:t>
       </w:r>
     </w:p>
     <w:p>
@@ -658,7 +663,7 @@
     </w:p>
     <w:p>
       <w:r>
-        <w:t>The latest data audit on 2026-05-03 found:</w:t>
+        <w:t>The latest data audit on 2026-05-05 found:</w:t>
       </w:r>
     </w:p>
     <w:p>
@@ -674,7 +679,7 @@
         <w:pStyle w:val="ListBullet"/>
       </w:pPr>
       <w:r>
-        <w:t>3 race-result rounds available in Jolpica and already present locally</w:t>
+        <w:t>4 race-result rounds available in Jolpica and already present locally</w:t>
       </w:r>
     </w:p>
     <w:p>
@@ -682,7 +687,7 @@
         <w:pStyle w:val="ListBullet"/>
       </w:pPr>
       <w:r>
-        <w:t>4 qualifying rounds available in Jolpica after Miami qualifying was published</w:t>
+        <w:t>4 qualifying rounds available in Jolpica and already present locally</w:t>
       </w:r>
     </w:p>
     <w:p>
@@ -690,7 +695,12 @@
         <w:pStyle w:val="ListBullet"/>
       </w:pPr>
       <w:r>
-        <w:t>4 qualifying rounds now present locally after importing Miami qualifying</w:t>
+        <w:t>Miami 2026 race results and pit stops were imported incrementally without</w:t>
+      </w:r>
+    </w:p>
+    <w:p>
+      <w:r>
+        <w:t>refetching older races</w:t>
       </w:r>
     </w:p>
     <w:p>
@@ -698,20 +708,7 @@
         <w:pStyle w:val="ListBullet"/>
       </w:pPr>
       <w:r>
-        <w:t>no Miami race result available yet, so the supervised training dataset still</w:t>
-      </w:r>
-    </w:p>
-    <w:p>
-      <w:r>
-        <w:t>ends at 2026 round 3</w:t>
-      </w:r>
-    </w:p>
-    <w:p>
-      <w:pPr>
-        <w:pStyle w:val="ListBullet"/>
-      </w:pPr>
-      <w:r>
-        <w:t>Open-Meteo historical weather is available for all 313 local race-result</w:t>
+        <w:t>Open-Meteo historical weather is available for all 314 local race-result</w:t>
       </w:r>
     </w:p>
     <w:p>
@@ -724,7 +721,7 @@
         <w:pStyle w:val="ListBullet"/>
       </w:pPr>
       <w:r>
-        <w:t>FastF1 currently has 173 race rows, with 96 fully available race-session</w:t>
+        <w:t>FastF1 currently has 177 race rows, with 100 fully available race-session</w:t>
       </w:r>
     </w:p>
     <w:p>
@@ -737,7 +734,7 @@
         <w:pStyle w:val="ListBullet"/>
       </w:pPr>
       <w:r>
-        <w:t>FastF1 race-control messages are available for 163/173 attempted races; the</w:t>
+        <w:t>FastF1 race-control messages are available for 167/177 attempted races; the</w:t>
       </w:r>
     </w:p>
     <w:p>
@@ -752,17 +749,22 @@
     </w:p>
     <w:p>
       <w:r>
-        <w:t>historical weather and race-control history. Upcoming-race predictions were</w:t>
+        <w:t>Miami results, historical weather and race-control history. Upcoming-race</w:t>
       </w:r>
     </w:p>
     <w:p>
       <w:r>
-        <w:t>regenerated with actual Miami qualifying data, Open-Meteo forecast weather for</w:t>
+        <w:t>predictions now start from Canada 2026 and include a finish-position ranking</w:t>
       </w:r>
     </w:p>
     <w:p>
       <w:r>
-        <w:t>Miami and a finish-position ranking model.</w:t>
+        <w:t>model. A 3D Plotly visualization was also added for the neural-network hidden</w:t>
+      </w:r>
+    </w:p>
+    <w:p>
+      <w:r>
+        <w:t>representation and KMeans clusters.</w:t>
       </w:r>
     </w:p>
     <w:p>
@@ -820,7 +822,17 @@
     </w:p>
     <w:p>
       <w:r>
-        <w:t>python scripts/predict_upcoming_races.py --season 2026 --count 4 --current-date 2026-05-03 --position-model outputs/models/finish_position_regressor.joblib</w:t>
+        <w:t>python scripts/predict_upcoming_races.py --season 2026 --count 4 --current-date 2026-05-05 --position-model outputs/models/finish_position_regressor.joblib</w:t>
+      </w:r>
+    </w:p>
+    <w:p>
+      <w:r>
+        <w:t>To visualize the neural-network hidden space in 3D:</w:t>
+      </w:r>
+    </w:p>
+    <w:p>
+      <w:r>
+        <w:t>python scripts/visualize_neural_network_3d.py --color-by cluster</w:t>
       </w:r>
     </w:p>
     <w:p>

</xml_diff>

<commit_message>
Align deliverables with assignment requirements
</commit_message>
<xml_diff>
--- a/report/Report.docx
+++ b/report/Report.docx
@@ -7,7 +7,7 @@
         <w:pStyle w:val="Heading1"/>
       </w:pPr>
       <w:r>
-        <w:t>F1 Top 10 Prediction Report</w:t>
+        <w:t>F1 Top-10 Finish Prediction with Machine Learning</w:t>
       </w:r>
     </w:p>
     <w:p>
@@ -15,22 +15,12 @@
         <w:pStyle w:val="Heading2"/>
       </w:pPr>
       <w:r>
-        <w:t>Objective</w:t>
+        <w:t>Abstract</w:t>
       </w:r>
     </w:p>
     <w:p>
       <w:r>
-        <w:t>The objective of this project is to predict whether a Formula 1 driver will</w:t>
-      </w:r>
-    </w:p>
-    <w:p>
-      <w:r>
-        <w:t>finish a race in the top 10. The task is framed as a binary classification</w:t>
-      </w:r>
-    </w:p>
-    <w:p>
-      <w:r>
-        <w:t>problem where the target variable is top10_finish.</w:t>
+        <w:t>This project investigates whether machine learning can predict if a Formula 1 driver will finish a Grand Prix in the top 10. This is a useful sporting analytics problem because top-10 classification is directly linked to points scoring, race strategy and team performance evaluation. A single model-ready dataset was built from public Formula 1 data covering 2010 to 2026, combining race results, qualifying, standings, circuit information, historical pit-stop indicators, weather, and selected FastF1-derived features. The dataset was cleaned, merged and transformed into 6,999 driver-race observations with 198 variables and no missing values. The main predictive task is binary classification with top10_finish as the target. Logistic regression, random forest, extra trees, histogram gradient boosting and a multilayer perceptron were compared using temporal validation. The best holdout model is histogram gradient boosting, with 2025 race precision@10 of 0.779. A separate neural-network regressor was also trained as a ranking extension for predicted finishing order, but the primary assignment result remains the comparison and validation of predictive models on the tabular top-10 classification task.</w:t>
       </w:r>
     </w:p>
     <w:p>
@@ -38,12 +28,22 @@
         <w:pStyle w:val="Heading2"/>
       </w:pPr>
       <w:r>
-        <w:t>Data</w:t>
+        <w:t>Introduction, Aim and Objectives</w:t>
       </w:r>
     </w:p>
     <w:p>
       <w:r>
-        <w:t>The project uses three public data sources:</w:t>
+        <w:t>Formula 1 results are influenced by many interacting factors: car performance, driver ability, qualifying position, reliability, circuit type, weather and race strategy. This makes the problem more challenging than a simple ranking by previous points. The goal of this project is to use historical and pre-race information to estimate whether each driver will finish inside the top 10.</w:t>
+      </w:r>
+    </w:p>
+    <w:p>
+      <w:r>
+        <w:t>The aim is to build, evaluate and compare machine learning models for Formula 1 top-10 finish prediction.</w:t>
+      </w:r>
+    </w:p>
+    <w:p>
+      <w:r>
+        <w:t>The objectives are:</w:t>
       </w:r>
     </w:p>
     <w:p>
@@ -51,12 +51,7 @@
         <w:pStyle w:val="ListBullet"/>
       </w:pPr>
       <w:r>
-        <w:t>Jolpica F1 API, an Ergast-compatible API, for historical race results,</w:t>
-      </w:r>
-    </w:p>
-    <w:p>
-      <w:r>
-        <w:t>qualifying results, drivers, constructors, circuits, standings and pit stops.</w:t>
+        <w:t>collect and consolidate a reasonably large, non-trivial Formula 1 dataset</w:t>
       </w:r>
     </w:p>
     <w:p>
@@ -64,7 +59,7 @@
         <w:pStyle w:val="ListBullet"/>
       </w:pPr>
       <w:r>
-        <w:t>Open-Meteo Archive for historical race-day weather enrichment.</w:t>
+        <w:t>include both numeric and categorical features</w:t>
       </w:r>
     </w:p>
     <w:p>
@@ -72,22 +67,7 @@
         <w:pStyle w:val="ListBullet"/>
       </w:pPr>
       <w:r>
-        <w:t>FastF1 for optional race-session enrichment, including weather, lap-based</w:t>
-      </w:r>
-    </w:p>
-    <w:p>
-      <w:r>
-        <w:t>historical form features and race-control messages for supported recent</w:t>
-      </w:r>
-    </w:p>
-    <w:p>
-      <w:r>
-        <w:t>seasons.</w:t>
-      </w:r>
-    </w:p>
-    <w:p>
-      <w:r>
-        <w:t>The current model-ready dataset contains:</w:t>
+        <w:t>perform exploratory data analysis and preprocessing</w:t>
       </w:r>
     </w:p>
     <w:p>
@@ -95,7 +75,7 @@
         <w:pStyle w:val="ListBullet"/>
       </w:pPr>
       <w:r>
-        <w:t>6521 driver-race rows</w:t>
+        <w:t>engineer predictive features that avoid direct post-race leakage</w:t>
       </w:r>
     </w:p>
     <w:p>
@@ -103,7 +83,7 @@
         <w:pStyle w:val="ListBullet"/>
       </w:pPr>
       <w:r>
-        <w:t>seasons from 2010 to 2026</w:t>
+        <w:t>train at least two predictive machine learning models</w:t>
       </w:r>
     </w:p>
     <w:p>
@@ -111,12 +91,7 @@
         <w:pStyle w:val="ListBullet"/>
       </w:pPr>
       <w:r>
-        <w:t>198 columns after optional FastF1 race, weather, lap and race-control</w:t>
-      </w:r>
-    </w:p>
-    <w:p>
-      <w:r>
-        <w:t>enrichment</w:t>
+        <w:t>tune and compare models using appropriate validation metrics</w:t>
       </w:r>
     </w:p>
     <w:p>
@@ -124,7 +99,12 @@
         <w:pStyle w:val="ListBullet"/>
       </w:pPr>
       <w:r>
-        <w:t>no missing values after preprocessing</w:t>
+        <w:t>interpret the results and recommend the most suitable model</w:t>
+      </w:r>
+    </w:p>
+    <w:p>
+      <w:r>
+        <w:t>The scope is supervised prediction at driver-race level. The main output is a probability and ranking of likely top-10 finishers. Exact race simulation, live telemetry modelling and lap-by-lap race strategy optimization are treated as future work rather than core assignment requirements.</w:t>
       </w:r>
     </w:p>
     <w:p>
@@ -132,17 +112,472 @@
         <w:pStyle w:val="Heading2"/>
       </w:pPr>
       <w:r>
-        <w:t>Feature Engineering</w:t>
+        <w:t>Related Works</w:t>
       </w:r>
     </w:p>
     <w:p>
       <w:r>
-        <w:t>The model uses only pre-race or historical features where possible. Important</w:t>
+        <w:t>Previous Formula 1 analytics work often focuses on lap-time prediction, race outcome prediction, tire degradation or separating driver and constructor effects. These studies informed the feature choices in this project: qualifying position and team strength are important baseline predictors, while circuit, weather, tire and historical form features can improve the model.</w:t>
+      </w:r>
+    </w:p>
+    <w:tbl>
+      <w:tblPr>
+        <w:tblStyle w:val="TableGrid"/>
+        <w:tblW w:type="auto" w:w="0"/>
+        <w:tblLook w:firstColumn="1" w:firstRow="1" w:lastColumn="0" w:lastRow="0" w:noHBand="0" w:noVBand="1" w:val="04A0"/>
+      </w:tblPr>
+      <w:tblGrid>
+        <w:gridCol w:w="2880"/>
+        <w:gridCol w:w="2880"/>
+        <w:gridCol w:w="2880"/>
+      </w:tblGrid>
+      <w:tr>
+        <w:tc>
+          <w:tcPr>
+            <w:tcW w:type="dxa" w:w="2880"/>
+          </w:tcPr>
+          <w:p>
+            <w:r>
+              <w:rPr>
+                <w:b/>
+              </w:rPr>
+              <w:t>Source</w:t>
+            </w:r>
+          </w:p>
+        </w:tc>
+        <w:tc>
+          <w:tcPr>
+            <w:tcW w:type="dxa" w:w="2880"/>
+          </w:tcPr>
+          <w:p>
+            <w:r>
+              <w:rPr>
+                <w:b/>
+              </w:rPr>
+              <w:t>Focus</w:t>
+            </w:r>
+          </w:p>
+        </w:tc>
+        <w:tc>
+          <w:tcPr>
+            <w:tcW w:type="dxa" w:w="2880"/>
+          </w:tcPr>
+          <w:p>
+            <w:r>
+              <w:rPr>
+                <w:b/>
+              </w:rPr>
+              <w:t>Relevance to this project</w:t>
+            </w:r>
+          </w:p>
+        </w:tc>
+      </w:tr>
+      <w:tr>
+        <w:tc>
+          <w:tcPr>
+            <w:tcW w:type="dxa" w:w="2880"/>
+          </w:tcPr>
+          <w:p>
+            <w:r>
+              <w:t>Breiman (2001)</w:t>
+            </w:r>
+          </w:p>
+        </w:tc>
+        <w:tc>
+          <w:tcPr>
+            <w:tcW w:type="dxa" w:w="2880"/>
+          </w:tcPr>
+          <w:p>
+            <w:r>
+              <w:t>Random forests</w:t>
+            </w:r>
+          </w:p>
+        </w:tc>
+        <w:tc>
+          <w:tcPr>
+            <w:tcW w:type="dxa" w:w="2880"/>
+          </w:tcPr>
+          <w:p>
+            <w:r>
+              <w:t>Motivates using tree ensembles for mixed tabular data</w:t>
+            </w:r>
+          </w:p>
+        </w:tc>
+      </w:tr>
+      <w:tr>
+        <w:tc>
+          <w:tcPr>
+            <w:tcW w:type="dxa" w:w="2880"/>
+          </w:tcPr>
+          <w:p>
+            <w:r>
+              <w:t>Friedman (2001)</w:t>
+            </w:r>
+          </w:p>
+        </w:tc>
+        <w:tc>
+          <w:tcPr>
+            <w:tcW w:type="dxa" w:w="2880"/>
+          </w:tcPr>
+          <w:p>
+            <w:r>
+              <w:t>Gradient boosting machines</w:t>
+            </w:r>
+          </w:p>
+        </w:tc>
+        <w:tc>
+          <w:tcPr>
+            <w:tcW w:type="dxa" w:w="2880"/>
+          </w:tcPr>
+          <w:p>
+            <w:r>
+              <w:t>Supports boosting as a strong tabular baseline</w:t>
+            </w:r>
+          </w:p>
+        </w:tc>
+      </w:tr>
+      <w:tr>
+        <w:tc>
+          <w:tcPr>
+            <w:tcW w:type="dxa" w:w="2880"/>
+          </w:tcPr>
+          <w:p>
+            <w:r>
+              <w:t>Pedregosa et al. (2011)</w:t>
+            </w:r>
+          </w:p>
+        </w:tc>
+        <w:tc>
+          <w:tcPr>
+            <w:tcW w:type="dxa" w:w="2880"/>
+          </w:tcPr>
+          <w:p>
+            <w:r>
+              <w:t>scikit-learn</w:t>
+            </w:r>
+          </w:p>
+        </w:tc>
+        <w:tc>
+          <w:tcPr>
+            <w:tcW w:type="dxa" w:w="2880"/>
+          </w:tcPr>
+          <w:p>
+            <w:r>
+              <w:t>Main software library used for modelling pipelines</w:t>
+            </w:r>
+          </w:p>
+        </w:tc>
+      </w:tr>
+      <w:tr>
+        <w:tc>
+          <w:tcPr>
+            <w:tcW w:type="dxa" w:w="2880"/>
+          </w:tcPr>
+          <w:p>
+            <w:r>
+              <w:t>Nigro (2020)</w:t>
+            </w:r>
+          </w:p>
+        </w:tc>
+        <w:tc>
+          <w:tcPr>
+            <w:tcW w:type="dxa" w:w="2880"/>
+          </w:tcPr>
+          <w:p>
+            <w:r>
+              <w:t>F1 race predictor</w:t>
+            </w:r>
+          </w:p>
+        </w:tc>
+        <w:tc>
+          <w:tcPr>
+            <w:tcW w:type="dxa" w:w="2880"/>
+          </w:tcPr>
+          <w:p>
+            <w:r>
+              <w:t>Shows practical race prediction using historical F1 data</w:t>
+            </w:r>
+          </w:p>
+        </w:tc>
+      </w:tr>
+      <w:tr>
+        <w:tc>
+          <w:tcPr>
+            <w:tcW w:type="dxa" w:w="2880"/>
+          </w:tcPr>
+          <w:p>
+            <w:r>
+              <w:t>Zhao (2024)</w:t>
+            </w:r>
+          </w:p>
+        </w:tc>
+        <w:tc>
+          <w:tcPr>
+            <w:tcW w:type="dxa" w:w="2880"/>
+          </w:tcPr>
+          <w:p>
+            <w:r>
+              <w:t>Deep neural network lap-time forecasting</w:t>
+            </w:r>
+          </w:p>
+        </w:tc>
+        <w:tc>
+          <w:tcPr>
+            <w:tcW w:type="dxa" w:w="2880"/>
+          </w:tcPr>
+          <w:p>
+            <w:r>
+              <w:t>Shows neural networks can model F1 performance signals</w:t>
+            </w:r>
+          </w:p>
+        </w:tc>
+      </w:tr>
+      <w:tr>
+        <w:tc>
+          <w:tcPr>
+            <w:tcW w:type="dxa" w:w="2880"/>
+          </w:tcPr>
+          <w:p>
+            <w:r>
+              <w:t>Jafri (2024)</w:t>
+            </w:r>
+          </w:p>
+        </w:tc>
+        <w:tc>
+          <w:tcPr>
+            <w:tcW w:type="dxa" w:w="2880"/>
+          </w:tcPr>
+          <w:p>
+            <w:r>
+              <w:t>F1 race outcome prediction</w:t>
+            </w:r>
+          </w:p>
+        </w:tc>
+        <w:tc>
+          <w:tcPr>
+            <w:tcW w:type="dxa" w:w="2880"/>
+          </w:tcPr>
+          <w:p>
+            <w:r>
+              <w:t>Uses historical race data for race prediction</w:t>
+            </w:r>
+          </w:p>
+        </w:tc>
+      </w:tr>
+      <w:tr>
+        <w:tc>
+          <w:tcPr>
+            <w:tcW w:type="dxa" w:w="2880"/>
+          </w:tcPr>
+          <w:p>
+            <w:r>
+              <w:t>Noe and Patel (2024)</w:t>
+            </w:r>
+          </w:p>
+        </w:tc>
+        <w:tc>
+          <w:tcPr>
+            <w:tcW w:type="dxa" w:w="2880"/>
+          </w:tcPr>
+          <w:p>
+            <w:r>
+              <w:t>Telemetry-based lap prediction</w:t>
+            </w:r>
+          </w:p>
+        </w:tc>
+        <w:tc>
+          <w:tcPr>
+            <w:tcW w:type="dxa" w:w="2880"/>
+          </w:tcPr>
+          <w:p>
+            <w:r>
+              <w:t>Motivates lap and performance features</w:t>
+            </w:r>
+          </w:p>
+        </w:tc>
+      </w:tr>
+      <w:tr>
+        <w:tc>
+          <w:tcPr>
+            <w:tcW w:type="dxa" w:w="2880"/>
+          </w:tcPr>
+          <w:p>
+            <w:r>
+              <w:t>Cappello and Hoegh (2026)</w:t>
+            </w:r>
+          </w:p>
+        </w:tc>
+        <w:tc>
+          <w:tcPr>
+            <w:tcW w:type="dxa" w:w="2880"/>
+          </w:tcPr>
+          <w:p>
+            <w:r>
+              <w:t>Tire degradation modelling</w:t>
+            </w:r>
+          </w:p>
+        </w:tc>
+        <w:tc>
+          <w:tcPr>
+            <w:tcW w:type="dxa" w:w="2880"/>
+          </w:tcPr>
+          <w:p>
+            <w:r>
+              <w:t>Supports the value of tire and strategy variables</w:t>
+            </w:r>
+          </w:p>
+        </w:tc>
+      </w:tr>
+      <w:tr>
+        <w:tc>
+          <w:tcPr>
+            <w:tcW w:type="dxa" w:w="2880"/>
+          </w:tcPr>
+          <w:p>
+            <w:r>
+              <w:t>race-outcome decomposition work (2025)</w:t>
+            </w:r>
+          </w:p>
+        </w:tc>
+        <w:tc>
+          <w:tcPr>
+            <w:tcW w:type="dxa" w:w="2880"/>
+          </w:tcPr>
+          <w:p>
+            <w:r>
+              <w:t>Driver vs constructor effects</w:t>
+            </w:r>
+          </w:p>
+        </w:tc>
+        <w:tc>
+          <w:tcPr>
+            <w:tcW w:type="dxa" w:w="2880"/>
+          </w:tcPr>
+          <w:p>
+            <w:r>
+              <w:t>Motivates separating driver and constructor strength</w:t>
+            </w:r>
+          </w:p>
+        </w:tc>
+      </w:tr>
+      <w:tr>
+        <w:tc>
+          <w:tcPr>
+            <w:tcW w:type="dxa" w:w="2880"/>
+          </w:tcPr>
+          <w:p>
+            <w:r>
+              <w:t>Jolpica F1 API</w:t>
+            </w:r>
+          </w:p>
+        </w:tc>
+        <w:tc>
+          <w:tcPr>
+            <w:tcW w:type="dxa" w:w="2880"/>
+          </w:tcPr>
+          <w:p>
+            <w:r>
+              <w:t>Ergast-compatible data source</w:t>
+            </w:r>
+          </w:p>
+        </w:tc>
+        <w:tc>
+          <w:tcPr>
+            <w:tcW w:type="dxa" w:w="2880"/>
+          </w:tcPr>
+          <w:p>
+            <w:r>
+              <w:t>Provides race, qualifying, standings and pit-stop data</w:t>
+            </w:r>
+          </w:p>
+        </w:tc>
+      </w:tr>
+      <w:tr>
+        <w:tc>
+          <w:tcPr>
+            <w:tcW w:type="dxa" w:w="2880"/>
+          </w:tcPr>
+          <w:p>
+            <w:r>
+              <w:t>FastF1</w:t>
+            </w:r>
+          </w:p>
+        </w:tc>
+        <w:tc>
+          <w:tcPr>
+            <w:tcW w:type="dxa" w:w="2880"/>
+          </w:tcPr>
+          <w:p>
+            <w:r>
+              <w:t>Timing, lap and race-control data</w:t>
+            </w:r>
+          </w:p>
+        </w:tc>
+        <w:tc>
+          <w:tcPr>
+            <w:tcW w:type="dxa" w:w="2880"/>
+          </w:tcPr>
+          <w:p>
+            <w:r>
+              <w:t>Optional enrichment for recent seasons</w:t>
+            </w:r>
+          </w:p>
+        </w:tc>
+      </w:tr>
+      <w:tr>
+        <w:tc>
+          <w:tcPr>
+            <w:tcW w:type="dxa" w:w="2880"/>
+          </w:tcPr>
+          <w:p>
+            <w:r>
+              <w:t>Open-Meteo Archive</w:t>
+            </w:r>
+          </w:p>
+        </w:tc>
+        <w:tc>
+          <w:tcPr>
+            <w:tcW w:type="dxa" w:w="2880"/>
+          </w:tcPr>
+          <w:p>
+            <w:r>
+              <w:t>Historical weather</w:t>
+            </w:r>
+          </w:p>
+        </w:tc>
+        <w:tc>
+          <w:tcPr>
+            <w:tcW w:type="dxa" w:w="2880"/>
+          </w:tcPr>
+          <w:p>
+            <w:r>
+              <w:t>Adds race-day weather context</w:t>
+            </w:r>
+          </w:p>
+        </w:tc>
+      </w:tr>
+    </w:tbl>
+    <w:p>
+      <w:r>
+        <w:t>Compared with much of the related work, this project does not try to predict the race winner only. It predicts top-10 classification for every driver-race row, which creates a larger supervised dataset and aligns with the points-scoring structure of modern F1.</w:t>
+      </w:r>
+    </w:p>
+    <w:p>
+      <w:pPr>
+        <w:pStyle w:val="Heading2"/>
+      </w:pPr>
+      <w:r>
+        <w:t>Methods</w:t>
       </w:r>
     </w:p>
     <w:p>
       <w:r>
-        <w:t>feature families include:</w:t>
+        <w:t>The final dataset is data/final/f1_top10_model_dataset.csv. It contains 6,999 rows, 198 columns, 174 numeric/bool columns and 24 categorical/text columns. Each row represents one driver in one race. The label is top10_finish, equal to 1 when the final classified result is tenth place or better, and 0 otherwise.</w:t>
+      </w:r>
+    </w:p>
+    <w:p>
+      <w:r>
+        <w:t>The main software packages are:</w:t>
       </w:r>
     </w:p>
     <w:p>
@@ -150,7 +585,7 @@
         <w:pStyle w:val="ListBullet"/>
       </w:pPr>
       <w:r>
-        <w:t>qualifying position and qualifying gaps</w:t>
+        <w:t>pandas and numpy for data manipulation</w:t>
       </w:r>
     </w:p>
     <w:p>
@@ -158,7 +593,7 @@
         <w:pStyle w:val="ListBullet"/>
       </w:pPr>
       <w:r>
-        <w:t>driver and constructor standings before the race</w:t>
+        <w:t>scikit-learn for preprocessing, pipelines, model training and metrics</w:t>
       </w:r>
     </w:p>
     <w:p>
@@ -166,7 +601,7 @@
         <w:pStyle w:val="ListBullet"/>
       </w:pPr>
       <w:r>
-        <w:t>recent driver form over the previous 5 races</w:t>
+        <w:t>matplotlib and seaborn for EDA figures</w:t>
       </w:r>
     </w:p>
     <w:p>
@@ -174,7 +609,7 @@
         <w:pStyle w:val="ListBullet"/>
       </w:pPr>
       <w:r>
-        <w:t>reliability over previous races</w:t>
+        <w:t>joblib for model serialization</w:t>
       </w:r>
     </w:p>
     <w:p>
@@ -182,77 +617,12 @@
         <w:pStyle w:val="ListBullet"/>
       </w:pPr>
       <w:r>
-        <w:t>historical pit-stop performance</w:t>
-      </w:r>
-    </w:p>
-    <w:p>
-      <w:pPr>
-        <w:pStyle w:val="ListBullet"/>
-      </w:pPr>
-      <w:r>
-        <w:t>circuit characteristics</w:t>
-      </w:r>
-    </w:p>
-    <w:p>
-      <w:pPr>
-        <w:pStyle w:val="ListBullet"/>
-      </w:pPr>
-      <w:r>
-        <w:t>historical race-day weather</w:t>
-      </w:r>
-    </w:p>
-    <w:p>
-      <w:pPr>
-        <w:pStyle w:val="ListBullet"/>
-      </w:pPr>
-      <w:r>
-        <w:t>optional FastF1 rolling lap and strategy features</w:t>
-      </w:r>
-    </w:p>
-    <w:p>
-      <w:pPr>
-        <w:pStyle w:val="ListBullet"/>
-      </w:pPr>
-      <w:r>
-        <w:t>FastF1-derived pre-race circuit and season disruption history, such as safety</w:t>
+        <w:t>Plotly for optional neural-network visualization</w:t>
       </w:r>
     </w:p>
     <w:p>
       <w:r>
-        <w:t>car rate, red-flag rate and average disruption score</w:t>
-      </w:r>
-    </w:p>
-    <w:p>
-      <w:r>
-        <w:t>Post-race leakage columns such as final position, points, laps completed, race</w:t>
-      </w:r>
-    </w:p>
-    <w:p>
-      <w:r>
-        <w:t>status, fastest lap information and same-race race-control counts are kept for</w:t>
-      </w:r>
-    </w:p>
-    <w:p>
-      <w:r>
-        <w:t>analysis but excluded during top-10 training. Only historical race-control</w:t>
-      </w:r>
-    </w:p>
-    <w:p>
-      <w:r>
-        <w:t>aggregates from previous races are used as predictive features.</w:t>
-      </w:r>
-    </w:p>
-    <w:p>
-      <w:pPr>
-        <w:pStyle w:val="Heading2"/>
-      </w:pPr>
-      <w:r>
-        <w:t>Models</w:t>
-      </w:r>
-    </w:p>
-    <w:p>
-      <w:r>
-        <w:t>The project compares several machine learning algorithms:</w:t>
+        <w:t>The main models compared are:</w:t>
       </w:r>
     </w:p>
     <w:p>
@@ -268,7 +638,7 @@
         <w:pStyle w:val="ListBullet"/>
       </w:pPr>
       <w:r>
-        <w:t>random forest</w:t>
+        <w:t>random forest classifier</w:t>
       </w:r>
     </w:p>
     <w:p>
@@ -276,7 +646,7 @@
         <w:pStyle w:val="ListBullet"/>
       </w:pPr>
       <w:r>
-        <w:t>extra trees</w:t>
+        <w:t>extra trees classifier</w:t>
       </w:r>
     </w:p>
     <w:p>
@@ -284,7 +654,7 @@
         <w:pStyle w:val="ListBullet"/>
       </w:pPr>
       <w:r>
-        <w:t>histogram gradient boosting</w:t>
+        <w:t>histogram gradient boosting classifier</w:t>
       </w:r>
     </w:p>
     <w:p>
@@ -292,7 +662,30 @@
         <w:pStyle w:val="ListBullet"/>
       </w:pPr>
       <w:r>
-        <w:t>neural network MLP</w:t>
+        <w:t>multilayer perceptron classifier</w:t>
+      </w:r>
+    </w:p>
+    <w:p>
+      <w:r>
+        <w:t>The primary evaluation metrics are accuracy, precision, recall, F1, ROC-AUC and race precision@10. Race precision@10 is important because the practical output is a race-level top-10 list rather than only independent row-level labels.</w:t>
+      </w:r>
+    </w:p>
+    <w:p>
+      <w:pPr>
+        <w:pStyle w:val="Heading2"/>
+      </w:pPr>
+      <w:r>
+        <w:t>Dataset Preparation and EDA</w:t>
+      </w:r>
+    </w:p>
+    <w:p>
+      <w:r>
+        <w:t>The assignment requires one reasonably large dataset with categorical and numeric data. Although several public sources were used, they are merged into one final modelling dataset. The raw tables are retained for reproducibility, while the final CSV is the single dataset used for modelling.</w:t>
+      </w:r>
+    </w:p>
+    <w:p>
+      <w:r>
+        <w:t>Dataset summary:</w:t>
       </w:r>
     </w:p>
     <w:p>
@@ -300,22 +693,155 @@
         <w:pStyle w:val="ListBullet"/>
       </w:pPr>
       <w:r>
-        <w:t>finish-position regressors for predicted race order</w:t>
+        <w:t>rows: 6,999 driver-race observations</w:t>
+      </w:r>
+    </w:p>
+    <w:p>
+      <w:pPr>
+        <w:pStyle w:val="ListBullet"/>
+      </w:pPr>
+      <w:r>
+        <w:t>seasons: 2010 to 2026</w:t>
+      </w:r>
+    </w:p>
+    <w:p>
+      <w:pPr>
+        <w:pStyle w:val="ListBullet"/>
+      </w:pPr>
+      <w:r>
+        <w:t>target classes: 3,330 top-10 rows and 3,669 non-top-10 rows</w:t>
+      </w:r>
+    </w:p>
+    <w:p>
+      <w:pPr>
+        <w:pStyle w:val="ListBullet"/>
+      </w:pPr>
+      <w:r>
+        <w:t>missing values after preprocessing: 0</w:t>
+      </w:r>
+    </w:p>
+    <w:p>
+      <w:pPr>
+        <w:pStyle w:val="ListBullet"/>
+      </w:pPr>
+      <w:r>
+        <w:t>weather coverage: 333/333 local race-result events</w:t>
+      </w:r>
+    </w:p>
+    <w:p>
+      <w:pPr>
+        <w:pStyle w:val="ListBullet"/>
+      </w:pPr>
+      <w:r>
+        <w:t>2026 coverage on 2026-05-05: 4 completed races and 4 qualifying sessions locally available</w:t>
       </w:r>
     </w:p>
     <w:p>
       <w:r>
-        <w:t>The neural network is included as a baseline, but the dataset is still tabular</w:t>
+        <w:t>The dataset is not perfectly clean in its original form. Race APIs use different identifiers, some historical pit-stop data is unavailable before 2011, FastF1 timing coverage is partial, and weather data is an external historical approximation rather than exact FIA sensor data. The preprocessing pipeline handles these issues by using availability flags, deterministic fallbacks, imputation and careful feature merging.</w:t>
       </w:r>
     </w:p>
     <w:p>
       <w:r>
-        <w:t>and relatively small. In this context, tree-based methods remain strong and</w:t>
+        <w:t>Key EDA observations:</w:t>
+      </w:r>
+    </w:p>
+    <w:p>
+      <w:pPr>
+        <w:pStyle w:val="ListBullet"/>
+      </w:pPr>
+      <w:r>
+        <w:t>The target is reasonably balanced for a binary classification task: about 48% top-10 rows and 52% non-top-10 rows.</w:t>
+      </w:r>
+    </w:p>
+    <w:p>
+      <w:pPr>
+        <w:pStyle w:val="ListBullet"/>
+      </w:pPr>
+      <w:r>
+        <w:t>Rows per season vary because the number of races and drivers changes over time.</w:t>
+      </w:r>
+    </w:p>
+    <w:p>
+      <w:pPr>
+        <w:pStyle w:val="ListBullet"/>
+      </w:pPr>
+      <w:r>
+        <w:t>Qualifying/grid position is strongly related to finishing position, but it is not enough alone because reliability, circuit, weather and team performance can change the outcome.</w:t>
+      </w:r>
+    </w:p>
+    <w:p>
+      <w:pPr>
+        <w:pStyle w:val="ListBullet"/>
+      </w:pPr>
+      <w:r>
+        <w:t>Categorical fields such as driver, constructor, circuit and weather condition require encoding before model training.</w:t>
       </w:r>
     </w:p>
     <w:p>
       <w:r>
-        <w:t>more stable.</w:t>
+        <w:t>Preprocessing steps:</w:t>
+      </w:r>
+    </w:p>
+    <w:p>
+      <w:pPr>
+        <w:pStyle w:val="ListBullet"/>
+      </w:pPr>
+      <w:r>
+        <w:t>merge raw race, qualifying, standings, weather, circuit and optional FastF1 tables</w:t>
+      </w:r>
+    </w:p>
+    <w:p>
+      <w:pPr>
+        <w:pStyle w:val="ListBullet"/>
+      </w:pPr>
+      <w:r>
+        <w:t>create target variable `top10_finish`</w:t>
+      </w:r>
+    </w:p>
+    <w:p>
+      <w:pPr>
+        <w:pStyle w:val="ListBullet"/>
+      </w:pPr>
+      <w:r>
+        <w:t>remove or exclude post-race leakage features during training, such as final position, points, fastest lap and same-race race-control counts</w:t>
+      </w:r>
+    </w:p>
+    <w:p>
+      <w:pPr>
+        <w:pStyle w:val="ListBullet"/>
+      </w:pPr>
+      <w:r>
+        <w:t>impute numeric features with median values</w:t>
+      </w:r>
+    </w:p>
+    <w:p>
+      <w:pPr>
+        <w:pStyle w:val="ListBullet"/>
+      </w:pPr>
+      <w:r>
+        <w:t>impute categorical features with the most frequent value</w:t>
+      </w:r>
+    </w:p>
+    <w:p>
+      <w:pPr>
+        <w:pStyle w:val="ListBullet"/>
+      </w:pPr>
+      <w:r>
+        <w:t>one-hot encode categorical variables</w:t>
+      </w:r>
+    </w:p>
+    <w:p>
+      <w:pPr>
+        <w:pStyle w:val="ListBullet"/>
+      </w:pPr>
+      <w:r>
+        <w:t>scale numeric features for logistic regression and neural-network models</w:t>
+      </w:r>
+    </w:p>
+    <w:p>
+      <w:r>
+        <w:t>The generated figures in outputs/figures/ document target distribution, rows by season, top-10 rate by season, grid versus finish, model comparison, rolling backtest, feature importance and confusion matrix. These figures support the EDA and model validation sections.</w:t>
       </w:r>
     </w:p>
     <w:p>
@@ -323,479 +849,17 @@
         <w:pStyle w:val="Heading2"/>
       </w:pPr>
       <w:r>
-        <w:t>Dedicated Neural Network Tuning</w:t>
+        <w:t>Model Implementation</w:t>
       </w:r>
     </w:p>
     <w:p>
       <w:r>
-        <w:t>A separate neural-network tuning step compares several MLP configurations</w:t>
+        <w:t>The modelling workflow is script-driven and reproducible:</w:t>
       </w:r>
     </w:p>
     <w:p>
       <w:r>
-        <w:t>without replacing the main champion model. The best dedicated MLP configuration</w:t>
-      </w:r>
-    </w:p>
-    <w:p>
-      <w:r>
-        <w:t>uses two hidden layers:</w:t>
-      </w:r>
-    </w:p>
-    <w:p>
-      <w:pPr>
-        <w:pStyle w:val="ListBullet"/>
-      </w:pPr>
-      <w:r>
-        <w:t>hidden layers: 128 and 64 neurons</w:t>
-      </w:r>
-    </w:p>
-    <w:p>
-      <w:pPr>
-        <w:pStyle w:val="ListBullet"/>
-      </w:pPr>
-      <w:r>
-        <w:t>activation: ReLU</w:t>
-      </w:r>
-    </w:p>
-    <w:p>
-      <w:pPr>
-        <w:pStyle w:val="ListBullet"/>
-      </w:pPr>
-      <w:r>
-        <w:t>alpha: 0.002</w:t>
-      </w:r>
-    </w:p>
-    <w:p>
-      <w:pPr>
-        <w:pStyle w:val="ListBullet"/>
-      </w:pPr>
-      <w:r>
-        <w:t>learning rate: 0.0005</w:t>
-      </w:r>
-    </w:p>
-    <w:p>
-      <w:pPr>
-        <w:pStyle w:val="ListBullet"/>
-      </w:pPr>
-      <w:r>
-        <w:t>race precision@10: 0.771</w:t>
-      </w:r>
-    </w:p>
-    <w:p>
-      <w:r>
-        <w:t>This improves the neural-network branch compared with the default MLP baseline,</w:t>
-      </w:r>
-    </w:p>
-    <w:p>
-      <w:r>
-        <w:t>but tree-based models still remain more stable overall in the rolling</w:t>
-      </w:r>
-    </w:p>
-    <w:p>
-      <w:r>
-        <w:t>season-by-season backtest.</w:t>
-      </w:r>
-    </w:p>
-    <w:p>
-      <w:pPr>
-        <w:pStyle w:val="Heading2"/>
-      </w:pPr>
-      <w:r>
-        <w:t>Finish-Position Model</w:t>
-      </w:r>
-    </w:p>
-    <w:p>
-      <w:r>
-        <w:t>The project now includes a second modeling task: predicting the likely finishing</w:t>
-      </w:r>
-    </w:p>
-    <w:p>
-      <w:r>
-        <w:t>order. This is trained as a regression/ranking problem on final_position and</w:t>
-      </w:r>
-    </w:p>
-    <w:p>
-      <w:r>
-        <w:t>is used to add predicted_finish_rank to upcoming-race exports.</w:t>
-      </w:r>
-    </w:p>
-    <w:p>
-      <w:r>
-        <w:t>The best holdout finish-position model is a neural-network MLP regressor:</w:t>
-      </w:r>
-    </w:p>
-    <w:p>
-      <w:pPr>
-        <w:pStyle w:val="ListBullet"/>
-      </w:pPr>
-      <w:r>
-        <w:t>race precision@10: 0.779</w:t>
-      </w:r>
-    </w:p>
-    <w:p>
-      <w:pPr>
-        <w:pStyle w:val="ListBullet"/>
-      </w:pPr>
-      <w:r>
-        <w:t>raw position MAE: 3.20 positions</w:t>
-      </w:r>
-    </w:p>
-    <w:p>
-      <w:pPr>
-        <w:pStyle w:val="ListBullet"/>
-      </w:pPr>
-      <w:r>
-        <w:t>actual-top-10 rank MAE: 2.66 positions</w:t>
-      </w:r>
-    </w:p>
-    <w:p>
-      <w:pPr>
-        <w:pStyle w:val="ListBullet"/>
-      </w:pPr>
-      <w:r>
-        <w:t>mean race Spearman correlation: 0.660</w:t>
-      </w:r>
-    </w:p>
-    <w:p>
-      <w:r>
-        <w:t>This model complements the binary top-10 classifier. The classifier estimates</w:t>
-      </w:r>
-    </w:p>
-    <w:p>
-      <w:r>
-        <w:t>top-10 probability, while the position model gives an expected ordering among</w:t>
-      </w:r>
-    </w:p>
-    <w:p>
-      <w:r>
-        <w:t>the drivers.</w:t>
-      </w:r>
-    </w:p>
-    <w:p>
-      <w:pPr>
-        <w:pStyle w:val="Heading2"/>
-      </w:pPr>
-      <w:r>
-        <w:t>Validation Strategy</w:t>
-      </w:r>
-    </w:p>
-    <w:p>
-      <w:r>
-        <w:t>The project uses temporal validation instead of a random split. This better</w:t>
-      </w:r>
-    </w:p>
-    <w:p>
-      <w:r>
-        <w:t>matches the real use case because the model should learn from past seasons and</w:t>
-      </w:r>
-    </w:p>
-    <w:p>
-      <w:r>
-        <w:t>predict future races.</w:t>
-      </w:r>
-    </w:p>
-    <w:p>
-      <w:r>
-        <w:t>Two validation views are used:</w:t>
-      </w:r>
-    </w:p>
-    <w:p>
-      <w:pPr>
-        <w:pStyle w:val="ListBullet"/>
-      </w:pPr>
-      <w:r>
-        <w:t>a holdout season test</w:t>
-      </w:r>
-    </w:p>
-    <w:p>
-      <w:pPr>
-        <w:pStyle w:val="ListBullet"/>
-      </w:pPr>
-      <w:r>
-        <w:t>an expanding-window season-by-season backtest</w:t>
-      </w:r>
-    </w:p>
-    <w:p>
-      <w:r>
-        <w:t>The main race-level metric is race_precision_at_10, which checks how many of</w:t>
-      </w:r>
-    </w:p>
-    <w:p>
-      <w:r>
-        <w:t>the predicted top 10 drivers actually finished in the top 10 for each race.</w:t>
-      </w:r>
-    </w:p>
-    <w:p>
-      <w:pPr>
-        <w:pStyle w:val="Heading2"/>
-      </w:pPr>
-      <w:r>
-        <w:t>Current Results</w:t>
-      </w:r>
-    </w:p>
-    <w:p>
-      <w:r>
-        <w:t>Current holdout season: 2025.</w:t>
-      </w:r>
-    </w:p>
-    <w:p>
-      <w:r>
-        <w:t>The current best holdout model by race precision@10 is histogram gradient</w:t>
-      </w:r>
-    </w:p>
-    <w:p>
-      <w:r>
-        <w:t>boosting:</w:t>
-      </w:r>
-    </w:p>
-    <w:p>
-      <w:pPr>
-        <w:pStyle w:val="ListBullet"/>
-      </w:pPr>
-      <w:r>
-        <w:t>accuracy: 0.785</w:t>
-      </w:r>
-    </w:p>
-    <w:p>
-      <w:pPr>
-        <w:pStyle w:val="ListBullet"/>
-      </w:pPr>
-      <w:r>
-        <w:t>precision: 0.789</w:t>
-      </w:r>
-    </w:p>
-    <w:p>
-      <w:pPr>
-        <w:pStyle w:val="ListBullet"/>
-      </w:pPr>
-      <w:r>
-        <w:t>recall: 0.779</w:t>
-      </w:r>
-    </w:p>
-    <w:p>
-      <w:pPr>
-        <w:pStyle w:val="ListBullet"/>
-      </w:pPr>
-      <w:r>
-        <w:t>F1: 0.784</w:t>
-      </w:r>
-    </w:p>
-    <w:p>
-      <w:pPr>
-        <w:pStyle w:val="ListBullet"/>
-      </w:pPr>
-      <w:r>
-        <w:t>ROC-AUC: 0.831</w:t>
-      </w:r>
-    </w:p>
-    <w:p>
-      <w:pPr>
-        <w:pStyle w:val="ListBullet"/>
-      </w:pPr>
-      <w:r>
-        <w:t>race precision@10: 0.779</w:t>
-      </w:r>
-    </w:p>
-    <w:p>
-      <w:r>
-        <w:t>Across the rolling backtest, random forest remains the most stable model:</w:t>
-      </w:r>
-    </w:p>
-    <w:p>
-      <w:pPr>
-        <w:pStyle w:val="ListBullet"/>
-      </w:pPr>
-      <w:r>
-        <w:t>average accuracy: 0.777</w:t>
-      </w:r>
-    </w:p>
-    <w:p>
-      <w:pPr>
-        <w:pStyle w:val="ListBullet"/>
-      </w:pPr>
-      <w:r>
-        <w:t>average F1: 0.777</w:t>
-      </w:r>
-    </w:p>
-    <w:p>
-      <w:pPr>
-        <w:pStyle w:val="ListBullet"/>
-      </w:pPr>
-      <w:r>
-        <w:t>average ROC-AUC: 0.849</w:t>
-      </w:r>
-    </w:p>
-    <w:p>
-      <w:pPr>
-        <w:pStyle w:val="ListBullet"/>
-      </w:pPr>
-      <w:r>
-        <w:t>average race precision@10: 0.767</w:t>
-      </w:r>
-    </w:p>
-    <w:p>
-      <w:r>
-        <w:t>The dedicated tuned top-10 neural network reaches a 2025 holdout race</w:t>
-      </w:r>
-    </w:p>
-    <w:p>
-      <w:r>
-        <w:t>precision@10 of 0.771. It remains useful as a secondary model and for hidden</w:t>
-      </w:r>
-    </w:p>
-    <w:p>
-      <w:r>
-        <w:t>space visualization, while tree-based models remain the safer champion.</w:t>
-      </w:r>
-    </w:p>
-    <w:p>
-      <w:pPr>
-        <w:pStyle w:val="Heading2"/>
-      </w:pPr>
-      <w:r>
-        <w:t>Latest Data Coverage Check</w:t>
-      </w:r>
-    </w:p>
-    <w:p>
-      <w:r>
-        <w:t>The latest data audit on 2026-05-05 found:</w:t>
-      </w:r>
-    </w:p>
-    <w:p>
-      <w:pPr>
-        <w:pStyle w:val="ListBullet"/>
-      </w:pPr>
-      <w:r>
-        <w:t>22 scheduled races for the 2026 season</w:t>
-      </w:r>
-    </w:p>
-    <w:p>
-      <w:pPr>
-        <w:pStyle w:val="ListBullet"/>
-      </w:pPr>
-      <w:r>
-        <w:t>4 race-result rounds available in Jolpica and already present locally</w:t>
-      </w:r>
-    </w:p>
-    <w:p>
-      <w:pPr>
-        <w:pStyle w:val="ListBullet"/>
-      </w:pPr>
-      <w:r>
-        <w:t>4 qualifying rounds available in Jolpica and already present locally</w:t>
-      </w:r>
-    </w:p>
-    <w:p>
-      <w:pPr>
-        <w:pStyle w:val="ListBullet"/>
-      </w:pPr>
-      <w:r>
-        <w:t>Miami 2026 race results and pit stops were imported incrementally without</w:t>
-      </w:r>
-    </w:p>
-    <w:p>
-      <w:r>
-        <w:t>refetching older races</w:t>
-      </w:r>
-    </w:p>
-    <w:p>
-      <w:pPr>
-        <w:pStyle w:val="ListBullet"/>
-      </w:pPr>
-      <w:r>
-        <w:t>2010 was imported incrementally, adding 19 races and 456 supervised rows</w:t>
-      </w:r>
-    </w:p>
-    <w:p>
-      <w:pPr>
-        <w:pStyle w:val="ListBullet"/>
-      </w:pPr>
-      <w:r>
-        <w:t>Open-Meteo historical weather is available for all 333 local race-result</w:t>
-      </w:r>
-    </w:p>
-    <w:p>
-      <w:r>
-        <w:t>events</w:t>
-      </w:r>
-    </w:p>
-    <w:p>
-      <w:pPr>
-        <w:pStyle w:val="ListBullet"/>
-      </w:pPr>
-      <w:r>
-        <w:t>FastF1 currently has 177 race rows, with 100 fully available race-session</w:t>
-      </w:r>
-    </w:p>
-    <w:p>
-      <w:r>
-        <w:t>weather/lap rows and 77 unavailable rows due to timing API limits</w:t>
-      </w:r>
-    </w:p>
-    <w:p>
-      <w:pPr>
-        <w:pStyle w:val="ListBullet"/>
-      </w:pPr>
-      <w:r>
-        <w:t>FastF1 race-control messages are available for 167/177 attempted races; the</w:t>
-      </w:r>
-    </w:p>
-    <w:p>
-      <w:r>
-        <w:t>final 10 unavailable rows are caused by API rate limits</w:t>
-      </w:r>
-    </w:p>
-    <w:p>
-      <w:r>
-        <w:t>The final dataset was regenerated and all models were retrained after adding</w:t>
-      </w:r>
-    </w:p>
-    <w:p>
-      <w:r>
-        <w:t>2010, Miami results, historical weather and race-control history. Upcoming-race</w:t>
-      </w:r>
-    </w:p>
-    <w:p>
-      <w:r>
-        <w:t>predictions now start from Canada 2026 and include a finish-position ranking</w:t>
-      </w:r>
-    </w:p>
-    <w:p>
-      <w:r>
-        <w:t>model. A 3D Plotly visualization is included for the neural-network hidden</w:t>
-      </w:r>
-    </w:p>
-    <w:p>
-      <w:r>
-        <w:t>representation and KMeans clusters.</w:t>
-      </w:r>
-    </w:p>
-    <w:p>
-      <w:pPr>
-        <w:pStyle w:val="Heading2"/>
-      </w:pPr>
-      <w:r>
-        <w:t>How to Run</w:t>
-      </w:r>
-    </w:p>
-    <w:p>
-      <w:r>
-        <w:t>python scripts/run_pipeline.py</w:t>
-      </w:r>
-    </w:p>
-    <w:p>
-      <w:r>
-        <w:t>To run with optional FastF1 enrichment:</w:t>
-      </w:r>
-    </w:p>
-    <w:p>
-      <w:r>
-        <w:t>python scripts/run_pipeline.py --with-fastf1 --with-historical-weather --with-race-control</w:t>
-      </w:r>
-    </w:p>
-    <w:p>
-      <w:r>
-        <w:t>To compare all algorithms:</w:t>
+        <w:t>python scripts/generate_final_dataset.py</w:t>
       </w:r>
     </w:p>
     <w:p>
@@ -805,17 +869,7 @@
     </w:p>
     <w:p>
       <w:r>
-        <w:t>To export readable race predictions:</w:t>
-      </w:r>
-    </w:p>
-    <w:p>
-      <w:r>
-        <w:t>python scripts/predict_top10.py</w:t>
-      </w:r>
-    </w:p>
-    <w:p>
-      <w:r>
-        <w:t>To train and use the finish-position ranking model:</w:t>
+        <w:t>python scripts/train_model.py --model hist_gradient_boosting</w:t>
       </w:r>
     </w:p>
     <w:p>
@@ -825,17 +879,22 @@
     </w:p>
     <w:p>
       <w:r>
-        <w:t>python scripts/predict_upcoming_races.py --season 2026 --count 4 --current-date 2026-05-05 --position-model outputs/models/finish_position_regressor.joblib</w:t>
+        <w:t>python scripts/make_charts.py</w:t>
       </w:r>
     </w:p>
     <w:p>
       <w:r>
-        <w:t>To visualize the neural-network hidden space in 3D:</w:t>
+        <w:t>python scripts/validate_project.py</w:t>
       </w:r>
     </w:p>
     <w:p>
       <w:r>
-        <w:t>python scripts/visualize_neural_network_3d.py --color-by cluster</w:t>
+        <w:t>For the main classification task, the selected champion model is histogram gradient boosting. This model was selected because it achieved the best 2025 holdout race precision@10 and handles non-linear interactions in tabular data well. Random forest remains the most stable model in rolling backtest, so it is kept as an important comparison baseline.</w:t>
+      </w:r>
+    </w:p>
+    <w:p>
+      <w:r>
+        <w:t>Hyperparameter optimization is included through fixed, documented model configurations and a dedicated neural-network tuning script. The neural-network tuning compares multiple MLP architectures and learning rates. The best dedicated classifier MLP uses hidden layers of 128 and 64 neurons with ReLU activation, alpha 0.002 and learning rate 0.0005.</w:t>
       </w:r>
     </w:p>
     <w:p>
@@ -843,12 +902,391 @@
         <w:pStyle w:val="Heading2"/>
       </w:pPr>
       <w:r>
-        <w:t>Limitations</w:t>
+        <w:t>Model Validation</w:t>
       </w:r>
     </w:p>
     <w:p>
       <w:r>
-        <w:t>Some important racing factors are still approximate:</w:t>
+        <w:t>A temporal validation strategy is used instead of a random split. This is more realistic because a model should learn from past seasons and predict future races. The main holdout test season is 2025. An expanding-window rolling backtest is also used to compare stability across seasons.</w:t>
+      </w:r>
+    </w:p>
+    <w:p>
+      <w:r>
+        <w:t>Current holdout results on the 2025 season:</w:t>
+      </w:r>
+    </w:p>
+    <w:tbl>
+      <w:tblPr>
+        <w:tblStyle w:val="TableGrid"/>
+        <w:tblW w:type="auto" w:w="0"/>
+        <w:tblLook w:firstColumn="1" w:firstRow="1" w:lastColumn="0" w:lastRow="0" w:noHBand="0" w:noVBand="1" w:val="04A0"/>
+      </w:tblPr>
+      <w:tblGrid>
+        <w:gridCol w:w="1728"/>
+        <w:gridCol w:w="1728"/>
+        <w:gridCol w:w="1728"/>
+        <w:gridCol w:w="1728"/>
+        <w:gridCol w:w="1728"/>
+      </w:tblGrid>
+      <w:tr>
+        <w:tc>
+          <w:tcPr>
+            <w:tcW w:type="dxa" w:w="1728"/>
+          </w:tcPr>
+          <w:p>
+            <w:r>
+              <w:rPr>
+                <w:b/>
+              </w:rPr>
+              <w:t>Model</w:t>
+            </w:r>
+          </w:p>
+        </w:tc>
+        <w:tc>
+          <w:tcPr>
+            <w:tcW w:type="dxa" w:w="1728"/>
+          </w:tcPr>
+          <w:p>
+            <w:r>
+              <w:rPr>
+                <w:b/>
+              </w:rPr>
+              <w:t>Accuracy</w:t>
+            </w:r>
+          </w:p>
+        </w:tc>
+        <w:tc>
+          <w:tcPr>
+            <w:tcW w:type="dxa" w:w="1728"/>
+          </w:tcPr>
+          <w:p>
+            <w:r>
+              <w:rPr>
+                <w:b/>
+              </w:rPr>
+              <w:t>F1</w:t>
+            </w:r>
+          </w:p>
+        </w:tc>
+        <w:tc>
+          <w:tcPr>
+            <w:tcW w:type="dxa" w:w="1728"/>
+          </w:tcPr>
+          <w:p>
+            <w:r>
+              <w:rPr>
+                <w:b/>
+              </w:rPr>
+              <w:t>ROC-AUC</w:t>
+            </w:r>
+          </w:p>
+        </w:tc>
+        <w:tc>
+          <w:tcPr>
+            <w:tcW w:type="dxa" w:w="1728"/>
+          </w:tcPr>
+          <w:p>
+            <w:r>
+              <w:rPr>
+                <w:b/>
+              </w:rPr>
+              <w:t>Race precision@10</w:t>
+            </w:r>
+          </w:p>
+        </w:tc>
+      </w:tr>
+      <w:tr>
+        <w:tc>
+          <w:tcPr>
+            <w:tcW w:type="dxa" w:w="1728"/>
+          </w:tcPr>
+          <w:p>
+            <w:r>
+              <w:t>Histogram gradient boosting</w:t>
+            </w:r>
+          </w:p>
+        </w:tc>
+        <w:tc>
+          <w:tcPr>
+            <w:tcW w:type="dxa" w:w="1728"/>
+          </w:tcPr>
+          <w:p>
+            <w:r>
+              <w:t>0.785</w:t>
+            </w:r>
+          </w:p>
+        </w:tc>
+        <w:tc>
+          <w:tcPr>
+            <w:tcW w:type="dxa" w:w="1728"/>
+          </w:tcPr>
+          <w:p>
+            <w:r>
+              <w:t>0.784</w:t>
+            </w:r>
+          </w:p>
+        </w:tc>
+        <w:tc>
+          <w:tcPr>
+            <w:tcW w:type="dxa" w:w="1728"/>
+          </w:tcPr>
+          <w:p>
+            <w:r>
+              <w:t>0.831</w:t>
+            </w:r>
+          </w:p>
+        </w:tc>
+        <w:tc>
+          <w:tcPr>
+            <w:tcW w:type="dxa" w:w="1728"/>
+          </w:tcPr>
+          <w:p>
+            <w:r>
+              <w:t>0.779</w:t>
+            </w:r>
+          </w:p>
+        </w:tc>
+      </w:tr>
+      <w:tr>
+        <w:tc>
+          <w:tcPr>
+            <w:tcW w:type="dxa" w:w="1728"/>
+          </w:tcPr>
+          <w:p>
+            <w:r>
+              <w:t>Random forest</w:t>
+            </w:r>
+          </w:p>
+        </w:tc>
+        <w:tc>
+          <w:tcPr>
+            <w:tcW w:type="dxa" w:w="1728"/>
+          </w:tcPr>
+          <w:p>
+            <w:r>
+              <w:t>0.779</w:t>
+            </w:r>
+          </w:p>
+        </w:tc>
+        <w:tc>
+          <w:tcPr>
+            <w:tcW w:type="dxa" w:w="1728"/>
+          </w:tcPr>
+          <w:p>
+            <w:r>
+              <w:t>0.786</w:t>
+            </w:r>
+          </w:p>
+        </w:tc>
+        <w:tc>
+          <w:tcPr>
+            <w:tcW w:type="dxa" w:w="1728"/>
+          </w:tcPr>
+          <w:p>
+            <w:r>
+              <w:t>0.844</w:t>
+            </w:r>
+          </w:p>
+        </w:tc>
+        <w:tc>
+          <w:tcPr>
+            <w:tcW w:type="dxa" w:w="1728"/>
+          </w:tcPr>
+          <w:p>
+            <w:r>
+              <w:t>0.775</w:t>
+            </w:r>
+          </w:p>
+        </w:tc>
+      </w:tr>
+      <w:tr>
+        <w:tc>
+          <w:tcPr>
+            <w:tcW w:type="dxa" w:w="1728"/>
+          </w:tcPr>
+          <w:p>
+            <w:r>
+              <w:t>Neural network MLP</w:t>
+            </w:r>
+          </w:p>
+        </w:tc>
+        <w:tc>
+          <w:tcPr>
+            <w:tcW w:type="dxa" w:w="1728"/>
+          </w:tcPr>
+          <w:p>
+            <w:r>
+              <w:t>0.766</w:t>
+            </w:r>
+          </w:p>
+        </w:tc>
+        <w:tc>
+          <w:tcPr>
+            <w:tcW w:type="dxa" w:w="1728"/>
+          </w:tcPr>
+          <w:p>
+            <w:r>
+              <w:t>0.771</w:t>
+            </w:r>
+          </w:p>
+        </w:tc>
+        <w:tc>
+          <w:tcPr>
+            <w:tcW w:type="dxa" w:w="1728"/>
+          </w:tcPr>
+          <w:p>
+            <w:r>
+              <w:t>0.829</w:t>
+            </w:r>
+          </w:p>
+        </w:tc>
+        <w:tc>
+          <w:tcPr>
+            <w:tcW w:type="dxa" w:w="1728"/>
+          </w:tcPr>
+          <w:p>
+            <w:r>
+              <w:t>0.771</w:t>
+            </w:r>
+          </w:p>
+        </w:tc>
+      </w:tr>
+      <w:tr>
+        <w:tc>
+          <w:tcPr>
+            <w:tcW w:type="dxa" w:w="1728"/>
+          </w:tcPr>
+          <w:p>
+            <w:r>
+              <w:t>Extra trees</w:t>
+            </w:r>
+          </w:p>
+        </w:tc>
+        <w:tc>
+          <w:tcPr>
+            <w:tcW w:type="dxa" w:w="1728"/>
+          </w:tcPr>
+          <w:p>
+            <w:r>
+              <w:t>0.752</w:t>
+            </w:r>
+          </w:p>
+        </w:tc>
+        <w:tc>
+          <w:tcPr>
+            <w:tcW w:type="dxa" w:w="1728"/>
+          </w:tcPr>
+          <w:p>
+            <w:r>
+              <w:t>0.761</w:t>
+            </w:r>
+          </w:p>
+        </w:tc>
+        <w:tc>
+          <w:tcPr>
+            <w:tcW w:type="dxa" w:w="1728"/>
+          </w:tcPr>
+          <w:p>
+            <w:r>
+              <w:t>0.833</w:t>
+            </w:r>
+          </w:p>
+        </w:tc>
+        <w:tc>
+          <w:tcPr>
+            <w:tcW w:type="dxa" w:w="1728"/>
+          </w:tcPr>
+          <w:p>
+            <w:r>
+              <w:t>0.750</w:t>
+            </w:r>
+          </w:p>
+        </w:tc>
+      </w:tr>
+      <w:tr>
+        <w:tc>
+          <w:tcPr>
+            <w:tcW w:type="dxa" w:w="1728"/>
+          </w:tcPr>
+          <w:p>
+            <w:r>
+              <w:t>Logistic regression</w:t>
+            </w:r>
+          </w:p>
+        </w:tc>
+        <w:tc>
+          <w:tcPr>
+            <w:tcW w:type="dxa" w:w="1728"/>
+          </w:tcPr>
+          <w:p>
+            <w:r>
+              <w:t>0.743</w:t>
+            </w:r>
+          </w:p>
+        </w:tc>
+        <w:tc>
+          <w:tcPr>
+            <w:tcW w:type="dxa" w:w="1728"/>
+          </w:tcPr>
+          <w:p>
+            <w:r>
+              <w:t>0.698</w:t>
+            </w:r>
+          </w:p>
+        </w:tc>
+        <w:tc>
+          <w:tcPr>
+            <w:tcW w:type="dxa" w:w="1728"/>
+          </w:tcPr>
+          <w:p>
+            <w:r>
+              <w:t>0.811</w:t>
+            </w:r>
+          </w:p>
+        </w:tc>
+        <w:tc>
+          <w:tcPr>
+            <w:tcW w:type="dxa" w:w="1728"/>
+          </w:tcPr>
+          <w:p>
+            <w:r>
+              <w:t>0.746</w:t>
+            </w:r>
+          </w:p>
+        </w:tc>
+      </w:tr>
+    </w:tbl>
+    <w:p>
+      <w:r>
+        <w:t>Rolling backtest averages show that random forest is the most stable model by race precision@10, with an average of 0.767. Histogram gradient boosting is still selected as the holdout champion because it has the strongest latest-season top-10 performance.</w:t>
+      </w:r>
+    </w:p>
+    <w:p>
+      <w:pPr>
+        <w:pStyle w:val="Heading2"/>
+      </w:pPr>
+      <w:r>
+        <w:t>Analysis and Recommendations</w:t>
+      </w:r>
+    </w:p>
+    <w:p>
+      <w:r>
+        <w:t>The results are broadly in line with expectations. Tree-based models perform strongly because the dataset is tabular, mixed-type and feature-engineered. Logistic regression is useful as a simple baseline but is less able to capture non-linear interactions such as driver-team-circuit effects. The neural-network classifier is competitive but does not clearly beat tree ensembles on this dataset. This supports the decision to present the neural network as an extension rather than the primary assignment result.</w:t>
+      </w:r>
+    </w:p>
+    <w:p>
+      <w:r>
+        <w:t>Adding the 2010 season increased the dataset from 6,543 to 6,999 rows. The holdout accuracy and F1 improved for the champion classifier, while race precision@10 stayed at 0.779. This suggests that extra historical data helps general classification stability, but very old F1 seasons are not always directly representative of modern seasons.</w:t>
+      </w:r>
+    </w:p>
+    <w:p>
+      <w:r>
+        <w:t>The separate finish-position ranking model is useful for producing ordered race predictions. Its best current version is a neural-network MLP regressor with race precision@10 of 0.779 and mean race Spearman correlation of 0.660. This is helpful for interpretation, but it should remain secondary because the assignment asks mainly for predictive model comparison.</w:t>
+      </w:r>
+    </w:p>
+    <w:p>
+      <w:r>
+        <w:t>Recommended final model:</w:t>
       </w:r>
     </w:p>
     <w:p>
@@ -856,7 +1294,7 @@
         <w:pStyle w:val="ListBullet"/>
       </w:pPr>
       <w:r>
-        <w:t>race-control events and safety cars are not fully modeled</w:t>
+        <w:t>main assignment model: histogram gradient boosting classifier</w:t>
       </w:r>
     </w:p>
     <w:p>
@@ -864,7 +1302,7 @@
         <w:pStyle w:val="ListBullet"/>
       </w:pPr>
       <w:r>
-        <w:t>full telemetry is not used directly</w:t>
+        <w:t>supporting baseline: random forest classifier</w:t>
       </w:r>
     </w:p>
     <w:p>
@@ -872,7 +1310,12 @@
         <w:pStyle w:val="ListBullet"/>
       </w:pPr>
       <w:r>
-        <w:t>FastF1 enrichment is partial because the timing API is rate limited</w:t>
+        <w:t>optional extension: tuned MLP classifier and finish-position regressor</w:t>
+      </w:r>
+    </w:p>
+    <w:p>
+      <w:r>
+        <w:t>Recommended future improvements:</w:t>
       </w:r>
     </w:p>
     <w:p>
@@ -880,12 +1323,7 @@
         <w:pStyle w:val="ListBullet"/>
       </w:pPr>
       <w:r>
-        <w:t>Open-Meteo weather is historical race-day weather, not exact live race sensor</w:t>
-      </w:r>
-    </w:p>
-    <w:p>
-      <w:r>
-        <w:t>weather</w:t>
+        <w:t>add calibration plots for probability quality</w:t>
       </w:r>
     </w:p>
     <w:p>
@@ -893,22 +1331,107 @@
         <w:pStyle w:val="ListBullet"/>
       </w:pPr>
       <w:r>
-        <w:t>finish-position prediction is approximate and should be read as a ranked</w:t>
+        <w:t>add permutation importance for model interpretability</w:t>
+      </w:r>
+    </w:p>
+    <w:p>
+      <w:pPr>
+        <w:pStyle w:val="ListBullet"/>
+      </w:pPr>
+      <w:r>
+        <w:t>fill remaining FastF1 gaps after rate limits reset</w:t>
+      </w:r>
+    </w:p>
+    <w:p>
+      <w:pPr>
+        <w:pStyle w:val="ListBullet"/>
+      </w:pPr>
+      <w:r>
+        <w:t>test whether older seasons should be down-weighted because modern F1 regulations differ</w:t>
+      </w:r>
+    </w:p>
+    <w:p>
+      <w:pPr>
+        <w:pStyle w:val="ListBullet"/>
+      </w:pPr>
+      <w:r>
+        <w:t>improve the report with more domain-specific literature if more time is available</w:t>
+      </w:r>
+    </w:p>
+    <w:p>
+      <w:pPr>
+        <w:pStyle w:val="Heading2"/>
+      </w:pPr>
+      <w:r>
+        <w:t>Conclusion</w:t>
       </w:r>
     </w:p>
     <w:p>
       <w:r>
-        <w:t>expectation, not an exact finishing order</w:t>
+        <w:t>This project satisfies the core assignment requirement by building a machine learning solution on one reasonably large, mixed-type and non-trivial dataset. The work includes data collection, cleaning, feature engineering, EDA, preprocessing, multiple predictive models, tuning, validation and comparison. The strongest model for the main top-10 classification task is histogram gradient boosting, with 2025 holdout race precision@10 of 0.779. The project also shows that neural networks are interesting but not automatically superior for this tabular problem. The main weakness is that some racing signals, especially full telemetry and older pit-stop details, are incomplete in public data. Overall, the project is a solid V0 for the assignment, with neural-network and 3D visualization work best positioned as optional extensions.</w:t>
+      </w:r>
+    </w:p>
+    <w:p>
+      <w:pPr>
+        <w:pStyle w:val="Heading2"/>
+      </w:pPr>
+      <w:r>
+        <w:t>References</w:t>
       </w:r>
     </w:p>
     <w:p>
       <w:r>
-        <w:t>The next major improvement would be to expand FastF1 coverage and build</w:t>
+        <w:t>Breiman, L. (2001). Random forests. Machine Learning, 45, 5-32.</w:t>
       </w:r>
     </w:p>
     <w:p>
       <w:r>
-        <w:t>sequence-based features from lap-by-lap race evolution.</w:t>
+        <w:t>Cappello, C., &amp; Hoegh, A. (2026). A state-space approach to modeling tire degradation in Formula 1 racing. Journal of Quantitative Analysis in Sports.</w:t>
+      </w:r>
+    </w:p>
+    <w:p>
+      <w:r>
+        <w:t>FastF1. (2026). FastF1 documentation. https://docs.fastf1.dev/</w:t>
+      </w:r>
+    </w:p>
+    <w:p>
+      <w:r>
+        <w:t>Friedman, J. H. (2001). Greedy function approximation: A gradient boosting machine. Annals of Statistics, 29(5), 1189-1232.</w:t>
+      </w:r>
+    </w:p>
+    <w:p>
+      <w:r>
+        <w:t>Jafri, A. (2024). Predicting Formula 1 race outcomes: A machine learning approach. https://aliabdullahjafri.com/</w:t>
+      </w:r>
+    </w:p>
+    <w:p>
+      <w:r>
+        <w:t>Jolpica. (2026). Jolpica F1 API. https://github.com/jolpica/jolpica-f1</w:t>
+      </w:r>
+    </w:p>
+    <w:p>
+      <w:r>
+        <w:t>Nigro, V. (2020). Formula 1 race predictor: A machine learning approach. Towards Data Science.</w:t>
+      </w:r>
+    </w:p>
+    <w:p>
+      <w:r>
+        <w:t>Noe, C., &amp; Patel, N. (2024). Utilizing telemetry data for machine learning-driven lap prediction. University of Rochester.</w:t>
+      </w:r>
+    </w:p>
+    <w:p>
+      <w:r>
+        <w:t>Open-Meteo. (2026). Historical Weather API. https://open-meteo.com/</w:t>
+      </w:r>
+    </w:p>
+    <w:p>
+      <w:r>
+        <w:t>Pedregosa, F., Varoquaux, G., Gramfort, A., Michel, V., Thirion, B., Grisel, O., et al. (2011). Scikit-learn: Machine learning in Python. Journal of Machine Learning Research, 12, 2825-2830.</w:t>
+      </w:r>
+    </w:p>
+    <w:p>
+      <w:r>
+        <w:t>Zhao, Y. (2024). Deep neural network-based lap time forecasting of Formula 1 racing. Applied and Computational Engineering.</w:t>
       </w:r>
     </w:p>
     <w:p>
@@ -1661,6 +2184,10 @@
     <w:name w:val="Normal"/>
     <w:qFormat/>
     <w:rsid w:val="00FC693F"/>
+    <w:rPr>
+      <w:rFonts w:ascii="Arial" w:hAnsi="Arial"/>
+      <w:sz w:val="24"/>
+    </w:rPr>
   </w:style>
   <w:style w:type="paragraph" w:styleId="Header">
     <w:name w:val="header"/>

</xml_diff>

<commit_message>
Add PDF report and assignment figures
</commit_message>
<xml_diff>
--- a/report/Report.docx
+++ b/report/Report.docx
@@ -841,7 +841,7 @@
     </w:p>
     <w:p>
       <w:r>
-        <w:t>The generated figures in outputs/figures/ document target distribution, rows by season, top-10 rate by season, grid versus finish, model comparison, rolling backtest, feature importance and confusion matrix. These figures support the EDA and model validation sections.</w:t>
+        <w:t>The generated figures in outputs/figures/ document target distribution, rows by season, top-10 rate by season, grid versus finish, model comparison, rolling backtest, feature importance and confusion matrix. Additional assignment-facing PNGs summarize the full pipeline, holdout algorithm results, validation metric table and expanding-window stability. These figures support the EDA, model implementation and validation sections with labelled evidence.</w:t>
       </w:r>
     </w:p>
     <w:p>
@@ -880,6 +880,16 @@
     <w:p>
       <w:r>
         <w:t>python scripts/make_charts.py</w:t>
+      </w:r>
+    </w:p>
+    <w:p>
+      <w:r>
+        <w:t>python scripts/build_report_docx.py</w:t>
+      </w:r>
+    </w:p>
+    <w:p>
+      <w:r>
+        <w:t>python scripts/build_report_pdf.py</w:t>
       </w:r>
     </w:p>
     <w:p>
@@ -1315,6 +1325,43 @@
     </w:p>
     <w:p>
       <w:r>
+        <w:t>Generated report deliverables:</w:t>
+      </w:r>
+    </w:p>
+    <w:p>
+      <w:pPr>
+        <w:pStyle w:val="ListBullet"/>
+      </w:pPr>
+      <w:r>
+        <w:t>`report/Report.md`: editable report source</w:t>
+      </w:r>
+    </w:p>
+    <w:p>
+      <w:pPr>
+        <w:pStyle w:val="ListBullet"/>
+      </w:pPr>
+      <w:r>
+        <w:t>`report/Report.docx`: Word report version</w:t>
+      </w:r>
+    </w:p>
+    <w:p>
+      <w:pPr>
+        <w:pStyle w:val="ListBullet"/>
+      </w:pPr>
+      <w:r>
+        <w:t>`report/Report.pdf`: PDF report version generated from the same source</w:t>
+      </w:r>
+    </w:p>
+    <w:p>
+      <w:pPr>
+        <w:pStyle w:val="ListBullet"/>
+      </w:pPr>
+      <w:r>
+        <w:t>`outputs/figures/*.png`: labelled EDA, algorithm and validation figures used as report evidence</w:t>
+      </w:r>
+    </w:p>
+    <w:p>
+      <w:r>
         <w:t>Recommended future improvements:</w:t>
       </w:r>
     </w:p>
@@ -1444,7 +1491,48 @@
     </w:p>
     <w:p>
       <w:r>
-        <w:t>target_distribution.png</w:t>
+        <w:t>Figure 1. End-to-end project pipeline from raw data sources to validated assignment outputs.</w:t>
+      </w:r>
+    </w:p>
+    <w:p>
+      <w:r>
+        <w:drawing>
+          <wp:inline xmlns:a="http://schemas.openxmlformats.org/drawingml/2006/main" xmlns:pic="http://schemas.openxmlformats.org/drawingml/2006/picture">
+            <wp:extent cx="5303520" cy="1894114"/>
+            <wp:docPr id="1" name="Picture 1"/>
+            <wp:cNvGraphicFramePr>
+              <a:graphicFrameLocks noChangeAspect="1"/>
+            </wp:cNvGraphicFramePr>
+            <a:graphic>
+              <a:graphicData uri="http://schemas.openxmlformats.org/drawingml/2006/picture">
+                <pic:pic>
+                  <pic:nvPicPr>
+                    <pic:cNvPr id="0" name="assignment_pipeline_overview.png"/>
+                    <pic:cNvPicPr/>
+                  </pic:nvPicPr>
+                  <pic:blipFill>
+                    <a:blip r:embed="rId9"/>
+                    <a:stretch>
+                      <a:fillRect/>
+                    </a:stretch>
+                  </pic:blipFill>
+                  <pic:spPr>
+                    <a:xfrm>
+                      <a:off x="0" y="0"/>
+                      <a:ext cx="5303520" cy="1894114"/>
+                    </a:xfrm>
+                    <a:prstGeom prst="rect"/>
+                  </pic:spPr>
+                </pic:pic>
+              </a:graphicData>
+            </a:graphic>
+          </wp:inline>
+        </w:drawing>
+      </w:r>
+    </w:p>
+    <w:p>
+      <w:r>
+        <w:t>Figure 2. Target distribution for the binary top-10 classification task.</w:t>
       </w:r>
     </w:p>
     <w:p>
@@ -1452,7 +1540,7 @@
         <w:drawing>
           <wp:inline xmlns:a="http://schemas.openxmlformats.org/drawingml/2006/main" xmlns:pic="http://schemas.openxmlformats.org/drawingml/2006/picture">
             <wp:extent cx="5303520" cy="4242816"/>
-            <wp:docPr id="1" name="Picture 1"/>
+            <wp:docPr id="2" name="Picture 2"/>
             <wp:cNvGraphicFramePr>
               <a:graphicFrameLocks noChangeAspect="1"/>
             </wp:cNvGraphicFramePr>
@@ -1464,7 +1552,7 @@
                     <pic:cNvPicPr/>
                   </pic:nvPicPr>
                   <pic:blipFill>
-                    <a:blip r:embed="rId9"/>
+                    <a:blip r:embed="rId10"/>
                     <a:stretch>
                       <a:fillRect/>
                     </a:stretch>
@@ -1485,48 +1573,7 @@
     </w:p>
     <w:p>
       <w:r>
-        <w:t>rows_by_season.png</w:t>
-      </w:r>
-    </w:p>
-    <w:p>
-      <w:r>
-        <w:drawing>
-          <wp:inline xmlns:a="http://schemas.openxmlformats.org/drawingml/2006/main" xmlns:pic="http://schemas.openxmlformats.org/drawingml/2006/picture">
-            <wp:extent cx="5303520" cy="2121408"/>
-            <wp:docPr id="2" name="Picture 2"/>
-            <wp:cNvGraphicFramePr>
-              <a:graphicFrameLocks noChangeAspect="1"/>
-            </wp:cNvGraphicFramePr>
-            <a:graphic>
-              <a:graphicData uri="http://schemas.openxmlformats.org/drawingml/2006/picture">
-                <pic:pic>
-                  <pic:nvPicPr>
-                    <pic:cNvPr id="0" name="rows_by_season.png"/>
-                    <pic:cNvPicPr/>
-                  </pic:nvPicPr>
-                  <pic:blipFill>
-                    <a:blip r:embed="rId10"/>
-                    <a:stretch>
-                      <a:fillRect/>
-                    </a:stretch>
-                  </pic:blipFill>
-                  <pic:spPr>
-                    <a:xfrm>
-                      <a:off x="0" y="0"/>
-                      <a:ext cx="5303520" cy="2121408"/>
-                    </a:xfrm>
-                    <a:prstGeom prst="rect"/>
-                  </pic:spPr>
-                </pic:pic>
-              </a:graphicData>
-            </a:graphic>
-          </wp:inline>
-        </w:drawing>
-      </w:r>
-    </w:p>
-    <w:p>
-      <w:r>
-        <w:t>top10_rate_by_season.png</w:t>
+        <w:t>Figure 3. Number of driver-race rows available per season.</w:t>
       </w:r>
     </w:p>
     <w:p>
@@ -1542,7 +1589,7 @@
               <a:graphicData uri="http://schemas.openxmlformats.org/drawingml/2006/picture">
                 <pic:pic>
                   <pic:nvPicPr>
-                    <pic:cNvPr id="0" name="top10_rate_by_season.png"/>
+                    <pic:cNvPr id="0" name="rows_by_season.png"/>
                     <pic:cNvPicPr/>
                   </pic:nvPicPr>
                   <pic:blipFill>
@@ -1567,7 +1614,171 @@
     </w:p>
     <w:p>
       <w:r>
-        <w:t>model_comparison.png</w:t>
+        <w:t>Figure 4. Top-10 target rate by season, used to check class stability over time.</w:t>
+      </w:r>
+    </w:p>
+    <w:p>
+      <w:r>
+        <w:drawing>
+          <wp:inline xmlns:a="http://schemas.openxmlformats.org/drawingml/2006/main" xmlns:pic="http://schemas.openxmlformats.org/drawingml/2006/picture">
+            <wp:extent cx="5303520" cy="2121408"/>
+            <wp:docPr id="4" name="Picture 4"/>
+            <wp:cNvGraphicFramePr>
+              <a:graphicFrameLocks noChangeAspect="1"/>
+            </wp:cNvGraphicFramePr>
+            <a:graphic>
+              <a:graphicData uri="http://schemas.openxmlformats.org/drawingml/2006/picture">
+                <pic:pic>
+                  <pic:nvPicPr>
+                    <pic:cNvPr id="0" name="top10_rate_by_season.png"/>
+                    <pic:cNvPicPr/>
+                  </pic:nvPicPr>
+                  <pic:blipFill>
+                    <a:blip r:embed="rId12"/>
+                    <a:stretch>
+                      <a:fillRect/>
+                    </a:stretch>
+                  </pic:blipFill>
+                  <pic:spPr>
+                    <a:xfrm>
+                      <a:off x="0" y="0"/>
+                      <a:ext cx="5303520" cy="2121408"/>
+                    </a:xfrm>
+                    <a:prstGeom prst="rect"/>
+                  </pic:spPr>
+                </pic:pic>
+              </a:graphicData>
+            </a:graphic>
+          </wp:inline>
+        </w:drawing>
+      </w:r>
+    </w:p>
+    <w:p>
+      <w:r>
+        <w:t>Figure 5. Relationship between starting grid and final position.</w:t>
+      </w:r>
+    </w:p>
+    <w:p>
+      <w:r>
+        <w:drawing>
+          <wp:inline xmlns:a="http://schemas.openxmlformats.org/drawingml/2006/main" xmlns:pic="http://schemas.openxmlformats.org/drawingml/2006/picture">
+            <wp:extent cx="5303520" cy="4545874"/>
+            <wp:docPr id="5" name="Picture 5"/>
+            <wp:cNvGraphicFramePr>
+              <a:graphicFrameLocks noChangeAspect="1"/>
+            </wp:cNvGraphicFramePr>
+            <a:graphic>
+              <a:graphicData uri="http://schemas.openxmlformats.org/drawingml/2006/picture">
+                <pic:pic>
+                  <pic:nvPicPr>
+                    <pic:cNvPr id="0" name="grid_vs_finish.png"/>
+                    <pic:cNvPicPr/>
+                  </pic:nvPicPr>
+                  <pic:blipFill>
+                    <a:blip r:embed="rId13"/>
+                    <a:stretch>
+                      <a:fillRect/>
+                    </a:stretch>
+                  </pic:blipFill>
+                  <pic:spPr>
+                    <a:xfrm>
+                      <a:off x="0" y="0"/>
+                      <a:ext cx="5303520" cy="4545874"/>
+                    </a:xfrm>
+                    <a:prstGeom prst="rect"/>
+                  </pic:spPr>
+                </pic:pic>
+              </a:graphicData>
+            </a:graphic>
+          </wp:inline>
+        </w:drawing>
+      </w:r>
+    </w:p>
+    <w:p>
+      <w:r>
+        <w:t>Figure 6. Holdout comparison of the main classification algorithms on the 2025 season.</w:t>
+      </w:r>
+    </w:p>
+    <w:p>
+      <w:r>
+        <w:drawing>
+          <wp:inline xmlns:a="http://schemas.openxmlformats.org/drawingml/2006/main" xmlns:pic="http://schemas.openxmlformats.org/drawingml/2006/picture">
+            <wp:extent cx="5303520" cy="2243797"/>
+            <wp:docPr id="6" name="Picture 6"/>
+            <wp:cNvGraphicFramePr>
+              <a:graphicFrameLocks noChangeAspect="1"/>
+            </wp:cNvGraphicFramePr>
+            <a:graphic>
+              <a:graphicData uri="http://schemas.openxmlformats.org/drawingml/2006/picture">
+                <pic:pic>
+                  <pic:nvPicPr>
+                    <pic:cNvPr id="0" name="algorithm_holdout_summary.png"/>
+                    <pic:cNvPicPr/>
+                  </pic:nvPicPr>
+                  <pic:blipFill>
+                    <a:blip r:embed="rId14"/>
+                    <a:stretch>
+                      <a:fillRect/>
+                    </a:stretch>
+                  </pic:blipFill>
+                  <pic:spPr>
+                    <a:xfrm>
+                      <a:off x="0" y="0"/>
+                      <a:ext cx="5303520" cy="2243797"/>
+                    </a:xfrm>
+                    <a:prstGeom prst="rect"/>
+                  </pic:spPr>
+                </pic:pic>
+              </a:graphicData>
+            </a:graphic>
+          </wp:inline>
+        </w:drawing>
+      </w:r>
+    </w:p>
+    <w:p>
+      <w:r>
+        <w:t>Figure 7. Validation metric table for the compared classification algorithms.</w:t>
+      </w:r>
+    </w:p>
+    <w:p>
+      <w:r>
+        <w:drawing>
+          <wp:inline xmlns:a="http://schemas.openxmlformats.org/drawingml/2006/main" xmlns:pic="http://schemas.openxmlformats.org/drawingml/2006/picture">
+            <wp:extent cx="5303520" cy="1679448"/>
+            <wp:docPr id="7" name="Picture 7"/>
+            <wp:cNvGraphicFramePr>
+              <a:graphicFrameLocks noChangeAspect="1"/>
+            </wp:cNvGraphicFramePr>
+            <a:graphic>
+              <a:graphicData uri="http://schemas.openxmlformats.org/drawingml/2006/picture">
+                <pic:pic>
+                  <pic:nvPicPr>
+                    <pic:cNvPr id="0" name="model_metrics_table.png"/>
+                    <pic:cNvPicPr/>
+                  </pic:nvPicPr>
+                  <pic:blipFill>
+                    <a:blip r:embed="rId15"/>
+                    <a:stretch>
+                      <a:fillRect/>
+                    </a:stretch>
+                  </pic:blipFill>
+                  <pic:spPr>
+                    <a:xfrm>
+                      <a:off x="0" y="0"/>
+                      <a:ext cx="5303520" cy="1679448"/>
+                    </a:xfrm>
+                    <a:prstGeom prst="rect"/>
+                  </pic:spPr>
+                </pic:pic>
+              </a:graphicData>
+            </a:graphic>
+          </wp:inline>
+        </w:drawing>
+      </w:r>
+    </w:p>
+    <w:p>
+      <w:r>
+        <w:t>Figure 8. Compact model comparison across F1, ROC-AUC and race precision@10.</w:t>
       </w:r>
     </w:p>
     <w:p>
@@ -1575,7 +1786,7 @@
         <w:drawing>
           <wp:inline xmlns:a="http://schemas.openxmlformats.org/drawingml/2006/main" xmlns:pic="http://schemas.openxmlformats.org/drawingml/2006/picture">
             <wp:extent cx="5303520" cy="2651760"/>
-            <wp:docPr id="4" name="Picture 4"/>
+            <wp:docPr id="8" name="Picture 8"/>
             <wp:cNvGraphicFramePr>
               <a:graphicFrameLocks noChangeAspect="1"/>
             </wp:cNvGraphicFramePr>
@@ -1587,7 +1798,7 @@
                     <pic:cNvPicPr/>
                   </pic:nvPicPr>
                   <pic:blipFill>
-                    <a:blip r:embed="rId12"/>
+                    <a:blip r:embed="rId16"/>
                     <a:stretch>
                       <a:fillRect/>
                     </a:stretch>
@@ -1608,7 +1819,171 @@
     </w:p>
     <w:p>
       <w:r>
-        <w:t>neural_network_tuning.png</w:t>
+        <w:t>Figure 9. Expanding-window validation showing model stability across seasons.</w:t>
+      </w:r>
+    </w:p>
+    <w:p>
+      <w:r>
+        <w:drawing>
+          <wp:inline xmlns:a="http://schemas.openxmlformats.org/drawingml/2006/main" xmlns:pic="http://schemas.openxmlformats.org/drawingml/2006/picture">
+            <wp:extent cx="5303520" cy="2243797"/>
+            <wp:docPr id="9" name="Picture 9"/>
+            <wp:cNvGraphicFramePr>
+              <a:graphicFrameLocks noChangeAspect="1"/>
+            </wp:cNvGraphicFramePr>
+            <a:graphic>
+              <a:graphicData uri="http://schemas.openxmlformats.org/drawingml/2006/picture">
+                <pic:pic>
+                  <pic:nvPicPr>
+                    <pic:cNvPr id="0" name="algorithm_validation_summary.png"/>
+                    <pic:cNvPicPr/>
+                  </pic:nvPicPr>
+                  <pic:blipFill>
+                    <a:blip r:embed="rId17"/>
+                    <a:stretch>
+                      <a:fillRect/>
+                    </a:stretch>
+                  </pic:blipFill>
+                  <pic:spPr>
+                    <a:xfrm>
+                      <a:off x="0" y="0"/>
+                      <a:ext cx="5303520" cy="2243797"/>
+                    </a:xfrm>
+                    <a:prstGeom prst="rect"/>
+                  </pic:spPr>
+                </pic:pic>
+              </a:graphicData>
+            </a:graphic>
+          </wp:inline>
+        </w:drawing>
+      </w:r>
+    </w:p>
+    <w:p>
+      <w:r>
+        <w:t>Figure 10. Rolling backtest race precision@10 by model and test season.</w:t>
+      </w:r>
+    </w:p>
+    <w:p>
+      <w:r>
+        <w:drawing>
+          <wp:inline xmlns:a="http://schemas.openxmlformats.org/drawingml/2006/main" xmlns:pic="http://schemas.openxmlformats.org/drawingml/2006/picture">
+            <wp:extent cx="5303520" cy="2651760"/>
+            <wp:docPr id="10" name="Picture 10"/>
+            <wp:cNvGraphicFramePr>
+              <a:graphicFrameLocks noChangeAspect="1"/>
+            </wp:cNvGraphicFramePr>
+            <a:graphic>
+              <a:graphicData uri="http://schemas.openxmlformats.org/drawingml/2006/picture">
+                <pic:pic>
+                  <pic:nvPicPr>
+                    <pic:cNvPr id="0" name="rolling_backtest.png"/>
+                    <pic:cNvPicPr/>
+                  </pic:nvPicPr>
+                  <pic:blipFill>
+                    <a:blip r:embed="rId18"/>
+                    <a:stretch>
+                      <a:fillRect/>
+                    </a:stretch>
+                  </pic:blipFill>
+                  <pic:spPr>
+                    <a:xfrm>
+                      <a:off x="0" y="0"/>
+                      <a:ext cx="5303520" cy="2651760"/>
+                    </a:xfrm>
+                    <a:prstGeom prst="rect"/>
+                  </pic:spPr>
+                </pic:pic>
+              </a:graphicData>
+            </a:graphic>
+          </wp:inline>
+        </w:drawing>
+      </w:r>
+    </w:p>
+    <w:p>
+      <w:r>
+        <w:t>Figure 11. Most influential features for the selected top-10 classifier.</w:t>
+      </w:r>
+    </w:p>
+    <w:p>
+      <w:r>
+        <w:drawing>
+          <wp:inline xmlns:a="http://schemas.openxmlformats.org/drawingml/2006/main" xmlns:pic="http://schemas.openxmlformats.org/drawingml/2006/picture">
+            <wp:extent cx="5303520" cy="4124960"/>
+            <wp:docPr id="11" name="Picture 11"/>
+            <wp:cNvGraphicFramePr>
+              <a:graphicFrameLocks noChangeAspect="1"/>
+            </wp:cNvGraphicFramePr>
+            <a:graphic>
+              <a:graphicData uri="http://schemas.openxmlformats.org/drawingml/2006/picture">
+                <pic:pic>
+                  <pic:nvPicPr>
+                    <pic:cNvPr id="0" name="feature_importance.png"/>
+                    <pic:cNvPicPr/>
+                  </pic:nvPicPr>
+                  <pic:blipFill>
+                    <a:blip r:embed="rId19"/>
+                    <a:stretch>
+                      <a:fillRect/>
+                    </a:stretch>
+                  </pic:blipFill>
+                  <pic:spPr>
+                    <a:xfrm>
+                      <a:off x="0" y="0"/>
+                      <a:ext cx="5303520" cy="4124960"/>
+                    </a:xfrm>
+                    <a:prstGeom prst="rect"/>
+                  </pic:spPr>
+                </pic:pic>
+              </a:graphicData>
+            </a:graphic>
+          </wp:inline>
+        </w:drawing>
+      </w:r>
+    </w:p>
+    <w:p>
+      <w:r>
+        <w:t>Figure 12. Confusion matrix for the selected holdout classifier.</w:t>
+      </w:r>
+    </w:p>
+    <w:p>
+      <w:r>
+        <w:drawing>
+          <wp:inline xmlns:a="http://schemas.openxmlformats.org/drawingml/2006/main" xmlns:pic="http://schemas.openxmlformats.org/drawingml/2006/picture">
+            <wp:extent cx="5303520" cy="4242816"/>
+            <wp:docPr id="12" name="Picture 12"/>
+            <wp:cNvGraphicFramePr>
+              <a:graphicFrameLocks noChangeAspect="1"/>
+            </wp:cNvGraphicFramePr>
+            <a:graphic>
+              <a:graphicData uri="http://schemas.openxmlformats.org/drawingml/2006/picture">
+                <pic:pic>
+                  <pic:nvPicPr>
+                    <pic:cNvPr id="0" name="confusion_matrix.png"/>
+                    <pic:cNvPicPr/>
+                  </pic:nvPicPr>
+                  <pic:blipFill>
+                    <a:blip r:embed="rId20"/>
+                    <a:stretch>
+                      <a:fillRect/>
+                    </a:stretch>
+                  </pic:blipFill>
+                  <pic:spPr>
+                    <a:xfrm>
+                      <a:off x="0" y="0"/>
+                      <a:ext cx="5303520" cy="4242816"/>
+                    </a:xfrm>
+                    <a:prstGeom prst="rect"/>
+                  </pic:spPr>
+                </pic:pic>
+              </a:graphicData>
+            </a:graphic>
+          </wp:inline>
+        </w:drawing>
+      </w:r>
+    </w:p>
+    <w:p>
+      <w:r>
+        <w:t>Figure 13. Neural-network classifier tuning results, included as an extension.</w:t>
       </w:r>
     </w:p>
     <w:p>
@@ -1616,7 +1991,7 @@
         <w:drawing>
           <wp:inline xmlns:a="http://schemas.openxmlformats.org/drawingml/2006/main" xmlns:pic="http://schemas.openxmlformats.org/drawingml/2006/picture">
             <wp:extent cx="5303520" cy="2410691"/>
-            <wp:docPr id="5" name="Picture 5"/>
+            <wp:docPr id="13" name="Picture 13"/>
             <wp:cNvGraphicFramePr>
               <a:graphicFrameLocks noChangeAspect="1"/>
             </wp:cNvGraphicFramePr>
@@ -1628,7 +2003,7 @@
                     <pic:cNvPicPr/>
                   </pic:nvPicPr>
                   <pic:blipFill>
-                    <a:blip r:embed="rId13"/>
+                    <a:blip r:embed="rId21"/>
                     <a:stretch>
                       <a:fillRect/>
                     </a:stretch>
@@ -1649,7 +2024,7 @@
     </w:p>
     <w:p>
       <w:r>
-        <w:t>position_model_comparison.png</w:t>
+        <w:t>Figure 14. Finish-position ranking model comparison, included as an extension.</w:t>
       </w:r>
     </w:p>
     <w:p>
@@ -1657,7 +2032,7 @@
         <w:drawing>
           <wp:inline xmlns:a="http://schemas.openxmlformats.org/drawingml/2006/main" xmlns:pic="http://schemas.openxmlformats.org/drawingml/2006/picture">
             <wp:extent cx="5303520" cy="2651760"/>
-            <wp:docPr id="6" name="Picture 6"/>
+            <wp:docPr id="14" name="Picture 14"/>
             <wp:cNvGraphicFramePr>
               <a:graphicFrameLocks noChangeAspect="1"/>
             </wp:cNvGraphicFramePr>
@@ -1669,7 +2044,7 @@
                     <pic:cNvPicPr/>
                   </pic:nvPicPr>
                   <pic:blipFill>
-                    <a:blip r:embed="rId14"/>
+                    <a:blip r:embed="rId22"/>
                     <a:stretch>
                       <a:fillRect/>
                     </a:stretch>
@@ -1678,129 +2053,6 @@
                     <a:xfrm>
                       <a:off x="0" y="0"/>
                       <a:ext cx="5303520" cy="2651760"/>
-                    </a:xfrm>
-                    <a:prstGeom prst="rect"/>
-                  </pic:spPr>
-                </pic:pic>
-              </a:graphicData>
-            </a:graphic>
-          </wp:inline>
-        </w:drawing>
-      </w:r>
-    </w:p>
-    <w:p>
-      <w:r>
-        <w:t>rolling_backtest.png</w:t>
-      </w:r>
-    </w:p>
-    <w:p>
-      <w:r>
-        <w:drawing>
-          <wp:inline xmlns:a="http://schemas.openxmlformats.org/drawingml/2006/main" xmlns:pic="http://schemas.openxmlformats.org/drawingml/2006/picture">
-            <wp:extent cx="5303520" cy="2651760"/>
-            <wp:docPr id="7" name="Picture 7"/>
-            <wp:cNvGraphicFramePr>
-              <a:graphicFrameLocks noChangeAspect="1"/>
-            </wp:cNvGraphicFramePr>
-            <a:graphic>
-              <a:graphicData uri="http://schemas.openxmlformats.org/drawingml/2006/picture">
-                <pic:pic>
-                  <pic:nvPicPr>
-                    <pic:cNvPr id="0" name="rolling_backtest.png"/>
-                    <pic:cNvPicPr/>
-                  </pic:nvPicPr>
-                  <pic:blipFill>
-                    <a:blip r:embed="rId15"/>
-                    <a:stretch>
-                      <a:fillRect/>
-                    </a:stretch>
-                  </pic:blipFill>
-                  <pic:spPr>
-                    <a:xfrm>
-                      <a:off x="0" y="0"/>
-                      <a:ext cx="5303520" cy="2651760"/>
-                    </a:xfrm>
-                    <a:prstGeom prst="rect"/>
-                  </pic:spPr>
-                </pic:pic>
-              </a:graphicData>
-            </a:graphic>
-          </wp:inline>
-        </w:drawing>
-      </w:r>
-    </w:p>
-    <w:p>
-      <w:r>
-        <w:t>feature_importance.png</w:t>
-      </w:r>
-    </w:p>
-    <w:p>
-      <w:r>
-        <w:drawing>
-          <wp:inline xmlns:a="http://schemas.openxmlformats.org/drawingml/2006/main" xmlns:pic="http://schemas.openxmlformats.org/drawingml/2006/picture">
-            <wp:extent cx="5303520" cy="4124960"/>
-            <wp:docPr id="8" name="Picture 8"/>
-            <wp:cNvGraphicFramePr>
-              <a:graphicFrameLocks noChangeAspect="1"/>
-            </wp:cNvGraphicFramePr>
-            <a:graphic>
-              <a:graphicData uri="http://schemas.openxmlformats.org/drawingml/2006/picture">
-                <pic:pic>
-                  <pic:nvPicPr>
-                    <pic:cNvPr id="0" name="feature_importance.png"/>
-                    <pic:cNvPicPr/>
-                  </pic:nvPicPr>
-                  <pic:blipFill>
-                    <a:blip r:embed="rId16"/>
-                    <a:stretch>
-                      <a:fillRect/>
-                    </a:stretch>
-                  </pic:blipFill>
-                  <pic:spPr>
-                    <a:xfrm>
-                      <a:off x="0" y="0"/>
-                      <a:ext cx="5303520" cy="4124960"/>
-                    </a:xfrm>
-                    <a:prstGeom prst="rect"/>
-                  </pic:spPr>
-                </pic:pic>
-              </a:graphicData>
-            </a:graphic>
-          </wp:inline>
-        </w:drawing>
-      </w:r>
-    </w:p>
-    <w:p>
-      <w:r>
-        <w:t>confusion_matrix.png</w:t>
-      </w:r>
-    </w:p>
-    <w:p>
-      <w:r>
-        <w:drawing>
-          <wp:inline xmlns:a="http://schemas.openxmlformats.org/drawingml/2006/main" xmlns:pic="http://schemas.openxmlformats.org/drawingml/2006/picture">
-            <wp:extent cx="5303520" cy="4242816"/>
-            <wp:docPr id="9" name="Picture 9"/>
-            <wp:cNvGraphicFramePr>
-              <a:graphicFrameLocks noChangeAspect="1"/>
-            </wp:cNvGraphicFramePr>
-            <a:graphic>
-              <a:graphicData uri="http://schemas.openxmlformats.org/drawingml/2006/picture">
-                <pic:pic>
-                  <pic:nvPicPr>
-                    <pic:cNvPr id="0" name="confusion_matrix.png"/>
-                    <pic:cNvPicPr/>
-                  </pic:nvPicPr>
-                  <pic:blipFill>
-                    <a:blip r:embed="rId17"/>
-                    <a:stretch>
-                      <a:fillRect/>
-                    </a:stretch>
-                  </pic:blipFill>
-                  <pic:spPr>
-                    <a:xfrm>
-                      <a:off x="0" y="0"/>
-                      <a:ext cx="5303520" cy="4242816"/>
                     </a:xfrm>
                     <a:prstGeom prst="rect"/>
                   </pic:spPr>

</xml_diff>

<commit_message>
Add race prediction renders
</commit_message>
<xml_diff>
--- a/report/Report.docx
+++ b/report/Report.docx
@@ -328,6 +328,14 @@
       </w:pPr>
       <w:r>
         <w:t>Model Validation</w:t>
+      </w:r>
+    </w:p>
+    <w:p>
+      <w:pPr>
+        <w:pStyle w:val="ListNumber"/>
+      </w:pPr>
+      <w:r>
+        <w:t>Race-Level Prediction Renders</w:t>
       </w:r>
     </w:p>
     <w:p>
@@ -5173,6 +5181,305 @@
         <w:pStyle w:val="Heading2"/>
       </w:pPr>
       <w:r>
+        <w:t>Race-Level Prediction Renders</w:t>
+      </w:r>
+    </w:p>
+    <w:p>
+      <w:pPr>
+        <w:spacing w:line="276" w:lineRule="auto"/>
+      </w:pPr>
+      <w:r>
+        <w:t>To make the model outputs more concrete, an additional render script generates race-level prediction artifacts for the 2025 holdout season. These outputs do not replace the statistical validation, but they make the model behaviour easier to inspect race by race.</w:t>
+      </w:r>
+    </w:p>
+    <w:tbl>
+      <w:tblPr>
+        <w:tblStyle w:val="TableGrid"/>
+        <w:tblW w:type="auto" w:w="0"/>
+        <w:jc w:val="center"/>
+        <w:tblLook w:firstColumn="1" w:firstRow="1" w:lastColumn="0" w:lastRow="0" w:noHBand="0" w:noVBand="1" w:val="04A0"/>
+      </w:tblPr>
+      <w:tblGrid>
+        <w:gridCol w:w="5040"/>
+        <w:gridCol w:w="5040"/>
+      </w:tblGrid>
+      <w:tr>
+        <w:tc>
+          <w:tcPr>
+            <w:tcW w:type="dxa" w:w="5040"/>
+            <w:shd w:fill="123C43"/>
+          </w:tcPr>
+          <w:p>
+            <w:r/>
+            <w:r>
+              <w:rPr>
+                <w:rFonts w:ascii="Arial" w:hAnsi="Arial"/>
+                <w:b/>
+                <w:color w:val="FFFFFF"/>
+                <w:sz w:val="18"/>
+              </w:rPr>
+              <w:t>Output</w:t>
+            </w:r>
+          </w:p>
+        </w:tc>
+        <w:tc>
+          <w:tcPr>
+            <w:tcW w:type="dxa" w:w="5040"/>
+            <w:shd w:fill="123C43"/>
+          </w:tcPr>
+          <w:p>
+            <w:r/>
+            <w:r>
+              <w:rPr>
+                <w:rFonts w:ascii="Arial" w:hAnsi="Arial"/>
+                <w:b/>
+                <w:color w:val="FFFFFF"/>
+                <w:sz w:val="18"/>
+              </w:rPr>
+              <w:t>Purpose</w:t>
+            </w:r>
+          </w:p>
+        </w:tc>
+      </w:tr>
+      <w:tr>
+        <w:tc>
+          <w:tcPr>
+            <w:tcW w:type="dxa" w:w="5040"/>
+            <w:shd w:fill="EAF3F4"/>
+          </w:tcPr>
+          <w:p>
+            <w:r/>
+            <w:r>
+              <w:rPr>
+                <w:rFonts w:ascii="Arial" w:hAnsi="Arial"/>
+                <w:b w:val="0"/>
+                <w:sz w:val="18"/>
+              </w:rPr>
+              <w:t>outputs/predictions/race_model_renders/race_model_rankings_2025.csv</w:t>
+            </w:r>
+          </w:p>
+        </w:tc>
+        <w:tc>
+          <w:tcPr>
+            <w:tcW w:type="dxa" w:w="5040"/>
+            <w:shd w:fill="EAF3F4"/>
+          </w:tcPr>
+          <w:p>
+            <w:r/>
+            <w:r>
+              <w:rPr>
+                <w:rFonts w:ascii="Arial" w:hAnsi="Arial"/>
+                <w:b w:val="0"/>
+                <w:sz w:val="18"/>
+              </w:rPr>
+              <w:t>Full driver-level predicted ranking for each race and each model</w:t>
+            </w:r>
+          </w:p>
+        </w:tc>
+      </w:tr>
+      <w:tr>
+        <w:tc>
+          <w:tcPr>
+            <w:tcW w:type="dxa" w:w="5040"/>
+            <w:shd w:fill="F7F7F7"/>
+          </w:tcPr>
+          <w:p>
+            <w:r/>
+            <w:r>
+              <w:rPr>
+                <w:rFonts w:ascii="Arial" w:hAnsi="Arial"/>
+                <w:b w:val="0"/>
+                <w:sz w:val="18"/>
+              </w:rPr>
+              <w:t>outputs/predictions/race_model_renders/race_model_summary_2025.csv</w:t>
+            </w:r>
+          </w:p>
+        </w:tc>
+        <w:tc>
+          <w:tcPr>
+            <w:tcW w:type="dxa" w:w="5040"/>
+            <w:shd w:fill="F7F7F7"/>
+          </w:tcPr>
+          <w:p>
+            <w:r/>
+            <w:r>
+              <w:rPr>
+                <w:rFonts w:ascii="Arial" w:hAnsi="Arial"/>
+                <w:b w:val="0"/>
+                <w:sz w:val="18"/>
+              </w:rPr>
+              <w:t>Race-level summary with top-10 hits, actual points captured, podium hits and heuristic explanations</w:t>
+            </w:r>
+          </w:p>
+        </w:tc>
+      </w:tr>
+      <w:tr>
+        <w:tc>
+          <w:tcPr>
+            <w:tcW w:type="dxa" w:w="5040"/>
+            <w:shd w:fill="EAF3F4"/>
+          </w:tcPr>
+          <w:p>
+            <w:r/>
+            <w:r>
+              <w:rPr>
+                <w:rFonts w:ascii="Arial" w:hAnsi="Arial"/>
+                <w:b w:val="0"/>
+                <w:sz w:val="18"/>
+              </w:rPr>
+              <w:t>outputs/figures/predictions/model_precision_by_race.png</w:t>
+            </w:r>
+          </w:p>
+        </w:tc>
+        <w:tc>
+          <w:tcPr>
+            <w:tcW w:type="dxa" w:w="5040"/>
+            <w:shd w:fill="EAF3F4"/>
+          </w:tcPr>
+          <w:p>
+            <w:r/>
+            <w:r>
+              <w:rPr>
+                <w:rFonts w:ascii="Arial" w:hAnsi="Arial"/>
+                <w:b w:val="0"/>
+                <w:sz w:val="18"/>
+              </w:rPr>
+              <w:t>Line chart showing correct top-10 hits per model and race</w:t>
+            </w:r>
+          </w:p>
+        </w:tc>
+      </w:tr>
+      <w:tr>
+        <w:tc>
+          <w:tcPr>
+            <w:tcW w:type="dxa" w:w="5040"/>
+            <w:shd w:fill="F7F7F7"/>
+          </w:tcPr>
+          <w:p>
+            <w:r/>
+            <w:r>
+              <w:rPr>
+                <w:rFonts w:ascii="Arial" w:hAnsi="Arial"/>
+                <w:b w:val="0"/>
+                <w:sz w:val="18"/>
+              </w:rPr>
+              <w:t>outputs/figures/predictions/model_hit_heatmap.png</w:t>
+            </w:r>
+          </w:p>
+        </w:tc>
+        <w:tc>
+          <w:tcPr>
+            <w:tcW w:type="dxa" w:w="5040"/>
+            <w:shd w:fill="F7F7F7"/>
+          </w:tcPr>
+          <w:p>
+            <w:r/>
+            <w:r>
+              <w:rPr>
+                <w:rFonts w:ascii="Arial" w:hAnsi="Arial"/>
+                <w:b w:val="0"/>
+                <w:sz w:val="18"/>
+              </w:rPr>
+              <w:t>Heatmap comparing top-10 hits by race and model</w:t>
+            </w:r>
+          </w:p>
+        </w:tc>
+      </w:tr>
+      <w:tr>
+        <w:tc>
+          <w:tcPr>
+            <w:tcW w:type="dxa" w:w="5040"/>
+            <w:shd w:fill="EAF3F4"/>
+          </w:tcPr>
+          <w:p>
+            <w:r/>
+            <w:r>
+              <w:rPr>
+                <w:rFonts w:ascii="Arial" w:hAnsi="Arial"/>
+                <w:b w:val="0"/>
+                <w:sz w:val="18"/>
+              </w:rPr>
+              <w:t>outputs/figures/predictions/model_points_captured.png</w:t>
+            </w:r>
+          </w:p>
+        </w:tc>
+        <w:tc>
+          <w:tcPr>
+            <w:tcW w:type="dxa" w:w="5040"/>
+            <w:shd w:fill="EAF3F4"/>
+          </w:tcPr>
+          <w:p>
+            <w:r/>
+            <w:r>
+              <w:rPr>
+                <w:rFonts w:ascii="Arial" w:hAnsi="Arial"/>
+                <w:b w:val="0"/>
+                <w:sz w:val="18"/>
+              </w:rPr>
+              <w:t>Average actual points captured by each model's predicted top 10</w:t>
+            </w:r>
+          </w:p>
+        </w:tc>
+      </w:tr>
+      <w:tr>
+        <w:tc>
+          <w:tcPr>
+            <w:tcW w:type="dxa" w:w="5040"/>
+            <w:shd w:fill="F7F7F7"/>
+          </w:tcPr>
+          <w:p>
+            <w:r/>
+            <w:r>
+              <w:rPr>
+                <w:rFonts w:ascii="Arial" w:hAnsi="Arial"/>
+                <w:b w:val="0"/>
+                <w:sz w:val="18"/>
+              </w:rPr>
+              <w:t>outputs/figures/predictions/race_cards/*.png</w:t>
+            </w:r>
+          </w:p>
+        </w:tc>
+        <w:tc>
+          <w:tcPr>
+            <w:tcW w:type="dxa" w:w="5040"/>
+            <w:shd w:fill="F7F7F7"/>
+          </w:tcPr>
+          <w:p>
+            <w:r/>
+            <w:r>
+              <w:rPr>
+                <w:rFonts w:ascii="Arial" w:hAnsi="Arial"/>
+                <w:b w:val="0"/>
+                <w:sz w:val="18"/>
+              </w:rPr>
+              <w:t>Visual race cards with actual podium, virtual podiums and predicted top 10 lists</w:t>
+            </w:r>
+          </w:p>
+        </w:tc>
+      </w:tr>
+    </w:tbl>
+    <w:p/>
+    <w:p>
+      <w:pPr>
+        <w:spacing w:line="276" w:lineRule="auto"/>
+      </w:pPr>
+      <w:r>
+        <w:t>The race cards show each model's virtual podium and predicted top 10 for a completed race. Green rows indicate drivers who actually finished in the real top 10, while red rows indicate predicted top-10 drivers who missed the real top 10. The points shown are actual race points earned after the race. Driver headshots are retrieved through OpenF1's headshot_url metadata when available; if a photo cannot be retrieved, the render falls back to a clean initials-based placeholder.</w:t>
+      </w:r>
+    </w:p>
+    <w:p>
+      <w:pPr>
+        <w:spacing w:line="276" w:lineRule="auto"/>
+      </w:pPr>
+      <w:r>
+        <w:t>These visual outputs are useful for explaining why one model performed better on a specific race. For example, a model may win a race-level comparison because it captured more midfield drivers who finished in the points, avoided overrating front-grid drivers who later dropped out, or produced a virtual podium closer to the real podium.</w:t>
+      </w:r>
+    </w:p>
+    <w:p>
+      <w:pPr>
+        <w:pStyle w:val="Heading2"/>
+      </w:pPr>
+      <w:r>
         <w:t>Analysis and Recommendations</w:t>
       </w:r>
     </w:p>
@@ -6179,6 +6486,202 @@
         </w:drawing>
       </w:r>
     </w:p>
+    <w:p>
+      <w:pPr>
+        <w:jc w:val="center"/>
+      </w:pPr>
+      <w:r>
+        <w:rPr>
+          <w:i/>
+          <w:color w:val="333333"/>
+          <w:sz w:val="18"/>
+        </w:rPr>
+        <w:t>Figure 15. Correct predicted top-10 drivers per race and model on the 2025 holdout season.</w:t>
+      </w:r>
+    </w:p>
+    <w:p>
+      <w:r>
+        <w:drawing>
+          <wp:inline xmlns:a="http://schemas.openxmlformats.org/drawingml/2006/main" xmlns:pic="http://schemas.openxmlformats.org/drawingml/2006/picture">
+            <wp:extent cx="5669280" cy="2429691"/>
+            <wp:docPr id="15" name="Picture 15"/>
+            <wp:cNvGraphicFramePr>
+              <a:graphicFrameLocks noChangeAspect="1"/>
+            </wp:cNvGraphicFramePr>
+            <a:graphic>
+              <a:graphicData uri="http://schemas.openxmlformats.org/drawingml/2006/picture">
+                <pic:pic>
+                  <pic:nvPicPr>
+                    <pic:cNvPr id="0" name="model_precision_by_race.png"/>
+                    <pic:cNvPicPr/>
+                  </pic:nvPicPr>
+                  <pic:blipFill>
+                    <a:blip r:embed="rId24"/>
+                    <a:stretch>
+                      <a:fillRect/>
+                    </a:stretch>
+                  </pic:blipFill>
+                  <pic:spPr>
+                    <a:xfrm>
+                      <a:off x="0" y="0"/>
+                      <a:ext cx="5669280" cy="2429691"/>
+                    </a:xfrm>
+                    <a:prstGeom prst="rect"/>
+                  </pic:spPr>
+                </pic:pic>
+              </a:graphicData>
+            </a:graphic>
+          </wp:inline>
+        </w:drawing>
+      </w:r>
+    </w:p>
+    <w:p>
+      <w:pPr>
+        <w:jc w:val="center"/>
+      </w:pPr>
+      <w:r>
+        <w:rPr>
+          <w:i/>
+          <w:color w:val="333333"/>
+          <w:sz w:val="18"/>
+        </w:rPr>
+        <w:t>Figure 16. Race-level heatmap of top-10 hits by model.</w:t>
+      </w:r>
+    </w:p>
+    <w:p>
+      <w:r>
+        <w:drawing>
+          <wp:inline xmlns:a="http://schemas.openxmlformats.org/drawingml/2006/main" xmlns:pic="http://schemas.openxmlformats.org/drawingml/2006/picture">
+            <wp:extent cx="5669280" cy="5153891"/>
+            <wp:docPr id="16" name="Picture 16"/>
+            <wp:cNvGraphicFramePr>
+              <a:graphicFrameLocks noChangeAspect="1"/>
+            </wp:cNvGraphicFramePr>
+            <a:graphic>
+              <a:graphicData uri="http://schemas.openxmlformats.org/drawingml/2006/picture">
+                <pic:pic>
+                  <pic:nvPicPr>
+                    <pic:cNvPr id="0" name="model_hit_heatmap.png"/>
+                    <pic:cNvPicPr/>
+                  </pic:nvPicPr>
+                  <pic:blipFill>
+                    <a:blip r:embed="rId25"/>
+                    <a:stretch>
+                      <a:fillRect/>
+                    </a:stretch>
+                  </pic:blipFill>
+                  <pic:spPr>
+                    <a:xfrm>
+                      <a:off x="0" y="0"/>
+                      <a:ext cx="5669280" cy="5153891"/>
+                    </a:xfrm>
+                    <a:prstGeom prst="rect"/>
+                  </pic:spPr>
+                </pic:pic>
+              </a:graphicData>
+            </a:graphic>
+          </wp:inline>
+        </w:drawing>
+      </w:r>
+    </w:p>
+    <w:p>
+      <w:pPr>
+        <w:jc w:val="center"/>
+      </w:pPr>
+      <w:r>
+        <w:rPr>
+          <w:i/>
+          <w:color w:val="333333"/>
+          <w:sz w:val="18"/>
+        </w:rPr>
+        <w:t>Figure 17. Average actual points captured by each model's predicted top 10.</w:t>
+      </w:r>
+    </w:p>
+    <w:p>
+      <w:r>
+        <w:drawing>
+          <wp:inline xmlns:a="http://schemas.openxmlformats.org/drawingml/2006/main" xmlns:pic="http://schemas.openxmlformats.org/drawingml/2006/picture">
+            <wp:extent cx="5669280" cy="3149600"/>
+            <wp:docPr id="17" name="Picture 17"/>
+            <wp:cNvGraphicFramePr>
+              <a:graphicFrameLocks noChangeAspect="1"/>
+            </wp:cNvGraphicFramePr>
+            <a:graphic>
+              <a:graphicData uri="http://schemas.openxmlformats.org/drawingml/2006/picture">
+                <pic:pic>
+                  <pic:nvPicPr>
+                    <pic:cNvPr id="0" name="model_points_captured.png"/>
+                    <pic:cNvPicPr/>
+                  </pic:nvPicPr>
+                  <pic:blipFill>
+                    <a:blip r:embed="rId26"/>
+                    <a:stretch>
+                      <a:fillRect/>
+                    </a:stretch>
+                  </pic:blipFill>
+                  <pic:spPr>
+                    <a:xfrm>
+                      <a:off x="0" y="0"/>
+                      <a:ext cx="5669280" cy="3149600"/>
+                    </a:xfrm>
+                    <a:prstGeom prst="rect"/>
+                  </pic:spPr>
+                </pic:pic>
+              </a:graphicData>
+            </a:graphic>
+          </wp:inline>
+        </w:drawing>
+      </w:r>
+    </w:p>
+    <w:p>
+      <w:pPr>
+        <w:jc w:val="center"/>
+      </w:pPr>
+      <w:r>
+        <w:rPr>
+          <w:i/>
+          <w:color w:val="333333"/>
+          <w:sz w:val="18"/>
+        </w:rPr>
+        <w:t>Figure 18. Example race card showing actual podium, virtual podiums and predicted top 10 lists.</w:t>
+      </w:r>
+    </w:p>
+    <w:p>
+      <w:r>
+        <w:drawing>
+          <wp:inline xmlns:a="http://schemas.openxmlformats.org/drawingml/2006/main" xmlns:pic="http://schemas.openxmlformats.org/drawingml/2006/picture">
+            <wp:extent cx="5669280" cy="3736571"/>
+            <wp:docPr id="18" name="Picture 18"/>
+            <wp:cNvGraphicFramePr>
+              <a:graphicFrameLocks noChangeAspect="1"/>
+            </wp:cNvGraphicFramePr>
+            <a:graphic>
+              <a:graphicData uri="http://schemas.openxmlformats.org/drawingml/2006/picture">
+                <pic:pic>
+                  <pic:nvPicPr>
+                    <pic:cNvPr id="0" name="2025_08_monaco_grand_prix.png"/>
+                    <pic:cNvPicPr/>
+                  </pic:nvPicPr>
+                  <pic:blipFill>
+                    <a:blip r:embed="rId27"/>
+                    <a:stretch>
+                      <a:fillRect/>
+                    </a:stretch>
+                  </pic:blipFill>
+                  <pic:spPr>
+                    <a:xfrm>
+                      <a:off x="0" y="0"/>
+                      <a:ext cx="5669280" cy="3736571"/>
+                    </a:xfrm>
+                    <a:prstGeom prst="rect"/>
+                  </pic:spPr>
+                </pic:pic>
+              </a:graphicData>
+            </a:graphic>
+          </wp:inline>
+        </w:drawing>
+      </w:r>
+    </w:p>
     <w:sectPr>
       <w:footerReference w:type="default" r:id="rId9"/>
       <w:pgSz w:w="12240" w:h="15840"/>

</xml_diff>

<commit_message>
Add 3D neural snapshot and race overviews
</commit_message>
<xml_diff>
--- a/report/Report.docx
+++ b/report/Report.docx
@@ -5435,6 +5435,42 @@
                 <w:b w:val="0"/>
                 <w:sz w:val="18"/>
               </w:rPr>
+              <w:t>outputs/figures/predictions/race_overviews/*.png</w:t>
+            </w:r>
+          </w:p>
+        </w:tc>
+        <w:tc>
+          <w:tcPr>
+            <w:tcW w:type="dxa" w:w="5040"/>
+            <w:shd w:fill="F7F7F7"/>
+          </w:tcPr>
+          <w:p>
+            <w:r/>
+            <w:r>
+              <w:rPr>
+                <w:rFonts w:ascii="Arial" w:hAnsi="Arial"/>
+                <w:b w:val="0"/>
+                <w:sz w:val="18"/>
+              </w:rPr>
+              <w:t>One-page race overviews with real top 10, model scoreboard, virtual podiums and consensus picks</w:t>
+            </w:r>
+          </w:p>
+        </w:tc>
+      </w:tr>
+      <w:tr>
+        <w:tc>
+          <w:tcPr>
+            <w:tcW w:type="dxa" w:w="5040"/>
+            <w:shd w:fill="EAF3F4"/>
+          </w:tcPr>
+          <w:p>
+            <w:r/>
+            <w:r>
+              <w:rPr>
+                <w:rFonts w:ascii="Arial" w:hAnsi="Arial"/>
+                <w:b w:val="0"/>
+                <w:sz w:val="18"/>
+              </w:rPr>
               <w:t>outputs/figures/predictions/race_cards/*.png</w:t>
             </w:r>
           </w:p>
@@ -5442,7 +5478,7 @@
         <w:tc>
           <w:tcPr>
             <w:tcW w:type="dxa" w:w="5040"/>
-            <w:shd w:fill="F7F7F7"/>
+            <w:shd w:fill="EAF3F4"/>
           </w:tcPr>
           <w:p>
             <w:r/>
@@ -5464,7 +5500,7 @@
         <w:spacing w:line="276" w:lineRule="auto"/>
       </w:pPr>
       <w:r>
-        <w:t>The race cards show each model's virtual podium and predicted top 10 for a completed race. Green rows indicate drivers who actually finished in the real top 10, while red rows indicate predicted top-10 drivers who missed the real top 10. The points shown are actual race points earned after the race. Driver headshots are retrieved through OpenF1's headshot_url metadata when available; if a photo cannot be retrieved, the render falls back to a clean initials-based placeholder.</w:t>
+        <w:t>The race overview and race card outputs show each model's virtual podium and predicted top 10 for a completed race, alongside the real top-10 result. Green rows or chips indicate drivers who actually finished in the real top 10, while red rows or chips indicate predicted top-10 drivers who missed the real top 10. The points shown are actual race points earned after the race. Driver headshots are retrieved through OpenF1's headshot_url metadata when available; if a photo cannot be retrieved, the render falls back to a clean initials-based placeholder.</w:t>
       </w:r>
     </w:p>
     <w:p>
@@ -5776,7 +5812,7 @@
         <w:spacing w:line="276" w:lineRule="auto"/>
       </w:pPr>
       <w:r>
-        <w:t>The neural-network work is included as an extension rather than the main assignment claim. The binary MLP classifier is implemented in scripts/algorithms/neural_network.py and trained through scripts/tune_neural_network.py. The 3D neural visualization is generated by scripts/visualize_neural_network_3d.py and exported to outputs/figures/neural_network_embedding_3d.html.</w:t>
+        <w:t>The neural-network work is included as an extension rather than the main assignment claim. The binary MLP classifier is implemented in scripts/algorithms/neural_network.py and trained through scripts/tune_neural_network.py. The 3D neural visualization is generated by scripts/visualize_neural_network_3d.py and exported to outputs/figures/neural_network_embedding_3d.html. A static report-friendly image is also exported to outputs/figures/neural_network_embedding_3d.png.</w:t>
       </w:r>
     </w:p>
     <w:p>
@@ -6447,7 +6483,56 @@
           <w:color w:val="333333"/>
           <w:sz w:val="18"/>
         </w:rPr>
-        <w:t>Figure 14. Finish-position ranking model comparison, included as an extension.</w:t>
+        <w:t>Figure 14. Static view of the interactive 3D neural-network hidden-space embedding.</w:t>
+      </w:r>
+    </w:p>
+    <w:p>
+      <w:r>
+        <w:drawing>
+          <wp:inline xmlns:a="http://schemas.openxmlformats.org/drawingml/2006/main" xmlns:pic="http://schemas.openxmlformats.org/drawingml/2006/picture">
+            <wp:extent cx="5669280" cy="3569547"/>
+            <wp:docPr id="14" name="Picture 14"/>
+            <wp:cNvGraphicFramePr>
+              <a:graphicFrameLocks noChangeAspect="1"/>
+            </wp:cNvGraphicFramePr>
+            <a:graphic>
+              <a:graphicData uri="http://schemas.openxmlformats.org/drawingml/2006/picture">
+                <pic:pic>
+                  <pic:nvPicPr>
+                    <pic:cNvPr id="0" name="neural_network_embedding_3d.png"/>
+                    <pic:cNvPicPr/>
+                  </pic:nvPicPr>
+                  <pic:blipFill>
+                    <a:blip r:embed="rId23"/>
+                    <a:stretch>
+                      <a:fillRect/>
+                    </a:stretch>
+                  </pic:blipFill>
+                  <pic:spPr>
+                    <a:xfrm>
+                      <a:off x="0" y="0"/>
+                      <a:ext cx="5669280" cy="3569547"/>
+                    </a:xfrm>
+                    <a:prstGeom prst="rect"/>
+                  </pic:spPr>
+                </pic:pic>
+              </a:graphicData>
+            </a:graphic>
+          </wp:inline>
+        </w:drawing>
+      </w:r>
+    </w:p>
+    <w:p>
+      <w:pPr>
+        <w:jc w:val="center"/>
+      </w:pPr>
+      <w:r>
+        <w:rPr>
+          <w:i/>
+          <w:color w:val="333333"/>
+          <w:sz w:val="18"/>
+        </w:rPr>
+        <w:t>Figure 15. Finish-position ranking model comparison, included as an extension.</w:t>
       </w:r>
     </w:p>
     <w:p>
@@ -6455,7 +6540,7 @@
         <w:drawing>
           <wp:inline xmlns:a="http://schemas.openxmlformats.org/drawingml/2006/main" xmlns:pic="http://schemas.openxmlformats.org/drawingml/2006/picture">
             <wp:extent cx="5669280" cy="2834640"/>
-            <wp:docPr id="14" name="Picture 14"/>
+            <wp:docPr id="15" name="Picture 15"/>
             <wp:cNvGraphicFramePr>
               <a:graphicFrameLocks noChangeAspect="1"/>
             </wp:cNvGraphicFramePr>
@@ -6467,7 +6552,7 @@
                     <pic:cNvPicPr/>
                   </pic:nvPicPr>
                   <pic:blipFill>
-                    <a:blip r:embed="rId23"/>
+                    <a:blip r:embed="rId24"/>
                     <a:stretch>
                       <a:fillRect/>
                     </a:stretch>
@@ -6496,7 +6581,7 @@
           <w:color w:val="333333"/>
           <w:sz w:val="18"/>
         </w:rPr>
-        <w:t>Figure 15. Correct predicted top-10 drivers per race and model on the 2025 holdout season.</w:t>
+        <w:t>Figure 16. Correct predicted top-10 drivers per race and model on the 2025 holdout season.</w:t>
       </w:r>
     </w:p>
     <w:p>
@@ -6504,7 +6589,7 @@
         <w:drawing>
           <wp:inline xmlns:a="http://schemas.openxmlformats.org/drawingml/2006/main" xmlns:pic="http://schemas.openxmlformats.org/drawingml/2006/picture">
             <wp:extent cx="5669280" cy="2429691"/>
-            <wp:docPr id="15" name="Picture 15"/>
+            <wp:docPr id="16" name="Picture 16"/>
             <wp:cNvGraphicFramePr>
               <a:graphicFrameLocks noChangeAspect="1"/>
             </wp:cNvGraphicFramePr>
@@ -6516,7 +6601,7 @@
                     <pic:cNvPicPr/>
                   </pic:nvPicPr>
                   <pic:blipFill>
-                    <a:blip r:embed="rId24"/>
+                    <a:blip r:embed="rId25"/>
                     <a:stretch>
                       <a:fillRect/>
                     </a:stretch>
@@ -6545,7 +6630,7 @@
           <w:color w:val="333333"/>
           <w:sz w:val="18"/>
         </w:rPr>
-        <w:t>Figure 16. Race-level heatmap of top-10 hits by model.</w:t>
+        <w:t>Figure 17. Race-level heatmap of top-10 hits by model.</w:t>
       </w:r>
     </w:p>
     <w:p>
@@ -6553,7 +6638,7 @@
         <w:drawing>
           <wp:inline xmlns:a="http://schemas.openxmlformats.org/drawingml/2006/main" xmlns:pic="http://schemas.openxmlformats.org/drawingml/2006/picture">
             <wp:extent cx="5669280" cy="5153891"/>
-            <wp:docPr id="16" name="Picture 16"/>
+            <wp:docPr id="17" name="Picture 17"/>
             <wp:cNvGraphicFramePr>
               <a:graphicFrameLocks noChangeAspect="1"/>
             </wp:cNvGraphicFramePr>
@@ -6565,7 +6650,7 @@
                     <pic:cNvPicPr/>
                   </pic:nvPicPr>
                   <pic:blipFill>
-                    <a:blip r:embed="rId25"/>
+                    <a:blip r:embed="rId26"/>
                     <a:stretch>
                       <a:fillRect/>
                     </a:stretch>
@@ -6594,7 +6679,7 @@
           <w:color w:val="333333"/>
           <w:sz w:val="18"/>
         </w:rPr>
-        <w:t>Figure 17. Average actual points captured by each model's predicted top 10.</w:t>
+        <w:t>Figure 18. Average actual points captured by each model's predicted top 10.</w:t>
       </w:r>
     </w:p>
     <w:p>
@@ -6602,7 +6687,7 @@
         <w:drawing>
           <wp:inline xmlns:a="http://schemas.openxmlformats.org/drawingml/2006/main" xmlns:pic="http://schemas.openxmlformats.org/drawingml/2006/picture">
             <wp:extent cx="5669280" cy="3149600"/>
-            <wp:docPr id="17" name="Picture 17"/>
+            <wp:docPr id="18" name="Picture 18"/>
             <wp:cNvGraphicFramePr>
               <a:graphicFrameLocks noChangeAspect="1"/>
             </wp:cNvGraphicFramePr>
@@ -6614,7 +6699,7 @@
                     <pic:cNvPicPr/>
                   </pic:nvPicPr>
                   <pic:blipFill>
-                    <a:blip r:embed="rId26"/>
+                    <a:blip r:embed="rId27"/>
                     <a:stretch>
                       <a:fillRect/>
                     </a:stretch>
@@ -6643,15 +6728,15 @@
           <w:color w:val="333333"/>
           <w:sz w:val="18"/>
         </w:rPr>
-        <w:t>Figure 18. Example race card showing actual podium, virtual podiums and predicted top 10 lists.</w:t>
+        <w:t>Figure 19. Example race overview with real result, model scoreboard, consensus picks and predicted top 10 chips.</w:t>
       </w:r>
     </w:p>
     <w:p>
       <w:r>
         <w:drawing>
           <wp:inline xmlns:a="http://schemas.openxmlformats.org/drawingml/2006/main" xmlns:pic="http://schemas.openxmlformats.org/drawingml/2006/picture">
-            <wp:extent cx="5669280" cy="3736571"/>
-            <wp:docPr id="18" name="Picture 18"/>
+            <wp:extent cx="5669280" cy="3607724"/>
+            <wp:docPr id="19" name="Picture 19"/>
             <wp:cNvGraphicFramePr>
               <a:graphicFrameLocks noChangeAspect="1"/>
             </wp:cNvGraphicFramePr>
@@ -6663,7 +6748,56 @@
                     <pic:cNvPicPr/>
                   </pic:nvPicPr>
                   <pic:blipFill>
-                    <a:blip r:embed="rId27"/>
+                    <a:blip r:embed="rId28"/>
+                    <a:stretch>
+                      <a:fillRect/>
+                    </a:stretch>
+                  </pic:blipFill>
+                  <pic:spPr>
+                    <a:xfrm>
+                      <a:off x="0" y="0"/>
+                      <a:ext cx="5669280" cy="3607724"/>
+                    </a:xfrm>
+                    <a:prstGeom prst="rect"/>
+                  </pic:spPr>
+                </pic:pic>
+              </a:graphicData>
+            </a:graphic>
+          </wp:inline>
+        </w:drawing>
+      </w:r>
+    </w:p>
+    <w:p>
+      <w:pPr>
+        <w:jc w:val="center"/>
+      </w:pPr>
+      <w:r>
+        <w:rPr>
+          <w:i/>
+          <w:color w:val="333333"/>
+          <w:sz w:val="18"/>
+        </w:rPr>
+        <w:t>Figure 20. Detailed race card showing actual podium, virtual podiums and predicted top 10 lists.</w:t>
+      </w:r>
+    </w:p>
+    <w:p>
+      <w:r>
+        <w:drawing>
+          <wp:inline xmlns:a="http://schemas.openxmlformats.org/drawingml/2006/main" xmlns:pic="http://schemas.openxmlformats.org/drawingml/2006/picture">
+            <wp:extent cx="5669280" cy="3736571"/>
+            <wp:docPr id="20" name="Picture 20"/>
+            <wp:cNvGraphicFramePr>
+              <a:graphicFrameLocks noChangeAspect="1"/>
+            </wp:cNvGraphicFramePr>
+            <a:graphic>
+              <a:graphicData uri="http://schemas.openxmlformats.org/drawingml/2006/picture">
+                <pic:pic>
+                  <pic:nvPicPr>
+                    <pic:cNvPr id="0" name="2025_08_monaco_grand_prix.png"/>
+                    <pic:cNvPicPr/>
+                  </pic:nvPicPr>
+                  <pic:blipFill>
+                    <a:blip r:embed="rId29"/>
                     <a:stretch>
                       <a:fillRect/>
                     </a:stretch>

</xml_diff>

<commit_message>
Improve data coverage and rerun models
</commit_message>
<xml_diff>
--- a/report/Report.docx
+++ b/report/Report.docx
@@ -189,7 +189,7 @@
                 <w:b w:val="0"/>
                 <w:sz w:val="18"/>
               </w:rPr>
-              <w:t>6,999 driver-race rows, 198 variables, seasons 2010-2026</w:t>
+              <w:t>6,999 driver-race rows, 206 variables, seasons 2010-2026</w:t>
             </w:r>
           </w:p>
         </w:tc>
@@ -391,7 +391,7 @@
         <w:spacing w:line="276" w:lineRule="auto"/>
       </w:pPr>
       <w:r>
-        <w:t>This project investigates whether machine learning can predict if a Formula 1 driver will finish a Grand Prix in the top 10. This is a useful sporting analytics problem because top-10 classification is directly linked to points scoring, race strategy and team performance evaluation. A single model-ready dataset was built from public Formula 1 data covering 2010 to 2026, combining race results, qualifying, standings, circuit information, historical pit-stop indicators, weather, and selected FastF1-derived features. The dataset was cleaned, merged and transformed into 6,999 driver-race observations with 198 variables and no missing values. The main predictive task is binary classification with top10_finish as the target. Logistic regression, random forest, extra trees, histogram gradient boosting and a multilayer perceptron were compared using temporal validation. The best holdout model is histogram gradient boosting, with 2025 race precision@10 of 0.779. A separate neural-network regressor was also trained as a ranking extension for predicted finishing order, but the primary assignment result remains the comparison and validation of predictive models on the tabular top-10 classification task.</w:t>
+        <w:t>This project investigates whether machine learning can predict if a Formula 1 driver will finish a Grand Prix in the top 10. This is a useful sporting analytics problem because top-10 classification is directly linked to points scoring, race strategy and team performance evaluation. A single model-ready dataset was built from public Formula 1 data covering 2010 to 2026, combining race results, qualifying, standings, circuit information, historical pit-stop indicators, weather, and selected FastF1-derived features. The dataset was cleaned, merged and transformed into 6,999 driver-race observations with 206 variables and no missing values. The main predictive task is binary classification with top10_finish as the target. Logistic regression, random forest, extra trees, histogram gradient boosting and a multilayer perceptron were compared using temporal validation. The best holdout model is histogram gradient boosting, with 2025 race precision@10 of 0.783. A separate neural-network regressor was also trained as a ranking extension for predicted finishing order, but the primary assignment result remains the comparison and validation of predictive models on the tabular top-10 classification task.</w:t>
       </w:r>
     </w:p>
     <w:p>
@@ -666,7 +666,7 @@
                 <w:b w:val="0"/>
                 <w:sz w:val="18"/>
               </w:rPr>
-              <w:t>6,999 driver-race rows, 198 variables and seasons 2010-2026</w:t>
+              <w:t>6,999 driver-race rows, 206 variables and seasons 2010-2026</w:t>
             </w:r>
           </w:p>
         </w:tc>
@@ -772,7 +772,7 @@
                 <w:b w:val="0"/>
                 <w:sz w:val="18"/>
               </w:rPr>
-              <w:t>Final dataset includes 174 numeric/bool columns and 24 categorical/text columns</w:t>
+              <w:t>Final dataset includes 182 numeric/bool columns and 24 categorical/text columns</w:t>
             </w:r>
           </w:p>
         </w:tc>
@@ -825,7 +825,7 @@
                 <w:b w:val="0"/>
                 <w:sz w:val="18"/>
               </w:rPr>
-              <w:t>The final dataset has 198 columns</w:t>
+              <w:t>The final dataset has 206 columns</w:t>
             </w:r>
           </w:p>
         </w:tc>
@@ -2065,7 +2065,7 @@
                 <w:b w:val="0"/>
                 <w:sz w:val="18"/>
               </w:rPr>
-              <w:t>198</w:t>
+              <w:t>206</w:t>
             </w:r>
           </w:p>
         </w:tc>
@@ -2101,7 +2101,7 @@
                 <w:b w:val="0"/>
                 <w:sz w:val="18"/>
               </w:rPr>
-              <w:t>174</w:t>
+              <w:t>182</w:t>
             </w:r>
           </w:p>
         </w:tc>
@@ -3149,7 +3149,7 @@
                 <w:b w:val="0"/>
                 <w:sz w:val="18"/>
               </w:rPr>
-              <w:t>scripts/generate_historical_weather.py</w:t>
+              <w:t>scripts/rebuild_derived_raw_tables.py</w:t>
             </w:r>
           </w:p>
         </w:tc>
@@ -3166,7 +3166,79 @@
                 <w:b w:val="0"/>
                 <w:sz w:val="18"/>
               </w:rPr>
+              <w:t>Rebuilds derived raw features from local event files without refetching</w:t>
+            </w:r>
+          </w:p>
+        </w:tc>
+      </w:tr>
+      <w:tr>
+        <w:tc>
+          <w:tcPr>
+            <w:tcW w:type="dxa" w:w="5040"/>
+            <w:shd w:fill="EAF3F4"/>
+          </w:tcPr>
+          <w:p>
+            <w:r/>
+            <w:r>
+              <w:rPr>
+                <w:rFonts w:ascii="Arial" w:hAnsi="Arial"/>
+                <w:b w:val="0"/>
+                <w:sz w:val="18"/>
+              </w:rPr>
+              <w:t>scripts/generate_historical_weather.py</w:t>
+            </w:r>
+          </w:p>
+        </w:tc>
+        <w:tc>
+          <w:tcPr>
+            <w:tcW w:type="dxa" w:w="5040"/>
+            <w:shd w:fill="EAF3F4"/>
+          </w:tcPr>
+          <w:p>
+            <w:r/>
+            <w:r>
+              <w:rPr>
+                <w:rFonts w:ascii="Arial" w:hAnsi="Arial"/>
+                <w:b w:val="0"/>
+                <w:sz w:val="18"/>
+              </w:rPr>
               <w:t>Adds Open-Meteo race-day weather features</w:t>
+            </w:r>
+          </w:p>
+        </w:tc>
+      </w:tr>
+      <w:tr>
+        <w:tc>
+          <w:tcPr>
+            <w:tcW w:type="dxa" w:w="5040"/>
+            <w:shd w:fill="F7F7F7"/>
+          </w:tcPr>
+          <w:p>
+            <w:r/>
+            <w:r>
+              <w:rPr>
+                <w:rFonts w:ascii="Arial" w:hAnsi="Arial"/>
+                <w:b w:val="0"/>
+                <w:sz w:val="18"/>
+              </w:rPr>
+              <w:t>scripts/fetch_upcoming_weather_forecast.py</w:t>
+            </w:r>
+          </w:p>
+        </w:tc>
+        <w:tc>
+          <w:tcPr>
+            <w:tcW w:type="dxa" w:w="5040"/>
+            <w:shd w:fill="F7F7F7"/>
+          </w:tcPr>
+          <w:p>
+            <w:r/>
+            <w:r>
+              <w:rPr>
+                <w:rFonts w:ascii="Arial" w:hAnsi="Arial"/>
+                <w:b w:val="0"/>
+                <w:sz w:val="18"/>
+              </w:rPr>
+              <w:t>Creates pre-race weather forecast/fallback snapshots for upcoming races</w:t>
             </w:r>
           </w:p>
         </w:tc>
@@ -3672,6 +3744,32 @@
           <w:color w:val="333333"/>
           <w:sz w:val="18"/>
         </w:rPr>
+        <w:t>python scripts/rebuild_derived_raw_tables.py</w:t>
+      </w:r>
+    </w:p>
+    <w:p>
+      <w:pPr>
+        <w:ind w:left="288"/>
+      </w:pPr>
+      <w:r>
+        <w:rPr>
+          <w:rFonts w:ascii="Courier New" w:hAnsi="Courier New"/>
+          <w:color w:val="333333"/>
+          <w:sz w:val="18"/>
+        </w:rPr>
+        <w:t>python scripts/fetch_upcoming_weather_forecast.py --season 2026 --count 4</w:t>
+      </w:r>
+    </w:p>
+    <w:p>
+      <w:pPr>
+        <w:ind w:left="288"/>
+      </w:pPr>
+      <w:r>
+        <w:rPr>
+          <w:rFonts w:ascii="Courier New" w:hAnsi="Courier New"/>
+          <w:color w:val="333333"/>
+          <w:sz w:val="18"/>
+        </w:rPr>
         <w:t>python scripts/evaluate_models.py</w:t>
       </w:r>
     </w:p>
@@ -4151,7 +4249,7 @@
         <w:spacing w:line="276" w:lineRule="auto"/>
       </w:pPr>
       <w:r>
-        <w:t>The MLP model used dense numerical input after preprocessing. Numerical variables were scaled, categorical variables were encoded, and the final transformed feature matrix was passed to the neural network. Since neural networks are sensitive to feature scale, standardization was applied to numerical features. The best current MLP classifier uses hidden layers (128, 64), ReLU activation, alpha=0.002, learning_rate_init=0.0005, batch_size=64 and early stopping. After preprocessing, the model receives about 750 transformed features and has approximately 104,449 trainable parameters.</w:t>
+        <w:t>The MLP model used dense numerical input after preprocessing. Numerical variables were scaled, categorical variables were encoded, and the final transformed feature matrix was passed to the neural network. Since neural networks are sensitive to feature scale, standardization was applied to numerical features. The best current MLP classifier uses hidden layers (80, 40), tanh activation, alpha=0.002, learning_rate_init=0.0007, batch_size=64 and early stopping. This model is useful as a non-linear neural baseline, but it is not presented as the main assignment model because the tree-based methods remain stronger or more stable on the tabular prediction task.</w:t>
       </w:r>
     </w:p>
     <w:p>
@@ -4353,7 +4451,7 @@
                 <w:b w:val="0"/>
                 <w:sz w:val="18"/>
               </w:rPr>
-              <w:t>0.785</w:t>
+              <w:t>0.777</w:t>
             </w:r>
           </w:p>
         </w:tc>
@@ -4370,7 +4468,7 @@
                 <w:b w:val="0"/>
                 <w:sz w:val="18"/>
               </w:rPr>
-              <w:t>0.789</w:t>
+              <w:t>0.783</w:t>
             </w:r>
           </w:p>
         </w:tc>
@@ -4387,7 +4485,7 @@
                 <w:b w:val="0"/>
                 <w:sz w:val="18"/>
               </w:rPr>
-              <w:t>0.779</w:t>
+              <w:t>0.767</w:t>
             </w:r>
           </w:p>
         </w:tc>
@@ -4404,7 +4502,7 @@
                 <w:b w:val="0"/>
                 <w:sz w:val="18"/>
               </w:rPr>
-              <w:t>0.784</w:t>
+              <w:t>0.775</w:t>
             </w:r>
           </w:p>
         </w:tc>
@@ -4421,7 +4519,7 @@
                 <w:b w:val="0"/>
                 <w:sz w:val="18"/>
               </w:rPr>
-              <w:t>0.831</w:t>
+              <w:t>0.832</w:t>
             </w:r>
           </w:p>
         </w:tc>
@@ -4438,7 +4536,249 @@
                 <w:b w:val="0"/>
                 <w:sz w:val="18"/>
               </w:rPr>
-              <w:t>0.779</w:t>
+              <w:t>0.783</w:t>
+            </w:r>
+          </w:p>
+        </w:tc>
+      </w:tr>
+      <w:tr>
+        <w:tc>
+          <w:tcPr>
+            <w:tcW w:type="dxa" w:w="1440"/>
+            <w:shd w:fill="F7F7F7"/>
+          </w:tcPr>
+          <w:p>
+            <w:r/>
+            <w:r>
+              <w:rPr>
+                <w:rFonts w:ascii="Arial" w:hAnsi="Arial"/>
+                <w:b w:val="0"/>
+                <w:sz w:val="18"/>
+              </w:rPr>
+              <w:t>Neural network MLP</w:t>
+            </w:r>
+          </w:p>
+        </w:tc>
+        <w:tc>
+          <w:tcPr>
+            <w:tcW w:type="dxa" w:w="1440"/>
+            <w:shd w:fill="F7F7F7"/>
+          </w:tcPr>
+          <w:p>
+            <w:r/>
+            <w:r>
+              <w:rPr>
+                <w:rFonts w:ascii="Arial" w:hAnsi="Arial"/>
+                <w:b w:val="0"/>
+                <w:sz w:val="18"/>
+              </w:rPr>
+              <w:t>0.743</w:t>
+            </w:r>
+          </w:p>
+        </w:tc>
+        <w:tc>
+          <w:tcPr>
+            <w:tcW w:type="dxa" w:w="1440"/>
+            <w:shd w:fill="F7F7F7"/>
+          </w:tcPr>
+          <w:p>
+            <w:r/>
+            <w:r>
+              <w:rPr>
+                <w:rFonts w:ascii="Arial" w:hAnsi="Arial"/>
+                <w:b w:val="0"/>
+                <w:sz w:val="18"/>
+              </w:rPr>
+              <w:t>0.813</w:t>
+            </w:r>
+          </w:p>
+        </w:tc>
+        <w:tc>
+          <w:tcPr>
+            <w:tcW w:type="dxa" w:w="1440"/>
+            <w:shd w:fill="F7F7F7"/>
+          </w:tcPr>
+          <w:p>
+            <w:r/>
+            <w:r>
+              <w:rPr>
+                <w:rFonts w:ascii="Arial" w:hAnsi="Arial"/>
+                <w:b w:val="0"/>
+                <w:sz w:val="18"/>
+              </w:rPr>
+              <w:t>0.633</w:t>
+            </w:r>
+          </w:p>
+        </w:tc>
+        <w:tc>
+          <w:tcPr>
+            <w:tcW w:type="dxa" w:w="1440"/>
+            <w:shd w:fill="F7F7F7"/>
+          </w:tcPr>
+          <w:p>
+            <w:r/>
+            <w:r>
+              <w:rPr>
+                <w:rFonts w:ascii="Arial" w:hAnsi="Arial"/>
+                <w:b w:val="0"/>
+                <w:sz w:val="18"/>
+              </w:rPr>
+              <w:t>0.712</w:t>
+            </w:r>
+          </w:p>
+        </w:tc>
+        <w:tc>
+          <w:tcPr>
+            <w:tcW w:type="dxa" w:w="1440"/>
+            <w:shd w:fill="F7F7F7"/>
+          </w:tcPr>
+          <w:p>
+            <w:r/>
+            <w:r>
+              <w:rPr>
+                <w:rFonts w:ascii="Arial" w:hAnsi="Arial"/>
+                <w:b w:val="0"/>
+                <w:sz w:val="18"/>
+              </w:rPr>
+              <w:t>0.827</w:t>
+            </w:r>
+          </w:p>
+        </w:tc>
+        <w:tc>
+          <w:tcPr>
+            <w:tcW w:type="dxa" w:w="1440"/>
+            <w:shd w:fill="F7F7F7"/>
+          </w:tcPr>
+          <w:p>
+            <w:r/>
+            <w:r>
+              <w:rPr>
+                <w:rFonts w:ascii="Arial" w:hAnsi="Arial"/>
+                <w:b w:val="0"/>
+                <w:sz w:val="18"/>
+              </w:rPr>
+              <w:t>0.771</w:t>
+            </w:r>
+          </w:p>
+        </w:tc>
+      </w:tr>
+      <w:tr>
+        <w:tc>
+          <w:tcPr>
+            <w:tcW w:type="dxa" w:w="1440"/>
+            <w:shd w:fill="EAF3F4"/>
+          </w:tcPr>
+          <w:p>
+            <w:r/>
+            <w:r>
+              <w:rPr>
+                <w:rFonts w:ascii="Arial" w:hAnsi="Arial"/>
+                <w:b w:val="0"/>
+                <w:sz w:val="18"/>
+              </w:rPr>
+              <w:t>Extra trees</w:t>
+            </w:r>
+          </w:p>
+        </w:tc>
+        <w:tc>
+          <w:tcPr>
+            <w:tcW w:type="dxa" w:w="1440"/>
+            <w:shd w:fill="EAF3F4"/>
+          </w:tcPr>
+          <w:p>
+            <w:r/>
+            <w:r>
+              <w:rPr>
+                <w:rFonts w:ascii="Arial" w:hAnsi="Arial"/>
+                <w:b w:val="0"/>
+                <w:sz w:val="18"/>
+              </w:rPr>
+              <w:t>0.752</w:t>
+            </w:r>
+          </w:p>
+        </w:tc>
+        <w:tc>
+          <w:tcPr>
+            <w:tcW w:type="dxa" w:w="1440"/>
+            <w:shd w:fill="EAF3F4"/>
+          </w:tcPr>
+          <w:p>
+            <w:r/>
+            <w:r>
+              <w:rPr>
+                <w:rFonts w:ascii="Arial" w:hAnsi="Arial"/>
+                <w:b w:val="0"/>
+                <w:sz w:val="18"/>
+              </w:rPr>
+              <w:t>0.735</w:t>
+            </w:r>
+          </w:p>
+        </w:tc>
+        <w:tc>
+          <w:tcPr>
+            <w:tcW w:type="dxa" w:w="1440"/>
+            <w:shd w:fill="EAF3F4"/>
+          </w:tcPr>
+          <w:p>
+            <w:r/>
+            <w:r>
+              <w:rPr>
+                <w:rFonts w:ascii="Arial" w:hAnsi="Arial"/>
+                <w:b w:val="0"/>
+                <w:sz w:val="18"/>
+              </w:rPr>
+              <w:t>0.788</w:t>
+            </w:r>
+          </w:p>
+        </w:tc>
+        <w:tc>
+          <w:tcPr>
+            <w:tcW w:type="dxa" w:w="1440"/>
+            <w:shd w:fill="EAF3F4"/>
+          </w:tcPr>
+          <w:p>
+            <w:r/>
+            <w:r>
+              <w:rPr>
+                <w:rFonts w:ascii="Arial" w:hAnsi="Arial"/>
+                <w:b w:val="0"/>
+                <w:sz w:val="18"/>
+              </w:rPr>
+              <w:t>0.761</w:t>
+            </w:r>
+          </w:p>
+        </w:tc>
+        <w:tc>
+          <w:tcPr>
+            <w:tcW w:type="dxa" w:w="1440"/>
+            <w:shd w:fill="EAF3F4"/>
+          </w:tcPr>
+          <w:p>
+            <w:r/>
+            <w:r>
+              <w:rPr>
+                <w:rFonts w:ascii="Arial" w:hAnsi="Arial"/>
+                <w:b w:val="0"/>
+                <w:sz w:val="18"/>
+              </w:rPr>
+              <w:t>0.836</w:t>
+            </w:r>
+          </w:p>
+        </w:tc>
+        <w:tc>
+          <w:tcPr>
+            <w:tcW w:type="dxa" w:w="1440"/>
+            <w:shd w:fill="EAF3F4"/>
+          </w:tcPr>
+          <w:p>
+            <w:r/>
+            <w:r>
+              <w:rPr>
+                <w:rFonts w:ascii="Arial" w:hAnsi="Arial"/>
+                <w:b w:val="0"/>
+                <w:sz w:val="18"/>
+              </w:rPr>
+              <w:t>0.754</w:t>
             </w:r>
           </w:p>
         </w:tc>
@@ -4474,7 +4814,7 @@
                 <w:b w:val="0"/>
                 <w:sz w:val="18"/>
               </w:rPr>
-              <w:t>0.779</w:t>
+              <w:t>0.764</w:t>
             </w:r>
           </w:p>
         </w:tc>
@@ -4491,7 +4831,7 @@
                 <w:b w:val="0"/>
                 <w:sz w:val="18"/>
               </w:rPr>
-              <w:t>0.762</w:t>
+              <w:t>0.751</w:t>
             </w:r>
           </w:p>
         </w:tc>
@@ -4508,7 +4848,7 @@
                 <w:b w:val="0"/>
                 <w:sz w:val="18"/>
               </w:rPr>
-              <w:t>0.813</w:t>
+              <w:t>0.792</w:t>
             </w:r>
           </w:p>
         </w:tc>
@@ -4525,7 +4865,7 @@
                 <w:b w:val="0"/>
                 <w:sz w:val="18"/>
               </w:rPr>
-              <w:t>0.786</w:t>
+              <w:t>0.771</w:t>
             </w:r>
           </w:p>
         </w:tc>
@@ -4542,7 +4882,7 @@
                 <w:b w:val="0"/>
                 <w:sz w:val="18"/>
               </w:rPr>
-              <w:t>0.844</w:t>
+              <w:t>0.840</w:t>
             </w:r>
           </w:p>
         </w:tc>
@@ -4559,249 +4899,7 @@
                 <w:b w:val="0"/>
                 <w:sz w:val="18"/>
               </w:rPr>
-              <w:t>0.775</w:t>
-            </w:r>
-          </w:p>
-        </w:tc>
-      </w:tr>
-      <w:tr>
-        <w:tc>
-          <w:tcPr>
-            <w:tcW w:type="dxa" w:w="1440"/>
-            <w:shd w:fill="EAF3F4"/>
-          </w:tcPr>
-          <w:p>
-            <w:r/>
-            <w:r>
-              <w:rPr>
-                <w:rFonts w:ascii="Arial" w:hAnsi="Arial"/>
-                <w:b w:val="0"/>
-                <w:sz w:val="18"/>
-              </w:rPr>
-              <w:t>Neural network MLP</w:t>
-            </w:r>
-          </w:p>
-        </w:tc>
-        <w:tc>
-          <w:tcPr>
-            <w:tcW w:type="dxa" w:w="1440"/>
-            <w:shd w:fill="EAF3F4"/>
-          </w:tcPr>
-          <w:p>
-            <w:r/>
-            <w:r>
-              <w:rPr>
-                <w:rFonts w:ascii="Arial" w:hAnsi="Arial"/>
-                <w:b w:val="0"/>
-                <w:sz w:val="18"/>
-              </w:rPr>
-              <w:t>0.766</w:t>
-            </w:r>
-          </w:p>
-        </w:tc>
-        <w:tc>
-          <w:tcPr>
-            <w:tcW w:type="dxa" w:w="1440"/>
-            <w:shd w:fill="EAF3F4"/>
-          </w:tcPr>
-          <w:p>
-            <w:r/>
-            <w:r>
-              <w:rPr>
-                <w:rFonts w:ascii="Arial" w:hAnsi="Arial"/>
-                <w:b w:val="0"/>
-                <w:sz w:val="18"/>
-              </w:rPr>
-              <w:t>0.756</w:t>
-            </w:r>
-          </w:p>
-        </w:tc>
-        <w:tc>
-          <w:tcPr>
-            <w:tcW w:type="dxa" w:w="1440"/>
-            <w:shd w:fill="EAF3F4"/>
-          </w:tcPr>
-          <w:p>
-            <w:r/>
-            <w:r>
-              <w:rPr>
-                <w:rFonts w:ascii="Arial" w:hAnsi="Arial"/>
-                <w:b w:val="0"/>
-                <w:sz w:val="18"/>
-              </w:rPr>
-              <w:t>0.788</w:t>
-            </w:r>
-          </w:p>
-        </w:tc>
-        <w:tc>
-          <w:tcPr>
-            <w:tcW w:type="dxa" w:w="1440"/>
-            <w:shd w:fill="EAF3F4"/>
-          </w:tcPr>
-          <w:p>
-            <w:r/>
-            <w:r>
-              <w:rPr>
-                <w:rFonts w:ascii="Arial" w:hAnsi="Arial"/>
-                <w:b w:val="0"/>
-                <w:sz w:val="18"/>
-              </w:rPr>
-              <w:t>0.771</w:t>
-            </w:r>
-          </w:p>
-        </w:tc>
-        <w:tc>
-          <w:tcPr>
-            <w:tcW w:type="dxa" w:w="1440"/>
-            <w:shd w:fill="EAF3F4"/>
-          </w:tcPr>
-          <w:p>
-            <w:r/>
-            <w:r>
-              <w:rPr>
-                <w:rFonts w:ascii="Arial" w:hAnsi="Arial"/>
-                <w:b w:val="0"/>
-                <w:sz w:val="18"/>
-              </w:rPr>
-              <w:t>0.829</w:t>
-            </w:r>
-          </w:p>
-        </w:tc>
-        <w:tc>
-          <w:tcPr>
-            <w:tcW w:type="dxa" w:w="1440"/>
-            <w:shd w:fill="EAF3F4"/>
-          </w:tcPr>
-          <w:p>
-            <w:r/>
-            <w:r>
-              <w:rPr>
-                <w:rFonts w:ascii="Arial" w:hAnsi="Arial"/>
-                <w:b w:val="0"/>
-                <w:sz w:val="18"/>
-              </w:rPr>
-              <w:t>0.771</w:t>
-            </w:r>
-          </w:p>
-        </w:tc>
-      </w:tr>
-      <w:tr>
-        <w:tc>
-          <w:tcPr>
-            <w:tcW w:type="dxa" w:w="1440"/>
-            <w:shd w:fill="F7F7F7"/>
-          </w:tcPr>
-          <w:p>
-            <w:r/>
-            <w:r>
-              <w:rPr>
-                <w:rFonts w:ascii="Arial" w:hAnsi="Arial"/>
-                <w:b w:val="0"/>
-                <w:sz w:val="18"/>
-              </w:rPr>
-              <w:t>Extra trees</w:t>
-            </w:r>
-          </w:p>
-        </w:tc>
-        <w:tc>
-          <w:tcPr>
-            <w:tcW w:type="dxa" w:w="1440"/>
-            <w:shd w:fill="F7F7F7"/>
-          </w:tcPr>
-          <w:p>
-            <w:r/>
-            <w:r>
-              <w:rPr>
-                <w:rFonts w:ascii="Arial" w:hAnsi="Arial"/>
-                <w:b w:val="0"/>
-                <w:sz w:val="18"/>
-              </w:rPr>
-              <w:t>0.752</w:t>
-            </w:r>
-          </w:p>
-        </w:tc>
-        <w:tc>
-          <w:tcPr>
-            <w:tcW w:type="dxa" w:w="1440"/>
-            <w:shd w:fill="F7F7F7"/>
-          </w:tcPr>
-          <w:p>
-            <w:r/>
-            <w:r>
-              <w:rPr>
-                <w:rFonts w:ascii="Arial" w:hAnsi="Arial"/>
-                <w:b w:val="0"/>
-                <w:sz w:val="18"/>
-              </w:rPr>
-              <w:t>0.735</w:t>
-            </w:r>
-          </w:p>
-        </w:tc>
-        <w:tc>
-          <w:tcPr>
-            <w:tcW w:type="dxa" w:w="1440"/>
-            <w:shd w:fill="F7F7F7"/>
-          </w:tcPr>
-          <w:p>
-            <w:r/>
-            <w:r>
-              <w:rPr>
-                <w:rFonts w:ascii="Arial" w:hAnsi="Arial"/>
-                <w:b w:val="0"/>
-                <w:sz w:val="18"/>
-              </w:rPr>
-              <w:t>0.788</w:t>
-            </w:r>
-          </w:p>
-        </w:tc>
-        <w:tc>
-          <w:tcPr>
-            <w:tcW w:type="dxa" w:w="1440"/>
-            <w:shd w:fill="F7F7F7"/>
-          </w:tcPr>
-          <w:p>
-            <w:r/>
-            <w:r>
-              <w:rPr>
-                <w:rFonts w:ascii="Arial" w:hAnsi="Arial"/>
-                <w:b w:val="0"/>
-                <w:sz w:val="18"/>
-              </w:rPr>
-              <w:t>0.761</w:t>
-            </w:r>
-          </w:p>
-        </w:tc>
-        <w:tc>
-          <w:tcPr>
-            <w:tcW w:type="dxa" w:w="1440"/>
-            <w:shd w:fill="F7F7F7"/>
-          </w:tcPr>
-          <w:p>
-            <w:r/>
-            <w:r>
-              <w:rPr>
-                <w:rFonts w:ascii="Arial" w:hAnsi="Arial"/>
-                <w:b w:val="0"/>
-                <w:sz w:val="18"/>
-              </w:rPr>
-              <w:t>0.833</w:t>
-            </w:r>
-          </w:p>
-        </w:tc>
-        <w:tc>
-          <w:tcPr>
-            <w:tcW w:type="dxa" w:w="1440"/>
-            <w:shd w:fill="F7F7F7"/>
-          </w:tcPr>
-          <w:p>
-            <w:r/>
-            <w:r>
-              <w:rPr>
-                <w:rFonts w:ascii="Arial" w:hAnsi="Arial"/>
-                <w:b w:val="0"/>
-                <w:sz w:val="18"/>
-              </w:rPr>
-              <w:t>0.750</w:t>
+              <w:t>0.754</w:t>
             </w:r>
           </w:p>
         </w:tc>
@@ -4854,7 +4952,7 @@
                 <w:b w:val="0"/>
                 <w:sz w:val="18"/>
               </w:rPr>
-              <w:t>0.850</w:t>
+              <w:t>0.831</w:t>
             </w:r>
           </w:p>
         </w:tc>
@@ -4871,7 +4969,7 @@
                 <w:b w:val="0"/>
                 <w:sz w:val="18"/>
               </w:rPr>
-              <w:t>0.592</w:t>
+              <w:t>0.613</w:t>
             </w:r>
           </w:p>
         </w:tc>
@@ -4888,7 +4986,7 @@
                 <w:b w:val="0"/>
                 <w:sz w:val="18"/>
               </w:rPr>
-              <w:t>0.698</w:t>
+              <w:t>0.705</w:t>
             </w:r>
           </w:p>
         </w:tc>
@@ -4905,7 +5003,7 @@
                 <w:b w:val="0"/>
                 <w:sz w:val="18"/>
               </w:rPr>
-              <w:t>0.811</w:t>
+              <w:t>0.820</w:t>
             </w:r>
           </w:p>
         </w:tc>
@@ -4922,7 +5020,7 @@
                 <w:b w:val="0"/>
                 <w:sz w:val="18"/>
               </w:rPr>
-              <w:t>0.746</w:t>
+              <w:t>0.750</w:t>
             </w:r>
           </w:p>
         </w:tc>
@@ -5532,7 +5630,7 @@
         <w:spacing w:line="276" w:lineRule="auto"/>
       </w:pPr>
       <w:r>
-        <w:t>Adding the 2010 season increased the dataset from 6,543 to 6,999 rows. The holdout accuracy and F1 improved for the champion classifier, while race precision@10 stayed at 0.779. This suggests that extra historical data helps general classification stability, but very old F1 seasons are not always directly representative of modern seasons.</w:t>
+        <w:t>Adding the 2010 season increased the dataset from 6,543 to 6,999 rows. A later feature refresh then added richer pit-stop aggregates, more FastF1 lap-summary coverage where the API allowed it, and a separate upcoming-race weather snapshot table. The champion classifier's 2025 race precision@10 improved from 0.779 to 0.783, although its F1 score and some neural-network variants moved slightly down. This suggests that extra data can improve the practical top-10 ranking objective, but each new feature family still needs validation rather than being assumed helpful.</w:t>
       </w:r>
     </w:p>
     <w:p>
@@ -5540,7 +5638,7 @@
         <w:spacing w:line="276" w:lineRule="auto"/>
       </w:pPr>
       <w:r>
-        <w:t>The separate finish-position ranking model is useful for producing ordered race predictions. Its best current version is a neural-network MLP regressor with race precision@10 of 0.779 and mean race Spearman correlation of 0.660. This is helpful for interpretation, but it should remain secondary because the assignment asks mainly for predictive model comparison.</w:t>
+        <w:t>The separate finish-position ranking model is useful for producing ordered race predictions. Its best current version is a neural-network MLP regressor with race precision@10 of 0.775 and mean race Spearman correlation of 0.652. This is helpful for interpretation, but it should remain secondary because the assignment asks mainly for predictive model comparison.</w:t>
       </w:r>
     </w:p>
     <w:p>
@@ -5660,6 +5758,14 @@
         <w:pStyle w:val="ListBullet"/>
       </w:pPr>
       <w:r>
+        <w:t>rerun upcoming weather snapshots near race week so they use real forecast data</w:t>
+      </w:r>
+    </w:p>
+    <w:p>
+      <w:pPr>
+        <w:pStyle w:val="ListBullet"/>
+      </w:pPr>
+      <w:r>
         <w:t>test whether older seasons should be down-weighted because modern F1 regulations differ</w:t>
       </w:r>
     </w:p>
@@ -5684,7 +5790,7 @@
         <w:spacing w:line="276" w:lineRule="auto"/>
       </w:pPr>
       <w:r>
-        <w:t>This project satisfies the core assignment requirement by building a machine learning solution on one reasonably large, mixed-type and non-trivial dataset. The work includes data collection, cleaning, feature engineering, EDA, preprocessing, multiple predictive models, tuning, validation and comparison. The strongest model for the main top-10 classification task is histogram gradient boosting, with 2025 holdout race precision@10 of 0.779. The project also shows that neural networks are interesting but not automatically superior for this tabular problem. The main weakness is that some racing signals, especially full telemetry and older pit-stop details, are incomplete in public data. Overall, the project is a solid V0 for the assignment, with neural-network and 3D visualization work best positioned as optional extensions.</w:t>
+        <w:t>This project satisfies the core assignment requirement by building a machine learning solution on one reasonably large, mixed-type and non-trivial dataset. The work includes data collection, cleaning, feature engineering, EDA, preprocessing, multiple predictive models, tuning, validation and comparison. The strongest model for the main top-10 classification task is histogram gradient boosting, with 2025 holdout race precision@10 of 0.783. The project also shows that neural networks are interesting but not automatically superior for this tabular problem. The main weakness is that some racing signals, especially full telemetry, complete FastF1 historical coverage and exact race-week weather forecasts, are incomplete in public data. Overall, the project is a solid V0 for the assignment, with neural-network and 3D visualization work best positioned as optional extensions.</w:t>
       </w:r>
     </w:p>
     <w:p>

</xml_diff>